<commit_message>
fix: solución definitiva sin tildes, con nullGetter y mapeo robusto
</commit_message>
<xml_diff>
--- a/public/templates/FORMATO HOJA DE VIDA FHISYL.docx
+++ b/public/templates/FORMATO HOJA DE VIDA FHISYL.docx
@@ -199,7 +199,19 @@
                               <w:rPr>
                                 <w:lang w:val="es-CO"/>
                               </w:rPr>
-                              <w:t>descripciónMinisterioProfesion</w:t>
+                              <w:t>descripci</w:t>
+                            </w:r>
+                            <w:r>
+                              <w:rPr>
+                                <w:lang w:val="es-CO"/>
+                              </w:rPr>
+                              <w:t>o</w:t>
+                            </w:r>
+                            <w:r>
+                              <w:rPr>
+                                <w:lang w:val="es-CO"/>
+                              </w:rPr>
+                              <w:t>nMinisterioProfesion</w:t>
                             </w:r>
                             <w:proofErr w:type="spellEnd"/>
                             <w:r>
@@ -249,7 +261,19 @@
                         <w:rPr>
                           <w:lang w:val="es-CO"/>
                         </w:rPr>
-                        <w:t>descripciónMinisterioProfesion</w:t>
+                        <w:t>descripci</w:t>
+                      </w:r>
+                      <w:r>
+                        <w:rPr>
+                          <w:lang w:val="es-CO"/>
+                        </w:rPr>
+                        <w:t>o</w:t>
+                      </w:r>
+                      <w:r>
+                        <w:rPr>
+                          <w:lang w:val="es-CO"/>
+                        </w:rPr>
+                        <w:t>nMinisterioProfesion</w:t>
                       </w:r>
                       <w:proofErr w:type="spellEnd"/>
                       <w:r>
@@ -4468,7 +4492,6 @@
                 <w:lang w:val="es-CO"/>
               </w:rPr>
             </w:pPr>
-            <w:proofErr w:type="gramStart"/>
             <w:r>
               <w:rPr>
                 <w:rFonts w:asciiTheme="majorHAnsi" w:hAnsiTheme="majorHAnsi" w:cs="Arial"/>
@@ -4488,7 +4511,6 @@
               <w:t>{</w:t>
             </w:r>
             <w:proofErr w:type="spellStart"/>
-            <w:proofErr w:type="gramEnd"/>
             <w:r>
               <w:rPr>
                 <w:rFonts w:asciiTheme="majorHAnsi" w:hAnsiTheme="majorHAnsi" w:cs="Arial"/>
@@ -4637,7 +4659,6 @@
                 <w:lang w:val="es-CO"/>
               </w:rPr>
             </w:pPr>
-            <w:proofErr w:type="gramStart"/>
             <w:r>
               <w:rPr>
                 <w:rFonts w:asciiTheme="majorHAnsi" w:hAnsiTheme="majorHAnsi" w:cs="Arial"/>
@@ -4657,7 +4678,6 @@
               <w:t>{</w:t>
             </w:r>
             <w:proofErr w:type="spellStart"/>
-            <w:proofErr w:type="gramEnd"/>
             <w:r>
               <w:rPr>
                 <w:rFonts w:asciiTheme="majorHAnsi" w:hAnsiTheme="majorHAnsi" w:cs="Arial"/>
@@ -5509,7 +5529,6 @@
                 <w:lang w:val="es-CO"/>
               </w:rPr>
             </w:pPr>
-            <w:proofErr w:type="gramStart"/>
             <w:r>
               <w:rPr>
                 <w:rFonts w:asciiTheme="majorHAnsi" w:hAnsiTheme="majorHAnsi" w:cs="Arial"/>
@@ -5526,17 +5545,7 @@
                 <w:szCs w:val="26"/>
                 <w:lang w:val="es-CO"/>
               </w:rPr>
-              <w:t>{</w:t>
-            </w:r>
-            <w:proofErr w:type="gramEnd"/>
-            <w:r>
-              <w:rPr>
-                <w:rFonts w:asciiTheme="majorHAnsi" w:hAnsiTheme="majorHAnsi" w:cs="Arial"/>
-                <w:sz w:val="20"/>
-                <w:szCs w:val="26"/>
-                <w:lang w:val="es-CO"/>
-              </w:rPr>
-              <w:t>dia_inicio2}</w:t>
+              <w:t>{dia_inicio2}</w:t>
             </w:r>
             <w:r>
               <w:rPr>
@@ -5627,7 +5636,6 @@
                 <w:lang w:val="es-CO"/>
               </w:rPr>
             </w:pPr>
-            <w:proofErr w:type="gramStart"/>
             <w:r>
               <w:rPr>
                 <w:rFonts w:asciiTheme="majorHAnsi" w:hAnsiTheme="majorHAnsi" w:cs="Arial"/>
@@ -5644,17 +5652,7 @@
                 <w:szCs w:val="26"/>
                 <w:lang w:val="es-CO"/>
               </w:rPr>
-              <w:t>{</w:t>
-            </w:r>
-            <w:proofErr w:type="gramEnd"/>
-            <w:r>
-              <w:rPr>
-                <w:rFonts w:asciiTheme="majorHAnsi" w:hAnsiTheme="majorHAnsi" w:cs="Arial"/>
-                <w:sz w:val="20"/>
-                <w:szCs w:val="26"/>
-                <w:lang w:val="es-CO"/>
-              </w:rPr>
-              <w:t>dia_fin2}</w:t>
+              <w:t>{dia_fin2}</w:t>
             </w:r>
             <w:r>
               <w:rPr>
@@ -6416,7 +6414,6 @@
                 <w:lang w:val="es-CO"/>
               </w:rPr>
             </w:pPr>
-            <w:proofErr w:type="gramStart"/>
             <w:r>
               <w:rPr>
                 <w:rFonts w:asciiTheme="majorHAnsi" w:hAnsiTheme="majorHAnsi" w:cs="Arial"/>
@@ -6424,17 +6421,7 @@
                 <w:szCs w:val="20"/>
                 <w:lang w:val="es-CO"/>
               </w:rPr>
-              <w:t>DIA:{</w:t>
-            </w:r>
-            <w:proofErr w:type="gramEnd"/>
-            <w:r>
-              <w:rPr>
-                <w:rFonts w:asciiTheme="majorHAnsi" w:hAnsiTheme="majorHAnsi" w:cs="Arial"/>
-                <w:sz w:val="20"/>
-                <w:szCs w:val="20"/>
-                <w:lang w:val="es-CO"/>
-              </w:rPr>
-              <w:t>dia_inicio3}      MES:{mes_inicio3}       AÑO:{año_inicio3}</w:t>
+              <w:t>DIA:{dia_inicio3}      MES:{mes_inicio3}       AÑO:{año_inicio3}</w:t>
             </w:r>
           </w:p>
         </w:tc>
@@ -6480,7 +6467,6 @@
                 <w:lang w:val="es-CO"/>
               </w:rPr>
             </w:pPr>
-            <w:proofErr w:type="gramStart"/>
             <w:r>
               <w:rPr>
                 <w:rFonts w:asciiTheme="majorHAnsi" w:hAnsiTheme="majorHAnsi" w:cs="Arial"/>
@@ -6488,17 +6474,7 @@
                 <w:szCs w:val="20"/>
                 <w:lang w:val="es-CO"/>
               </w:rPr>
-              <w:t>DIA:{</w:t>
-            </w:r>
-            <w:proofErr w:type="gramEnd"/>
-            <w:r>
-              <w:rPr>
-                <w:rFonts w:asciiTheme="majorHAnsi" w:hAnsiTheme="majorHAnsi" w:cs="Arial"/>
-                <w:sz w:val="20"/>
-                <w:szCs w:val="20"/>
-                <w:lang w:val="es-CO"/>
-              </w:rPr>
-              <w:t>dia_fin3}       MES:{mes_fin3}        AÑO:{año_fin3}</w:t>
+              <w:t>DIA:{dia_fin3}       MES:{mes_fin3}        AÑO:{año_fin3}</w:t>
             </w:r>
           </w:p>
         </w:tc>
@@ -12832,7 +12808,7 @@
                       <a:effectLst/>
                       <a:extLst>
                         <a:ext uri="{C572A759-6A51-4108-AA02-DFA0A04FC94B}">
-                          <ma14:wrappingTextBoxFlag xmlns:ma14="http://schemas.microsoft.com/office/mac/drawingml/2011/main" xmlns:w="http://schemas.openxmlformats.org/wordprocessingml/2006/main" xmlns:w10="urn:schemas-microsoft-com:office:word" xmlns:v="urn:schemas-microsoft-com:vml" xmlns:o="urn:schemas-microsoft-com:office:office" xmlns:mv="urn:schemas-microsoft-com:mac:vml" xmlns:mo="http://schemas.microsoft.com/office/mac/office/2008/main" xmlns="" xmlns:arto="http://schemas.microsoft.com/office/word/2006/arto"/>
+                          <ma14:wrappingTextBoxFlag xmlns:arto="http://schemas.microsoft.com/office/word/2006/arto" xmlns="" xmlns:mo="http://schemas.microsoft.com/office/mac/office/2008/main" xmlns:mv="urn:schemas-microsoft-com:mac:vml" xmlns:o="urn:schemas-microsoft-com:office:office" xmlns:v="urn:schemas-microsoft-com:vml" xmlns:w10="urn:schemas-microsoft-com:office:word" xmlns:w="http://schemas.openxmlformats.org/wordprocessingml/2006/main" xmlns:ma14="http://schemas.microsoft.com/office/mac/drawingml/2011/main"/>
                         </a:ext>
                       </a:extLst>
                     </wps:spPr>

</xml_diff>

<commit_message>
fix: reparación automática de etiqueta corrupta (4_grado) en plantilla Word
</commit_message>
<xml_diff>
--- a/public/templates/FORMATO HOJA DE VIDA FHISYL.docx
+++ b/public/templates/FORMATO HOJA DE VIDA FHISYL.docx
@@ -1,5 +1,64 @@
 
-<file path=word/document.xml><?xml version="1.0" encoding="utf-8"?>
+<file path=customXml\item1.xml><?xml version="1.0" encoding="utf-8"?>
+<b:Sources xmlns:b="http://schemas.openxmlformats.org/officeDocument/2006/bibliography" xmlns="http://schemas.openxmlformats.org/officeDocument/2006/bibliography" SelectedStyle="\APASixthEditionOfficeOnline.xsl" StyleName="APA" Version="6"/>
+</file>
+
+<file path=customXml\itemProps1.xml><?xml version="1.0" encoding="utf-8"?>
+<ds:datastoreItem xmlns:ds="http://schemas.openxmlformats.org/officeDocument/2006/customXml" ds:itemID="{8E6929E9-498A-4D52-8CB7-117FBBBB5CE7}">
+  <ds:schemaRefs>
+    <ds:schemaRef ds:uri="http://schemas.openxmlformats.org/officeDocument/2006/bibliography"/>
+  </ds:schemaRefs>
+</ds:datastoreItem>
+</file>
+
+<file path=docProps\app.xml><?xml version="1.0" encoding="utf-8"?>
+<Properties xmlns="http://schemas.openxmlformats.org/officeDocument/2006/extended-properties" xmlns:vt="http://schemas.openxmlformats.org/officeDocument/2006/docPropsVTypes">
+  <Template>Normal.dotm</Template>
+  <TotalTime>69</TotalTime>
+  <Pages>6</Pages>
+  <Words>763</Words>
+  <Characters>4198</Characters>
+  <Application>Microsoft Office Word</Application>
+  <DocSecurity>0</DocSecurity>
+  <Lines>34</Lines>
+  <Paragraphs>9</Paragraphs>
+  <ScaleCrop>false</ScaleCrop>
+  <HeadingPairs>
+    <vt:vector size="2" baseType="variant">
+      <vt:variant>
+        <vt:lpstr>Título</vt:lpstr>
+      </vt:variant>
+      <vt:variant>
+        <vt:i4>1</vt:i4>
+      </vt:variant>
+    </vt:vector>
+  </HeadingPairs>
+  <TitlesOfParts>
+    <vt:vector size="1" baseType="lpstr">
+      <vt:lpstr/>
+    </vt:vector>
+  </TitlesOfParts>
+  <Company/>
+  <LinksUpToDate>false</LinksUpToDate>
+  <CharactersWithSpaces>4952</CharactersWithSpaces>
+  <SharedDoc>false</SharedDoc>
+  <HyperlinksChanged>false</HyperlinksChanged>
+  <AppVersion>16.0000</AppVersion>
+</Properties>
+</file>
+
+<file path=docProps\core.xml><?xml version="1.0" encoding="utf-8"?>
+<cp:coreProperties xmlns:cp="http://schemas.openxmlformats.org/package/2006/metadata/core-properties" xmlns:dc="http://purl.org/dc/elements/1.1/" xmlns:dcterms="http://purl.org/dc/terms/" xmlns:dcmitype="http://purl.org/dc/dcmitype/" xmlns:xsi="http://www.w3.org/2001/XMLSchema-instance">
+  <dc:creator>Tania Varela Pedroza</dc:creator>
+  <cp:lastModifiedBy>Nahuel Jiménez</cp:lastModifiedBy>
+  <cp:revision>18</cp:revision>
+  <cp:lastPrinted>2022-08-04T17:05:00Z</cp:lastPrinted>
+  <dcterms:created xsi:type="dcterms:W3CDTF">2025-04-25T18:31:00Z</dcterms:created>
+  <dcterms:modified xsi:type="dcterms:W3CDTF">2026-03-19T21:57:00Z</dcterms:modified>
+</cp:coreProperties>
+</file>
+
+<file path=word\document.xml><?xml version="1.0" encoding="utf-8"?>
 <w:document xmlns:wpc="http://schemas.microsoft.com/office/word/2010/wordprocessingCanvas" xmlns:cx="http://schemas.microsoft.com/office/drawing/2014/chartex" xmlns:cx1="http://schemas.microsoft.com/office/drawing/2015/9/8/chartex" xmlns:cx2="http://schemas.microsoft.com/office/drawing/2015/10/21/chartex" xmlns:cx3="http://schemas.microsoft.com/office/drawing/2016/5/9/chartex" xmlns:cx4="http://schemas.microsoft.com/office/drawing/2016/5/10/chartex" xmlns:cx5="http://schemas.microsoft.com/office/drawing/2016/5/11/chartex" xmlns:cx6="http://schemas.microsoft.com/office/drawing/2016/5/12/chartex" xmlns:cx7="http://schemas.microsoft.com/office/drawing/2016/5/13/chartex" xmlns:cx8="http://schemas.microsoft.com/office/drawing/2016/5/14/chartex" xmlns:mc="http://schemas.openxmlformats.org/markup-compatibility/2006" xmlns:aink="http://schemas.microsoft.com/office/drawing/2016/ink" xmlns:am3d="http://schemas.microsoft.com/office/drawing/2017/model3d" xmlns:o="urn:schemas-microsoft-com:office:office" xmlns:oel="http://schemas.microsoft.com/office/2019/extlst" xmlns:r="http://schemas.openxmlformats.org/officeDocument/2006/relationships" xmlns:m="http://schemas.openxmlformats.org/officeDocument/2006/math" xmlns:v="urn:schemas-microsoft-com:vml" xmlns:wp14="http://schemas.microsoft.com/office/word/2010/wordprocessingDrawing" xmlns:wp="http://schemas.openxmlformats.org/drawingml/2006/wordprocessingDrawing" xmlns:w10="urn:schemas-microsoft-com:office:word" xmlns:w="http://schemas.openxmlformats.org/wordprocessingml/2006/main" xmlns:w14="http://schemas.microsoft.com/office/word/2010/wordml" xmlns:w15="http://schemas.microsoft.com/office/word/2012/wordml" xmlns:w16cex="http://schemas.microsoft.com/office/word/2018/wordml/cex" xmlns:w16cid="http://schemas.microsoft.com/office/word/2016/wordml/cid" xmlns:w16="http://schemas.microsoft.com/office/word/2018/wordml" xmlns:w16sdtdh="http://schemas.microsoft.com/office/word/2020/wordml/sdtdatahash" xmlns:w16se="http://schemas.microsoft.com/office/word/2015/wordml/symex" xmlns:wpg="http://schemas.microsoft.com/office/word/2010/wordprocessingGroup" xmlns:wpi="http://schemas.microsoft.com/office/word/2010/wordprocessingInk" xmlns:wne="http://schemas.microsoft.com/office/word/2006/wordml" xmlns:wps="http://schemas.microsoft.com/office/word/2010/wordprocessingShape" mc:Ignorable="w14 w15 w16se w16cid w16 w16cex w16sdtdh wp14">
   <w:body>
     <w:p>
@@ -12161,7 +12220,7 @@
 </w:document>
 </file>
 
-<file path=word/endnotes.xml><?xml version="1.0" encoding="utf-8"?>
+<file path=word\endnotes.xml><?xml version="1.0" encoding="utf-8"?>
 <w:endnotes xmlns:wpc="http://schemas.microsoft.com/office/word/2010/wordprocessingCanvas" xmlns:cx="http://schemas.microsoft.com/office/drawing/2014/chartex" xmlns:cx1="http://schemas.microsoft.com/office/drawing/2015/9/8/chartex" xmlns:cx2="http://schemas.microsoft.com/office/drawing/2015/10/21/chartex" xmlns:cx3="http://schemas.microsoft.com/office/drawing/2016/5/9/chartex" xmlns:cx4="http://schemas.microsoft.com/office/drawing/2016/5/10/chartex" xmlns:cx5="http://schemas.microsoft.com/office/drawing/2016/5/11/chartex" xmlns:cx6="http://schemas.microsoft.com/office/drawing/2016/5/12/chartex" xmlns:cx7="http://schemas.microsoft.com/office/drawing/2016/5/13/chartex" xmlns:cx8="http://schemas.microsoft.com/office/drawing/2016/5/14/chartex" xmlns:mc="http://schemas.openxmlformats.org/markup-compatibility/2006" xmlns:aink="http://schemas.microsoft.com/office/drawing/2016/ink" xmlns:am3d="http://schemas.microsoft.com/office/drawing/2017/model3d" xmlns:o="urn:schemas-microsoft-com:office:office" xmlns:oel="http://schemas.microsoft.com/office/2019/extlst" xmlns:r="http://schemas.openxmlformats.org/officeDocument/2006/relationships" xmlns:m="http://schemas.openxmlformats.org/officeDocument/2006/math" xmlns:v="urn:schemas-microsoft-com:vml" xmlns:wp14="http://schemas.microsoft.com/office/word/2010/wordprocessingDrawing" xmlns:wp="http://schemas.openxmlformats.org/drawingml/2006/wordprocessingDrawing" xmlns:w10="urn:schemas-microsoft-com:office:word" xmlns:w="http://schemas.openxmlformats.org/wordprocessingml/2006/main" xmlns:w14="http://schemas.microsoft.com/office/word/2010/wordml" xmlns:w15="http://schemas.microsoft.com/office/word/2012/wordml" xmlns:w16cex="http://schemas.microsoft.com/office/word/2018/wordml/cex" xmlns:w16cid="http://schemas.microsoft.com/office/word/2016/wordml/cid" xmlns:w16="http://schemas.microsoft.com/office/word/2018/wordml" xmlns:w16sdtdh="http://schemas.microsoft.com/office/word/2020/wordml/sdtdatahash" xmlns:w16se="http://schemas.microsoft.com/office/word/2015/wordml/symex" xmlns:wpg="http://schemas.microsoft.com/office/word/2010/wordprocessingGroup" xmlns:wpi="http://schemas.microsoft.com/office/word/2010/wordprocessingInk" xmlns:wne="http://schemas.microsoft.com/office/word/2006/wordml" xmlns:wps="http://schemas.microsoft.com/office/word/2010/wordprocessingShape" mc:Ignorable="w14 w15 w16se w16cid w16 w16cex w16sdtdh wp14">
   <w:endnote w:type="separator" w:id="-1">
     <w:p>
@@ -12180,7 +12239,135 @@
 </w:endnotes>
 </file>
 
-<file path=word/footer1.xml><?xml version="1.0" encoding="utf-8"?>
+<file path=word\fontTable.xml><?xml version="1.0" encoding="utf-8"?>
+<w:fonts xmlns:mc="http://schemas.openxmlformats.org/markup-compatibility/2006" xmlns:r="http://schemas.openxmlformats.org/officeDocument/2006/relationships" xmlns:w="http://schemas.openxmlformats.org/wordprocessingml/2006/main" xmlns:w14="http://schemas.microsoft.com/office/word/2010/wordml" xmlns:w15="http://schemas.microsoft.com/office/word/2012/wordml" xmlns:w16cex="http://schemas.microsoft.com/office/word/2018/wordml/cex" xmlns:w16cid="http://schemas.microsoft.com/office/word/2016/wordml/cid" xmlns:w16="http://schemas.microsoft.com/office/word/2018/wordml" xmlns:w16sdtdh="http://schemas.microsoft.com/office/word/2020/wordml/sdtdatahash" xmlns:w16se="http://schemas.microsoft.com/office/word/2015/wordml/symex" mc:Ignorable="w14 w15 w16se w16cid w16 w16cex w16sdtdh">
+  <w:font w:name="Wingdings">
+    <w:panose1 w:val="05000000000000000000"/>
+    <w:charset w:val="02"/>
+    <w:family w:val="auto"/>
+    <w:pitch w:val="variable"/>
+    <w:sig w:usb0="00000000" w:usb1="10000000" w:usb2="00000000" w:usb3="00000000" w:csb0="80000000" w:csb1="00000000"/>
+  </w:font>
+  <w:font w:name="Times New Roman">
+    <w:panose1 w:val="02020603050405020304"/>
+    <w:charset w:val="00"/>
+    <w:family w:val="roman"/>
+    <w:pitch w:val="variable"/>
+    <w:sig w:usb0="E0002EFF" w:usb1="C000785B" w:usb2="00000009" w:usb3="00000000" w:csb0="000001FF" w:csb1="00000000"/>
+  </w:font>
+  <w:font w:name="Courier New">
+    <w:panose1 w:val="02070309020205020404"/>
+    <w:charset w:val="00"/>
+    <w:family w:val="modern"/>
+    <w:pitch w:val="fixed"/>
+    <w:sig w:usb0="E0002EFF" w:usb1="C0007843" w:usb2="00000009" w:usb3="00000000" w:csb0="000001FF" w:csb1="00000000"/>
+  </w:font>
+  <w:font w:name="Symbol">
+    <w:panose1 w:val="05050102010706020507"/>
+    <w:charset w:val="02"/>
+    <w:family w:val="roman"/>
+    <w:pitch w:val="variable"/>
+    <w:sig w:usb0="00000000" w:usb1="10000000" w:usb2="00000000" w:usb3="00000000" w:csb0="80000000" w:csb1="00000000"/>
+  </w:font>
+  <w:font w:name="Calibri">
+    <w:panose1 w:val="020F0502020204030204"/>
+    <w:charset w:val="00"/>
+    <w:family w:val="swiss"/>
+    <w:pitch w:val="variable"/>
+    <w:sig w:usb0="E4002EFF" w:usb1="C200247B" w:usb2="00000009" w:usb3="00000000" w:csb0="000001FF" w:csb1="00000000"/>
+  </w:font>
+  <w:font w:name="Tahoma">
+    <w:panose1 w:val="020B0604030504040204"/>
+    <w:charset w:val="00"/>
+    <w:family w:val="swiss"/>
+    <w:pitch w:val="variable"/>
+    <w:sig w:usb0="E1002EFF" w:usb1="C000605B" w:usb2="00000029" w:usb3="00000000" w:csb0="000101FF" w:csb1="00000000"/>
+  </w:font>
+  <w:font w:name="Cambria">
+    <w:panose1 w:val="02040503050406030204"/>
+    <w:charset w:val="00"/>
+    <w:family w:val="roman"/>
+    <w:pitch w:val="variable"/>
+    <w:sig w:usb0="E00006FF" w:usb1="420024FF" w:usb2="02000000" w:usb3="00000000" w:csb0="0000019F" w:csb1="00000000"/>
+  </w:font>
+  <w:font w:name="Calibri Light">
+    <w:panose1 w:val="020F0302020204030204"/>
+    <w:charset w:val="00"/>
+    <w:family w:val="swiss"/>
+    <w:pitch w:val="variable"/>
+    <w:sig w:usb0="E4002EFF" w:usb1="C200247B" w:usb2="00000009" w:usb3="00000000" w:csb0="000001FF" w:csb1="00000000"/>
+  </w:font>
+  <w:font w:name="Baskerville Old Face">
+    <w:charset w:val="00"/>
+    <w:family w:val="roman"/>
+    <w:pitch w:val="variable"/>
+    <w:sig w:usb0="00000003" w:usb1="00000000" w:usb2="00000000" w:usb3="00000000" w:csb0="00000001" w:csb1="00000000"/>
+  </w:font>
+  <w:font w:name="Batang">
+    <w:altName w:val="바탕"/>
+    <w:panose1 w:val="02030600000101010101"/>
+    <w:charset w:val="81"/>
+    <w:family w:val="roman"/>
+    <w:pitch w:val="variable"/>
+    <w:sig w:usb0="B00002AF" w:usb1="69D77CFB" w:usb2="00000030" w:usb3="00000000" w:csb0="0008009F" w:csb1="00000000"/>
+  </w:font>
+  <w:font w:name="Arabic Typesetting">
+    <w:charset w:val="B2"/>
+    <w:family w:val="script"/>
+    <w:pitch w:val="variable"/>
+    <w:sig w:usb0="80002007" w:usb1="80000000" w:usb2="00000008" w:usb3="00000000" w:csb0="000000D3" w:csb1="00000000"/>
+  </w:font>
+  <w:font w:name="Cooper Black">
+    <w:charset w:val="00"/>
+    <w:family w:val="roman"/>
+    <w:pitch w:val="variable"/>
+    <w:sig w:usb0="00000003" w:usb1="00000000" w:usb2="00000000" w:usb3="00000000" w:csb0="00000001" w:csb1="00000000"/>
+  </w:font>
+  <w:font w:name="Trebuchet MS">
+    <w:panose1 w:val="020B0603020202020204"/>
+    <w:charset w:val="00"/>
+    <w:family w:val="swiss"/>
+    <w:pitch w:val="variable"/>
+    <w:sig w:usb0="00000687" w:usb1="00000000" w:usb2="00000000" w:usb3="00000000" w:csb0="0000009F" w:csb1="00000000"/>
+  </w:font>
+  <w:font w:name="Arial">
+    <w:panose1 w:val="020B0604020202020204"/>
+    <w:charset w:val="00"/>
+    <w:family w:val="swiss"/>
+    <w:pitch w:val="variable"/>
+    <w:sig w:usb0="E0002EFF" w:usb1="C000785B" w:usb2="00000009" w:usb3="00000000" w:csb0="000001FF" w:csb1="00000000"/>
+  </w:font>
+  <w:font w:name="Monotype Corsiva">
+    <w:panose1 w:val="03010101010201010101"/>
+    <w:charset w:val="00"/>
+    <w:family w:val="script"/>
+    <w:pitch w:val="variable"/>
+    <w:sig w:usb0="00000287" w:usb1="00000000" w:usb2="00000000" w:usb3="00000000" w:csb0="0000009F" w:csb1="00000000"/>
+  </w:font>
+  <w:font w:name="Lucida Calligraphy">
+    <w:charset w:val="00"/>
+    <w:family w:val="script"/>
+    <w:pitch w:val="variable"/>
+    <w:sig w:usb0="00000003" w:usb1="00000000" w:usb2="00000000" w:usb3="00000000" w:csb0="00000001" w:csb1="00000000"/>
+  </w:font>
+  <w:font w:name="Segoe UI">
+    <w:panose1 w:val="020B0502040204020203"/>
+    <w:charset w:val="00"/>
+    <w:family w:val="swiss"/>
+    <w:pitch w:val="variable"/>
+    <w:sig w:usb0="E4002EFF" w:usb1="C000E47F" w:usb2="00000009" w:usb3="00000000" w:csb0="000001FF" w:csb1="00000000"/>
+  </w:font>
+  <w:font w:name="Candara">
+    <w:panose1 w:val="020E0502030303020204"/>
+    <w:charset w:val="00"/>
+    <w:family w:val="swiss"/>
+    <w:pitch w:val="variable"/>
+    <w:sig w:usb0="A00002EF" w:usb1="4000A44B" w:usb2="00000000" w:usb3="00000000" w:csb0="0000019F" w:csb1="00000000"/>
+  </w:font>
+</w:fonts>
+</file>
+
+<file path=word\footer1.xml><?xml version="1.0" encoding="utf-8"?>
 <w:ftr xmlns:wpc="http://schemas.microsoft.com/office/word/2010/wordprocessingCanvas" xmlns:cx="http://schemas.microsoft.com/office/drawing/2014/chartex" xmlns:cx1="http://schemas.microsoft.com/office/drawing/2015/9/8/chartex" xmlns:cx2="http://schemas.microsoft.com/office/drawing/2015/10/21/chartex" xmlns:cx3="http://schemas.microsoft.com/office/drawing/2016/5/9/chartex" xmlns:cx4="http://schemas.microsoft.com/office/drawing/2016/5/10/chartex" xmlns:cx5="http://schemas.microsoft.com/office/drawing/2016/5/11/chartex" xmlns:cx6="http://schemas.microsoft.com/office/drawing/2016/5/12/chartex" xmlns:cx7="http://schemas.microsoft.com/office/drawing/2016/5/13/chartex" xmlns:cx8="http://schemas.microsoft.com/office/drawing/2016/5/14/chartex" xmlns:mc="http://schemas.openxmlformats.org/markup-compatibility/2006" xmlns:aink="http://schemas.microsoft.com/office/drawing/2016/ink" xmlns:am3d="http://schemas.microsoft.com/office/drawing/2017/model3d" xmlns:o="urn:schemas-microsoft-com:office:office" xmlns:oel="http://schemas.microsoft.com/office/2019/extlst" xmlns:r="http://schemas.openxmlformats.org/officeDocument/2006/relationships" xmlns:m="http://schemas.openxmlformats.org/officeDocument/2006/math" xmlns:v="urn:schemas-microsoft-com:vml" xmlns:wp14="http://schemas.microsoft.com/office/word/2010/wordprocessingDrawing" xmlns:wp="http://schemas.openxmlformats.org/drawingml/2006/wordprocessingDrawing" xmlns:w10="urn:schemas-microsoft-com:office:word" xmlns:w="http://schemas.openxmlformats.org/wordprocessingml/2006/main" xmlns:w14="http://schemas.microsoft.com/office/word/2010/wordml" xmlns:w15="http://schemas.microsoft.com/office/word/2012/wordml" xmlns:w16cex="http://schemas.microsoft.com/office/word/2018/wordml/cex" xmlns:w16cid="http://schemas.microsoft.com/office/word/2016/wordml/cid" xmlns:w16="http://schemas.microsoft.com/office/word/2018/wordml" xmlns:w16sdtdh="http://schemas.microsoft.com/office/word/2020/wordml/sdtdatahash" xmlns:w16se="http://schemas.microsoft.com/office/word/2015/wordml/symex" xmlns:wpg="http://schemas.microsoft.com/office/word/2010/wordprocessingGroup" xmlns:wpi="http://schemas.microsoft.com/office/word/2010/wordprocessingInk" xmlns:wne="http://schemas.microsoft.com/office/word/2006/wordml" xmlns:wps="http://schemas.microsoft.com/office/word/2010/wordprocessingShape" mc:Ignorable="w14 w15 w16se w16cid w16 w16cex w16sdtdh wp14">
   <w:p>
     <w:pPr>
@@ -12255,7 +12442,7 @@
 </w:ftr>
 </file>
 
-<file path=word/footnotes.xml><?xml version="1.0" encoding="utf-8"?>
+<file path=word\footnotes.xml><?xml version="1.0" encoding="utf-8"?>
 <w:footnotes xmlns:wpc="http://schemas.microsoft.com/office/word/2010/wordprocessingCanvas" xmlns:cx="http://schemas.microsoft.com/office/drawing/2014/chartex" xmlns:cx1="http://schemas.microsoft.com/office/drawing/2015/9/8/chartex" xmlns:cx2="http://schemas.microsoft.com/office/drawing/2015/10/21/chartex" xmlns:cx3="http://schemas.microsoft.com/office/drawing/2016/5/9/chartex" xmlns:cx4="http://schemas.microsoft.com/office/drawing/2016/5/10/chartex" xmlns:cx5="http://schemas.microsoft.com/office/drawing/2016/5/11/chartex" xmlns:cx6="http://schemas.microsoft.com/office/drawing/2016/5/12/chartex" xmlns:cx7="http://schemas.microsoft.com/office/drawing/2016/5/13/chartex" xmlns:cx8="http://schemas.microsoft.com/office/drawing/2016/5/14/chartex" xmlns:mc="http://schemas.openxmlformats.org/markup-compatibility/2006" xmlns:aink="http://schemas.microsoft.com/office/drawing/2016/ink" xmlns:am3d="http://schemas.microsoft.com/office/drawing/2017/model3d" xmlns:o="urn:schemas-microsoft-com:office:office" xmlns:oel="http://schemas.microsoft.com/office/2019/extlst" xmlns:r="http://schemas.openxmlformats.org/officeDocument/2006/relationships" xmlns:m="http://schemas.openxmlformats.org/officeDocument/2006/math" xmlns:v="urn:schemas-microsoft-com:vml" xmlns:wp14="http://schemas.microsoft.com/office/word/2010/wordprocessingDrawing" xmlns:wp="http://schemas.openxmlformats.org/drawingml/2006/wordprocessingDrawing" xmlns:w10="urn:schemas-microsoft-com:office:word" xmlns:w="http://schemas.openxmlformats.org/wordprocessingml/2006/main" xmlns:w14="http://schemas.microsoft.com/office/word/2010/wordml" xmlns:w15="http://schemas.microsoft.com/office/word/2012/wordml" xmlns:w16cex="http://schemas.microsoft.com/office/word/2018/wordml/cex" xmlns:w16cid="http://schemas.microsoft.com/office/word/2016/wordml/cid" xmlns:w16="http://schemas.microsoft.com/office/word/2018/wordml" xmlns:w16sdtdh="http://schemas.microsoft.com/office/word/2020/wordml/sdtdatahash" xmlns:w16se="http://schemas.microsoft.com/office/word/2015/wordml/symex" xmlns:wpg="http://schemas.microsoft.com/office/word/2010/wordprocessingGroup" xmlns:wpi="http://schemas.microsoft.com/office/word/2010/wordprocessingInk" xmlns:wne="http://schemas.microsoft.com/office/word/2006/wordml" xmlns:wps="http://schemas.microsoft.com/office/word/2010/wordprocessingShape" mc:Ignorable="w14 w15 w16se w16cid w16 w16cex w16sdtdh wp14">
   <w:footnote w:type="separator" w:id="-1">
     <w:p>
@@ -12274,7 +12461,7 @@
 </w:footnotes>
 </file>
 
-<file path=word/header1.xml><?xml version="1.0" encoding="utf-8"?>
+<file path=word\header1.xml><?xml version="1.0" encoding="utf-8"?>
 <w:hdr xmlns:wpc="http://schemas.microsoft.com/office/word/2010/wordprocessingCanvas" xmlns:cx="http://schemas.microsoft.com/office/drawing/2014/chartex" xmlns:cx1="http://schemas.microsoft.com/office/drawing/2015/9/8/chartex" xmlns:cx2="http://schemas.microsoft.com/office/drawing/2015/10/21/chartex" xmlns:cx3="http://schemas.microsoft.com/office/drawing/2016/5/9/chartex" xmlns:cx4="http://schemas.microsoft.com/office/drawing/2016/5/10/chartex" xmlns:cx5="http://schemas.microsoft.com/office/drawing/2016/5/11/chartex" xmlns:cx6="http://schemas.microsoft.com/office/drawing/2016/5/12/chartex" xmlns:cx7="http://schemas.microsoft.com/office/drawing/2016/5/13/chartex" xmlns:cx8="http://schemas.microsoft.com/office/drawing/2016/5/14/chartex" xmlns:mc="http://schemas.openxmlformats.org/markup-compatibility/2006" xmlns:aink="http://schemas.microsoft.com/office/drawing/2016/ink" xmlns:am3d="http://schemas.microsoft.com/office/drawing/2017/model3d" xmlns:o="urn:schemas-microsoft-com:office:office" xmlns:oel="http://schemas.microsoft.com/office/2019/extlst" xmlns:r="http://schemas.openxmlformats.org/officeDocument/2006/relationships" xmlns:m="http://schemas.openxmlformats.org/officeDocument/2006/math" xmlns:v="urn:schemas-microsoft-com:vml" xmlns:wp14="http://schemas.microsoft.com/office/word/2010/wordprocessingDrawing" xmlns:wp="http://schemas.openxmlformats.org/drawingml/2006/wordprocessingDrawing" xmlns:w10="urn:schemas-microsoft-com:office:word" xmlns:w="http://schemas.openxmlformats.org/wordprocessingml/2006/main" xmlns:w14="http://schemas.microsoft.com/office/word/2010/wordml" xmlns:w15="http://schemas.microsoft.com/office/word/2012/wordml" xmlns:w16cex="http://schemas.microsoft.com/office/word/2018/wordml/cex" xmlns:w16cid="http://schemas.microsoft.com/office/word/2016/wordml/cid" xmlns:w16="http://schemas.microsoft.com/office/word/2018/wordml" xmlns:w16sdtdh="http://schemas.microsoft.com/office/word/2020/wordml/sdtdatahash" xmlns:w16se="http://schemas.microsoft.com/office/word/2015/wordml/symex" xmlns:wpg="http://schemas.microsoft.com/office/word/2010/wordprocessingGroup" xmlns:wpi="http://schemas.microsoft.com/office/word/2010/wordprocessingInk" xmlns:wne="http://schemas.microsoft.com/office/word/2006/wordml" xmlns:wps="http://schemas.microsoft.com/office/word/2010/wordprocessingShape" mc:Ignorable="w14 w15 w16se w16cid w16 w16cex w16sdtdh wp14">
   <w:p>
     <w:pPr>
@@ -12992,7 +13179,7 @@
 </w:hdr>
 </file>
 
-<file path=word/numbering.xml><?xml version="1.0" encoding="utf-8"?>
+<file path=word\numbering.xml><?xml version="1.0" encoding="utf-8"?>
 <w:numbering xmlns:wpc="http://schemas.microsoft.com/office/word/2010/wordprocessingCanvas" xmlns:cx="http://schemas.microsoft.com/office/drawing/2014/chartex" xmlns:cx1="http://schemas.microsoft.com/office/drawing/2015/9/8/chartex" xmlns:cx2="http://schemas.microsoft.com/office/drawing/2015/10/21/chartex" xmlns:cx3="http://schemas.microsoft.com/office/drawing/2016/5/9/chartex" xmlns:cx4="http://schemas.microsoft.com/office/drawing/2016/5/10/chartex" xmlns:cx5="http://schemas.microsoft.com/office/drawing/2016/5/11/chartex" xmlns:cx6="http://schemas.microsoft.com/office/drawing/2016/5/12/chartex" xmlns:cx7="http://schemas.microsoft.com/office/drawing/2016/5/13/chartex" xmlns:cx8="http://schemas.microsoft.com/office/drawing/2016/5/14/chartex" xmlns:mc="http://schemas.openxmlformats.org/markup-compatibility/2006" xmlns:aink="http://schemas.microsoft.com/office/drawing/2016/ink" xmlns:am3d="http://schemas.microsoft.com/office/drawing/2017/model3d" xmlns:o="urn:schemas-microsoft-com:office:office" xmlns:oel="http://schemas.microsoft.com/office/2019/extlst" xmlns:r="http://schemas.openxmlformats.org/officeDocument/2006/relationships" xmlns:m="http://schemas.openxmlformats.org/officeDocument/2006/math" xmlns:v="urn:schemas-microsoft-com:vml" xmlns:wp14="http://schemas.microsoft.com/office/word/2010/wordprocessingDrawing" xmlns:wp="http://schemas.openxmlformats.org/drawingml/2006/wordprocessingDrawing" xmlns:w10="urn:schemas-microsoft-com:office:word" xmlns:w="http://schemas.openxmlformats.org/wordprocessingml/2006/main" xmlns:w14="http://schemas.microsoft.com/office/word/2010/wordml" xmlns:w15="http://schemas.microsoft.com/office/word/2012/wordml" xmlns:w16cex="http://schemas.microsoft.com/office/word/2018/wordml/cex" xmlns:w16cid="http://schemas.microsoft.com/office/word/2016/wordml/cid" xmlns:w16="http://schemas.microsoft.com/office/word/2018/wordml" xmlns:w16sdtdh="http://schemas.microsoft.com/office/word/2020/wordml/sdtdatahash" xmlns:w16se="http://schemas.microsoft.com/office/word/2015/wordml/symex" xmlns:wpg="http://schemas.microsoft.com/office/word/2010/wordprocessingGroup" xmlns:wpi="http://schemas.microsoft.com/office/word/2010/wordprocessingInk" xmlns:wne="http://schemas.microsoft.com/office/word/2006/wordml" xmlns:wps="http://schemas.microsoft.com/office/word/2010/wordprocessingShape" mc:Ignorable="w14 w15 w16se w16cid w16 w16cex w16sdtdh wp14">
   <w:abstractNum w:abstractNumId="0" w15:restartNumberingAfterBreak="0">
     <w:nsid w:val="262B06A7"/>
@@ -13116,7 +13303,349 @@
 </w:numbering>
 </file>
 
-<file path=word/styles.xml><?xml version="1.0" encoding="utf-8"?>
+<file path=word\settings.xml><?xml version="1.0" encoding="utf-8"?>
+<w:settings xmlns:mc="http://schemas.openxmlformats.org/markup-compatibility/2006" xmlns:o="urn:schemas-microsoft-com:office:office" xmlns:r="http://schemas.openxmlformats.org/officeDocument/2006/relationships" xmlns:m="http://schemas.openxmlformats.org/officeDocument/2006/math" xmlns:v="urn:schemas-microsoft-com:vml" xmlns:w10="urn:schemas-microsoft-com:office:word" xmlns:w="http://schemas.openxmlformats.org/wordprocessingml/2006/main" xmlns:w14="http://schemas.microsoft.com/office/word/2010/wordml" xmlns:w15="http://schemas.microsoft.com/office/word/2012/wordml" xmlns:w16cex="http://schemas.microsoft.com/office/word/2018/wordml/cex" xmlns:w16cid="http://schemas.microsoft.com/office/word/2016/wordml/cid" xmlns:w16="http://schemas.microsoft.com/office/word/2018/wordml" xmlns:w16sdtdh="http://schemas.microsoft.com/office/word/2020/wordml/sdtdatahash" xmlns:w16se="http://schemas.microsoft.com/office/word/2015/wordml/symex" xmlns:sl="http://schemas.openxmlformats.org/schemaLibrary/2006/main" mc:Ignorable="w14 w15 w16se w16cid w16 w16cex w16sdtdh">
+  <w:zoom w:percent="100"/>
+  <w:proofState w:spelling="clean"/>
+  <w:defaultTabStop w:val="708"/>
+  <w:hyphenationZone w:val="425"/>
+  <w:characterSpacingControl w:val="doNotCompress"/>
+  <w:hdrShapeDefaults>
+    <o:shapedefaults v:ext="edit" spidmax="2050"/>
+  </w:hdrShapeDefaults>
+  <w:footnotePr>
+    <w:footnote w:id="-1"/>
+    <w:footnote w:id="0"/>
+  </w:footnotePr>
+  <w:endnotePr>
+    <w:endnote w:id="-1"/>
+    <w:endnote w:id="0"/>
+  </w:endnotePr>
+  <w:compat>
+    <w:compatSetting w:name="compatibilityMode" w:uri="http://schemas.microsoft.com/office/word" w:val="15"/>
+    <w:compatSetting w:name="overrideTableStyleFontSizeAndJustification" w:uri="http://schemas.microsoft.com/office/word" w:val="1"/>
+    <w:compatSetting w:name="enableOpenTypeFeatures" w:uri="http://schemas.microsoft.com/office/word" w:val="1"/>
+    <w:compatSetting w:name="doNotFlipMirrorIndents" w:uri="http://schemas.microsoft.com/office/word" w:val="1"/>
+    <w:compatSetting w:name="differentiateMultirowTableHeaders" w:uri="http://schemas.microsoft.com/office/word" w:val="1"/>
+    <w:compatSetting w:name="useWord2013TrackBottomHyphenation" w:uri="http://schemas.microsoft.com/office/word" w:val="0"/>
+  </w:compat>
+  <w:rsids>
+    <w:rsidRoot w:val="00CD6784"/>
+    <w:rsid w:val="0000454F"/>
+    <w:rsid w:val="00017905"/>
+    <w:rsid w:val="00030998"/>
+    <w:rsid w:val="00031719"/>
+    <w:rsid w:val="000376D9"/>
+    <w:rsid w:val="000522B5"/>
+    <w:rsid w:val="00066672"/>
+    <w:rsid w:val="00076E78"/>
+    <w:rsid w:val="00080AE4"/>
+    <w:rsid w:val="00091479"/>
+    <w:rsid w:val="00097BE7"/>
+    <w:rsid w:val="000A3794"/>
+    <w:rsid w:val="000A7577"/>
+    <w:rsid w:val="000B7E9F"/>
+    <w:rsid w:val="0010037B"/>
+    <w:rsid w:val="00101277"/>
+    <w:rsid w:val="001107BD"/>
+    <w:rsid w:val="0011086E"/>
+    <w:rsid w:val="001157EB"/>
+    <w:rsid w:val="001324E3"/>
+    <w:rsid w:val="0014421F"/>
+    <w:rsid w:val="001445DB"/>
+    <w:rsid w:val="00171045"/>
+    <w:rsid w:val="00194B80"/>
+    <w:rsid w:val="001C063C"/>
+    <w:rsid w:val="001C0776"/>
+    <w:rsid w:val="001C5A4C"/>
+    <w:rsid w:val="001C5BB8"/>
+    <w:rsid w:val="001F1359"/>
+    <w:rsid w:val="00212F9D"/>
+    <w:rsid w:val="00232750"/>
+    <w:rsid w:val="0023333C"/>
+    <w:rsid w:val="00260C5A"/>
+    <w:rsid w:val="00261AF2"/>
+    <w:rsid w:val="00285D4E"/>
+    <w:rsid w:val="00294A30"/>
+    <w:rsid w:val="00296A88"/>
+    <w:rsid w:val="002A2CC7"/>
+    <w:rsid w:val="002B34EF"/>
+    <w:rsid w:val="002C1A89"/>
+    <w:rsid w:val="002D1D29"/>
+    <w:rsid w:val="002E013B"/>
+    <w:rsid w:val="002E44D9"/>
+    <w:rsid w:val="002F46BC"/>
+    <w:rsid w:val="002F5785"/>
+    <w:rsid w:val="00301E37"/>
+    <w:rsid w:val="003170B5"/>
+    <w:rsid w:val="00321CA5"/>
+    <w:rsid w:val="003374C7"/>
+    <w:rsid w:val="0035380C"/>
+    <w:rsid w:val="003544B7"/>
+    <w:rsid w:val="00355A65"/>
+    <w:rsid w:val="00364088"/>
+    <w:rsid w:val="0036420A"/>
+    <w:rsid w:val="00393D64"/>
+    <w:rsid w:val="0039664E"/>
+    <w:rsid w:val="003977BD"/>
+    <w:rsid w:val="003A31C4"/>
+    <w:rsid w:val="003A62F5"/>
+    <w:rsid w:val="003B16DC"/>
+    <w:rsid w:val="003D0781"/>
+    <w:rsid w:val="003D235D"/>
+    <w:rsid w:val="003D75AA"/>
+    <w:rsid w:val="003E1E3E"/>
+    <w:rsid w:val="003E2BFD"/>
+    <w:rsid w:val="0040431F"/>
+    <w:rsid w:val="00410EB8"/>
+    <w:rsid w:val="00411911"/>
+    <w:rsid w:val="00426FF6"/>
+    <w:rsid w:val="004274ED"/>
+    <w:rsid w:val="00451F78"/>
+    <w:rsid w:val="004528D2"/>
+    <w:rsid w:val="00455279"/>
+    <w:rsid w:val="00457C19"/>
+    <w:rsid w:val="00497804"/>
+    <w:rsid w:val="004A712D"/>
+    <w:rsid w:val="004C5A2B"/>
+    <w:rsid w:val="004C6EBB"/>
+    <w:rsid w:val="004D00E4"/>
+    <w:rsid w:val="004D5191"/>
+    <w:rsid w:val="004D77CB"/>
+    <w:rsid w:val="004F20C9"/>
+    <w:rsid w:val="004F49CB"/>
+    <w:rsid w:val="00503809"/>
+    <w:rsid w:val="00544EB0"/>
+    <w:rsid w:val="00550957"/>
+    <w:rsid w:val="00551878"/>
+    <w:rsid w:val="00551D86"/>
+    <w:rsid w:val="00553BD2"/>
+    <w:rsid w:val="00555A07"/>
+    <w:rsid w:val="00561B80"/>
+    <w:rsid w:val="005620A0"/>
+    <w:rsid w:val="0056683C"/>
+    <w:rsid w:val="00574F16"/>
+    <w:rsid w:val="00583840"/>
+    <w:rsid w:val="005A2B47"/>
+    <w:rsid w:val="005A7475"/>
+    <w:rsid w:val="005B3F0E"/>
+    <w:rsid w:val="005B453D"/>
+    <w:rsid w:val="005B468A"/>
+    <w:rsid w:val="005C0826"/>
+    <w:rsid w:val="005C1A80"/>
+    <w:rsid w:val="005C3CB2"/>
+    <w:rsid w:val="005C5763"/>
+    <w:rsid w:val="005D32C3"/>
+    <w:rsid w:val="005D5D99"/>
+    <w:rsid w:val="005E18FA"/>
+    <w:rsid w:val="005F21D7"/>
+    <w:rsid w:val="005F45B1"/>
+    <w:rsid w:val="00605AB6"/>
+    <w:rsid w:val="00613CE1"/>
+    <w:rsid w:val="0061566D"/>
+    <w:rsid w:val="006372A7"/>
+    <w:rsid w:val="00641A59"/>
+    <w:rsid w:val="0064620B"/>
+    <w:rsid w:val="006519B9"/>
+    <w:rsid w:val="006543C4"/>
+    <w:rsid w:val="00677C1C"/>
+    <w:rsid w:val="00680F0B"/>
+    <w:rsid w:val="0069273B"/>
+    <w:rsid w:val="0069489A"/>
+    <w:rsid w:val="006A6791"/>
+    <w:rsid w:val="006A736E"/>
+    <w:rsid w:val="006B3D53"/>
+    <w:rsid w:val="006C17C4"/>
+    <w:rsid w:val="006C4687"/>
+    <w:rsid w:val="006C7871"/>
+    <w:rsid w:val="006D231D"/>
+    <w:rsid w:val="006D47E2"/>
+    <w:rsid w:val="006D498C"/>
+    <w:rsid w:val="006D7E6D"/>
+    <w:rsid w:val="006D7F81"/>
+    <w:rsid w:val="006E10DB"/>
+    <w:rsid w:val="006E52AD"/>
+    <w:rsid w:val="006F596F"/>
+    <w:rsid w:val="006F728B"/>
+    <w:rsid w:val="00707979"/>
+    <w:rsid w:val="00710E25"/>
+    <w:rsid w:val="0071652A"/>
+    <w:rsid w:val="00717003"/>
+    <w:rsid w:val="007302E4"/>
+    <w:rsid w:val="007421C0"/>
+    <w:rsid w:val="007664F2"/>
+    <w:rsid w:val="00794CFC"/>
+    <w:rsid w:val="007A235E"/>
+    <w:rsid w:val="007C373B"/>
+    <w:rsid w:val="007E47BB"/>
+    <w:rsid w:val="007F38EF"/>
+    <w:rsid w:val="007F5EF7"/>
+    <w:rsid w:val="007F6ABA"/>
+    <w:rsid w:val="0080798D"/>
+    <w:rsid w:val="008304A5"/>
+    <w:rsid w:val="00836A02"/>
+    <w:rsid w:val="0085237B"/>
+    <w:rsid w:val="00866C5E"/>
+    <w:rsid w:val="00887490"/>
+    <w:rsid w:val="0089306E"/>
+    <w:rsid w:val="008A0C29"/>
+    <w:rsid w:val="008A307E"/>
+    <w:rsid w:val="008A6759"/>
+    <w:rsid w:val="008C1260"/>
+    <w:rsid w:val="008C74B2"/>
+    <w:rsid w:val="008D325D"/>
+    <w:rsid w:val="008E0D41"/>
+    <w:rsid w:val="008E45F2"/>
+    <w:rsid w:val="008F15AC"/>
+    <w:rsid w:val="008F2B68"/>
+    <w:rsid w:val="00900A08"/>
+    <w:rsid w:val="00903C3F"/>
+    <w:rsid w:val="00911230"/>
+    <w:rsid w:val="00934775"/>
+    <w:rsid w:val="009366F8"/>
+    <w:rsid w:val="00940035"/>
+    <w:rsid w:val="00943B61"/>
+    <w:rsid w:val="0094630D"/>
+    <w:rsid w:val="00961DC2"/>
+    <w:rsid w:val="00962BFC"/>
+    <w:rsid w:val="00965305"/>
+    <w:rsid w:val="00972941"/>
+    <w:rsid w:val="00980050"/>
+    <w:rsid w:val="009812B7"/>
+    <w:rsid w:val="00983FB5"/>
+    <w:rsid w:val="009A5BEE"/>
+    <w:rsid w:val="009C0C08"/>
+    <w:rsid w:val="009C17FE"/>
+    <w:rsid w:val="009D5A28"/>
+    <w:rsid w:val="009D5C17"/>
+    <w:rsid w:val="009E2005"/>
+    <w:rsid w:val="009E6092"/>
+    <w:rsid w:val="00A12C13"/>
+    <w:rsid w:val="00A21E17"/>
+    <w:rsid w:val="00A22633"/>
+    <w:rsid w:val="00A242C5"/>
+    <w:rsid w:val="00A265E7"/>
+    <w:rsid w:val="00A30BBB"/>
+    <w:rsid w:val="00A520F9"/>
+    <w:rsid w:val="00A727E7"/>
+    <w:rsid w:val="00A7392C"/>
+    <w:rsid w:val="00A73E7C"/>
+    <w:rsid w:val="00A972A0"/>
+    <w:rsid w:val="00AA104E"/>
+    <w:rsid w:val="00AB4333"/>
+    <w:rsid w:val="00AC5AE5"/>
+    <w:rsid w:val="00AD55D6"/>
+    <w:rsid w:val="00AD7DAB"/>
+    <w:rsid w:val="00AE2F88"/>
+    <w:rsid w:val="00B125BB"/>
+    <w:rsid w:val="00B1277A"/>
+    <w:rsid w:val="00B14D93"/>
+    <w:rsid w:val="00B20409"/>
+    <w:rsid w:val="00B2595E"/>
+    <w:rsid w:val="00B47E82"/>
+    <w:rsid w:val="00B632D5"/>
+    <w:rsid w:val="00B64841"/>
+    <w:rsid w:val="00BB643E"/>
+    <w:rsid w:val="00BC40B8"/>
+    <w:rsid w:val="00BC4738"/>
+    <w:rsid w:val="00BC7D47"/>
+    <w:rsid w:val="00BD22F8"/>
+    <w:rsid w:val="00BD6FC2"/>
+    <w:rsid w:val="00C15255"/>
+    <w:rsid w:val="00C37318"/>
+    <w:rsid w:val="00C3798A"/>
+    <w:rsid w:val="00C5006C"/>
+    <w:rsid w:val="00C51CCF"/>
+    <w:rsid w:val="00C57EC8"/>
+    <w:rsid w:val="00C676CA"/>
+    <w:rsid w:val="00C76339"/>
+    <w:rsid w:val="00C850B1"/>
+    <w:rsid w:val="00C8645D"/>
+    <w:rsid w:val="00CA156A"/>
+    <w:rsid w:val="00CA1CD2"/>
+    <w:rsid w:val="00CC73F0"/>
+    <w:rsid w:val="00CD6784"/>
+    <w:rsid w:val="00D27D95"/>
+    <w:rsid w:val="00D433AD"/>
+    <w:rsid w:val="00D44951"/>
+    <w:rsid w:val="00D45211"/>
+    <w:rsid w:val="00D5713D"/>
+    <w:rsid w:val="00D6692D"/>
+    <w:rsid w:val="00D93F70"/>
+    <w:rsid w:val="00DA278E"/>
+    <w:rsid w:val="00DA53CC"/>
+    <w:rsid w:val="00DA5C9E"/>
+    <w:rsid w:val="00DB2B2B"/>
+    <w:rsid w:val="00DC38B8"/>
+    <w:rsid w:val="00DD5367"/>
+    <w:rsid w:val="00DE2181"/>
+    <w:rsid w:val="00DE2A61"/>
+    <w:rsid w:val="00DE5C57"/>
+    <w:rsid w:val="00DF410B"/>
+    <w:rsid w:val="00DF453C"/>
+    <w:rsid w:val="00E0747C"/>
+    <w:rsid w:val="00E16BBF"/>
+    <w:rsid w:val="00E26325"/>
+    <w:rsid w:val="00E35BF5"/>
+    <w:rsid w:val="00E4169C"/>
+    <w:rsid w:val="00E57041"/>
+    <w:rsid w:val="00E62BF5"/>
+    <w:rsid w:val="00E63101"/>
+    <w:rsid w:val="00E648A4"/>
+    <w:rsid w:val="00E66933"/>
+    <w:rsid w:val="00E755A3"/>
+    <w:rsid w:val="00E84256"/>
+    <w:rsid w:val="00E85544"/>
+    <w:rsid w:val="00E91198"/>
+    <w:rsid w:val="00EC3A07"/>
+    <w:rsid w:val="00EC6B3A"/>
+    <w:rsid w:val="00ED143C"/>
+    <w:rsid w:val="00EE4F59"/>
+    <w:rsid w:val="00F05FBC"/>
+    <w:rsid w:val="00F1378F"/>
+    <w:rsid w:val="00F35221"/>
+    <w:rsid w:val="00F56772"/>
+    <w:rsid w:val="00F848EB"/>
+    <w:rsid w:val="00F9307A"/>
+    <w:rsid w:val="00F948B6"/>
+    <w:rsid w:val="00FA011D"/>
+    <w:rsid w:val="00FA282D"/>
+    <w:rsid w:val="00FA777C"/>
+    <w:rsid w:val="00FB6E06"/>
+    <w:rsid w:val="00FB7E43"/>
+    <w:rsid w:val="00FC532B"/>
+    <w:rsid w:val="00FD6D41"/>
+    <w:rsid w:val="00FE4ECD"/>
+  </w:rsids>
+  <m:mathPr>
+    <m:mathFont m:val="Cambria Math"/>
+    <m:brkBin m:val="before"/>
+    <m:brkBinSub m:val="--"/>
+    <m:smallFrac m:val="0"/>
+    <m:dispDef/>
+    <m:lMargin m:val="0"/>
+    <m:rMargin m:val="0"/>
+    <m:defJc m:val="centerGroup"/>
+    <m:wrapIndent m:val="1440"/>
+    <m:intLim m:val="subSup"/>
+    <m:naryLim m:val="undOvr"/>
+  </m:mathPr>
+  <w:themeFontLang w:val="es-CO"/>
+  <w:clrSchemeMapping w:bg1="light1" w:t1="dark1" w:bg2="light2" w:t2="dark2" w:accent1="accent1" w:accent2="accent2" w:accent3="accent3" w:accent4="accent4" w:accent5="accent5" w:accent6="accent6" w:hyperlink="hyperlink" w:followedHyperlink="followedHyperlink"/>
+  <w:shapeDefaults>
+    <o:shapedefaults v:ext="edit" spidmax="2050"/>
+    <o:shapelayout v:ext="edit">
+      <o:idmap v:ext="edit" data="2"/>
+    </o:shapelayout>
+  </w:shapeDefaults>
+  <w:decimalSymbol w:val=","/>
+  <w:listSeparator w:val=";"/>
+  <w14:docId w14:val="213A030B"/>
+  <w15:docId w15:val="{436DF6C1-E372-4189-A413-1E6E3419FCDE}"/>
+</w:settings>
+</file>
+
+<file path=word\styles.xml><?xml version="1.0" encoding="utf-8"?>
 <w:styles xmlns:mc="http://schemas.openxmlformats.org/markup-compatibility/2006" xmlns:r="http://schemas.openxmlformats.org/officeDocument/2006/relationships" xmlns:w="http://schemas.openxmlformats.org/wordprocessingml/2006/main" xmlns:w14="http://schemas.microsoft.com/office/word/2010/wordml" xmlns:w15="http://schemas.microsoft.com/office/word/2012/wordml" xmlns:w16cex="http://schemas.microsoft.com/office/word/2018/wordml/cex" xmlns:w16cid="http://schemas.microsoft.com/office/word/2016/wordml/cid" xmlns:w16="http://schemas.microsoft.com/office/word/2018/wordml" xmlns:w16sdtdh="http://schemas.microsoft.com/office/word/2020/wordml/sdtdatahash" xmlns:w16se="http://schemas.microsoft.com/office/word/2015/wordml/symex" mc:Ignorable="w14 w15 w16se w16cid w16 w16cex w16sdtdh">
   <w:docDefaults>
     <w:rPrDefault>
@@ -14068,7 +14597,7 @@
 </w:styles>
 </file>
 
-<file path=word/theme/theme1.xml><?xml version="1.0" encoding="utf-8"?>
+<file path=word\theme\theme1.xml><?xml version="1.0" encoding="utf-8"?>
 <a:theme xmlns:a="http://schemas.openxmlformats.org/drawingml/2006/main" name="Tema de Office">
   <a:themeElements>
     <a:clrScheme name="Office">
@@ -14353,14 +14882,832 @@
 </a:theme>
 </file>
 
-<file path=customXml/item1.xml><?xml version="1.0" encoding="utf-8"?>
-<b:Sources xmlns:b="http://schemas.openxmlformats.org/officeDocument/2006/bibliography" xmlns="http://schemas.openxmlformats.org/officeDocument/2006/bibliography" SelectedStyle="\APASixthEditionOfficeOnline.xsl" StyleName="APA" Version="6"/>
-</file>
-
-<file path=customXml/itemProps1.xml><?xml version="1.0" encoding="utf-8"?>
-<ds:datastoreItem xmlns:ds="http://schemas.openxmlformats.org/officeDocument/2006/customXml" ds:itemID="{8E6929E9-498A-4D52-8CB7-117FBBBB5CE7}">
-  <ds:schemaRefs>
-    <ds:schemaRef ds:uri="http://schemas.openxmlformats.org/officeDocument/2006/bibliography"/>
-  </ds:schemaRefs>
-</ds:datastoreItem>
+<file path=word\webSettings.xml><?xml version="1.0" encoding="utf-8"?>
+<w:webSettings xmlns:mc="http://schemas.openxmlformats.org/markup-compatibility/2006" xmlns:r="http://schemas.openxmlformats.org/officeDocument/2006/relationships" xmlns:w="http://schemas.openxmlformats.org/wordprocessingml/2006/main" xmlns:w14="http://schemas.microsoft.com/office/word/2010/wordml" xmlns:w15="http://schemas.microsoft.com/office/word/2012/wordml" xmlns:w16cex="http://schemas.microsoft.com/office/word/2018/wordml/cex" xmlns:w16cid="http://schemas.microsoft.com/office/word/2016/wordml/cid" xmlns:w16="http://schemas.microsoft.com/office/word/2018/wordml" xmlns:w16sdtdh="http://schemas.microsoft.com/office/word/2020/wordml/sdtdatahash" xmlns:w16se="http://schemas.microsoft.com/office/word/2015/wordml/symex" mc:Ignorable="w14 w15 w16se w16cid w16 w16cex w16sdtdh">
+  <w:divs>
+    <w:div w:id="48967280">
+      <w:bodyDiv w:val="1"/>
+      <w:marLeft w:val="0"/>
+      <w:marRight w:val="0"/>
+      <w:marTop w:val="0"/>
+      <w:marBottom w:val="0"/>
+      <w:divBdr>
+        <w:top w:val="none" w:sz="0" w:space="0" w:color="auto"/>
+        <w:left w:val="none" w:sz="0" w:space="0" w:color="auto"/>
+        <w:bottom w:val="none" w:sz="0" w:space="0" w:color="auto"/>
+        <w:right w:val="none" w:sz="0" w:space="0" w:color="auto"/>
+      </w:divBdr>
+      <w:divsChild>
+        <w:div w:id="778448759">
+          <w:marLeft w:val="0"/>
+          <w:marRight w:val="0"/>
+          <w:marTop w:val="0"/>
+          <w:marBottom w:val="0"/>
+          <w:divBdr>
+            <w:top w:val="none" w:sz="0" w:space="0" w:color="auto"/>
+            <w:left w:val="none" w:sz="0" w:space="0" w:color="auto"/>
+            <w:bottom w:val="none" w:sz="0" w:space="0" w:color="auto"/>
+            <w:right w:val="none" w:sz="0" w:space="0" w:color="auto"/>
+          </w:divBdr>
+          <w:divsChild>
+            <w:div w:id="1679192640">
+              <w:marLeft w:val="0"/>
+              <w:marRight w:val="0"/>
+              <w:marTop w:val="0"/>
+              <w:marBottom w:val="0"/>
+              <w:divBdr>
+                <w:top w:val="none" w:sz="0" w:space="0" w:color="auto"/>
+                <w:left w:val="none" w:sz="0" w:space="0" w:color="auto"/>
+                <w:bottom w:val="none" w:sz="0" w:space="0" w:color="auto"/>
+                <w:right w:val="none" w:sz="0" w:space="0" w:color="auto"/>
+              </w:divBdr>
+            </w:div>
+          </w:divsChild>
+        </w:div>
+      </w:divsChild>
+    </w:div>
+    <w:div w:id="139082750">
+      <w:bodyDiv w:val="1"/>
+      <w:marLeft w:val="0"/>
+      <w:marRight w:val="0"/>
+      <w:marTop w:val="0"/>
+      <w:marBottom w:val="0"/>
+      <w:divBdr>
+        <w:top w:val="none" w:sz="0" w:space="0" w:color="auto"/>
+        <w:left w:val="none" w:sz="0" w:space="0" w:color="auto"/>
+        <w:bottom w:val="none" w:sz="0" w:space="0" w:color="auto"/>
+        <w:right w:val="none" w:sz="0" w:space="0" w:color="auto"/>
+      </w:divBdr>
+      <w:divsChild>
+        <w:div w:id="1127771904">
+          <w:marLeft w:val="0"/>
+          <w:marRight w:val="0"/>
+          <w:marTop w:val="0"/>
+          <w:marBottom w:val="0"/>
+          <w:divBdr>
+            <w:top w:val="none" w:sz="0" w:space="0" w:color="auto"/>
+            <w:left w:val="none" w:sz="0" w:space="0" w:color="auto"/>
+            <w:bottom w:val="none" w:sz="0" w:space="0" w:color="auto"/>
+            <w:right w:val="none" w:sz="0" w:space="0" w:color="auto"/>
+          </w:divBdr>
+          <w:divsChild>
+            <w:div w:id="1044675514">
+              <w:marLeft w:val="0"/>
+              <w:marRight w:val="0"/>
+              <w:marTop w:val="0"/>
+              <w:marBottom w:val="0"/>
+              <w:divBdr>
+                <w:top w:val="none" w:sz="0" w:space="0" w:color="auto"/>
+                <w:left w:val="none" w:sz="0" w:space="0" w:color="auto"/>
+                <w:bottom w:val="none" w:sz="0" w:space="0" w:color="auto"/>
+                <w:right w:val="none" w:sz="0" w:space="0" w:color="auto"/>
+              </w:divBdr>
+            </w:div>
+          </w:divsChild>
+        </w:div>
+      </w:divsChild>
+    </w:div>
+    <w:div w:id="168640116">
+      <w:bodyDiv w:val="1"/>
+      <w:marLeft w:val="0"/>
+      <w:marRight w:val="0"/>
+      <w:marTop w:val="0"/>
+      <w:marBottom w:val="0"/>
+      <w:divBdr>
+        <w:top w:val="none" w:sz="0" w:space="0" w:color="auto"/>
+        <w:left w:val="none" w:sz="0" w:space="0" w:color="auto"/>
+        <w:bottom w:val="none" w:sz="0" w:space="0" w:color="auto"/>
+        <w:right w:val="none" w:sz="0" w:space="0" w:color="auto"/>
+      </w:divBdr>
+      <w:divsChild>
+        <w:div w:id="1725714084">
+          <w:marLeft w:val="0"/>
+          <w:marRight w:val="0"/>
+          <w:marTop w:val="0"/>
+          <w:marBottom w:val="0"/>
+          <w:divBdr>
+            <w:top w:val="none" w:sz="0" w:space="0" w:color="auto"/>
+            <w:left w:val="none" w:sz="0" w:space="0" w:color="auto"/>
+            <w:bottom w:val="none" w:sz="0" w:space="0" w:color="auto"/>
+            <w:right w:val="none" w:sz="0" w:space="0" w:color="auto"/>
+          </w:divBdr>
+          <w:divsChild>
+            <w:div w:id="2043287069">
+              <w:marLeft w:val="0"/>
+              <w:marRight w:val="0"/>
+              <w:marTop w:val="0"/>
+              <w:marBottom w:val="0"/>
+              <w:divBdr>
+                <w:top w:val="none" w:sz="0" w:space="0" w:color="auto"/>
+                <w:left w:val="none" w:sz="0" w:space="0" w:color="auto"/>
+                <w:bottom w:val="none" w:sz="0" w:space="0" w:color="auto"/>
+                <w:right w:val="none" w:sz="0" w:space="0" w:color="auto"/>
+              </w:divBdr>
+            </w:div>
+          </w:divsChild>
+        </w:div>
+      </w:divsChild>
+    </w:div>
+    <w:div w:id="170029016">
+      <w:bodyDiv w:val="1"/>
+      <w:marLeft w:val="0"/>
+      <w:marRight w:val="0"/>
+      <w:marTop w:val="0"/>
+      <w:marBottom w:val="0"/>
+      <w:divBdr>
+        <w:top w:val="none" w:sz="0" w:space="0" w:color="auto"/>
+        <w:left w:val="none" w:sz="0" w:space="0" w:color="auto"/>
+        <w:bottom w:val="none" w:sz="0" w:space="0" w:color="auto"/>
+        <w:right w:val="none" w:sz="0" w:space="0" w:color="auto"/>
+      </w:divBdr>
+      <w:divsChild>
+        <w:div w:id="840437317">
+          <w:marLeft w:val="0"/>
+          <w:marRight w:val="0"/>
+          <w:marTop w:val="0"/>
+          <w:marBottom w:val="0"/>
+          <w:divBdr>
+            <w:top w:val="none" w:sz="0" w:space="0" w:color="auto"/>
+            <w:left w:val="none" w:sz="0" w:space="0" w:color="auto"/>
+            <w:bottom w:val="none" w:sz="0" w:space="0" w:color="auto"/>
+            <w:right w:val="none" w:sz="0" w:space="0" w:color="auto"/>
+          </w:divBdr>
+          <w:divsChild>
+            <w:div w:id="139272189">
+              <w:marLeft w:val="0"/>
+              <w:marRight w:val="0"/>
+              <w:marTop w:val="0"/>
+              <w:marBottom w:val="0"/>
+              <w:divBdr>
+                <w:top w:val="none" w:sz="0" w:space="0" w:color="auto"/>
+                <w:left w:val="none" w:sz="0" w:space="0" w:color="auto"/>
+                <w:bottom w:val="none" w:sz="0" w:space="0" w:color="auto"/>
+                <w:right w:val="none" w:sz="0" w:space="0" w:color="auto"/>
+              </w:divBdr>
+            </w:div>
+          </w:divsChild>
+        </w:div>
+      </w:divsChild>
+    </w:div>
+    <w:div w:id="298531803">
+      <w:bodyDiv w:val="1"/>
+      <w:marLeft w:val="0"/>
+      <w:marRight w:val="0"/>
+      <w:marTop w:val="0"/>
+      <w:marBottom w:val="0"/>
+      <w:divBdr>
+        <w:top w:val="none" w:sz="0" w:space="0" w:color="auto"/>
+        <w:left w:val="none" w:sz="0" w:space="0" w:color="auto"/>
+        <w:bottom w:val="none" w:sz="0" w:space="0" w:color="auto"/>
+        <w:right w:val="none" w:sz="0" w:space="0" w:color="auto"/>
+      </w:divBdr>
+      <w:divsChild>
+        <w:div w:id="1523319588">
+          <w:marLeft w:val="0"/>
+          <w:marRight w:val="0"/>
+          <w:marTop w:val="0"/>
+          <w:marBottom w:val="0"/>
+          <w:divBdr>
+            <w:top w:val="none" w:sz="0" w:space="0" w:color="auto"/>
+            <w:left w:val="none" w:sz="0" w:space="0" w:color="auto"/>
+            <w:bottom w:val="none" w:sz="0" w:space="0" w:color="auto"/>
+            <w:right w:val="none" w:sz="0" w:space="0" w:color="auto"/>
+          </w:divBdr>
+          <w:divsChild>
+            <w:div w:id="1091271554">
+              <w:marLeft w:val="0"/>
+              <w:marRight w:val="0"/>
+              <w:marTop w:val="0"/>
+              <w:marBottom w:val="0"/>
+              <w:divBdr>
+                <w:top w:val="none" w:sz="0" w:space="0" w:color="auto"/>
+                <w:left w:val="none" w:sz="0" w:space="0" w:color="auto"/>
+                <w:bottom w:val="none" w:sz="0" w:space="0" w:color="auto"/>
+                <w:right w:val="none" w:sz="0" w:space="0" w:color="auto"/>
+              </w:divBdr>
+            </w:div>
+          </w:divsChild>
+        </w:div>
+      </w:divsChild>
+    </w:div>
+    <w:div w:id="327095324">
+      <w:bodyDiv w:val="1"/>
+      <w:marLeft w:val="0"/>
+      <w:marRight w:val="0"/>
+      <w:marTop w:val="0"/>
+      <w:marBottom w:val="0"/>
+      <w:divBdr>
+        <w:top w:val="none" w:sz="0" w:space="0" w:color="auto"/>
+        <w:left w:val="none" w:sz="0" w:space="0" w:color="auto"/>
+        <w:bottom w:val="none" w:sz="0" w:space="0" w:color="auto"/>
+        <w:right w:val="none" w:sz="0" w:space="0" w:color="auto"/>
+      </w:divBdr>
+      <w:divsChild>
+        <w:div w:id="929193527">
+          <w:marLeft w:val="0"/>
+          <w:marRight w:val="0"/>
+          <w:marTop w:val="0"/>
+          <w:marBottom w:val="0"/>
+          <w:divBdr>
+            <w:top w:val="none" w:sz="0" w:space="0" w:color="auto"/>
+            <w:left w:val="none" w:sz="0" w:space="0" w:color="auto"/>
+            <w:bottom w:val="none" w:sz="0" w:space="0" w:color="auto"/>
+            <w:right w:val="none" w:sz="0" w:space="0" w:color="auto"/>
+          </w:divBdr>
+          <w:divsChild>
+            <w:div w:id="1957444537">
+              <w:marLeft w:val="0"/>
+              <w:marRight w:val="0"/>
+              <w:marTop w:val="0"/>
+              <w:marBottom w:val="0"/>
+              <w:divBdr>
+                <w:top w:val="none" w:sz="0" w:space="0" w:color="auto"/>
+                <w:left w:val="none" w:sz="0" w:space="0" w:color="auto"/>
+                <w:bottom w:val="none" w:sz="0" w:space="0" w:color="auto"/>
+                <w:right w:val="none" w:sz="0" w:space="0" w:color="auto"/>
+              </w:divBdr>
+            </w:div>
+          </w:divsChild>
+        </w:div>
+      </w:divsChild>
+    </w:div>
+    <w:div w:id="346368549">
+      <w:bodyDiv w:val="1"/>
+      <w:marLeft w:val="0"/>
+      <w:marRight w:val="0"/>
+      <w:marTop w:val="0"/>
+      <w:marBottom w:val="0"/>
+      <w:divBdr>
+        <w:top w:val="none" w:sz="0" w:space="0" w:color="auto"/>
+        <w:left w:val="none" w:sz="0" w:space="0" w:color="auto"/>
+        <w:bottom w:val="none" w:sz="0" w:space="0" w:color="auto"/>
+        <w:right w:val="none" w:sz="0" w:space="0" w:color="auto"/>
+      </w:divBdr>
+      <w:divsChild>
+        <w:div w:id="1705909410">
+          <w:marLeft w:val="0"/>
+          <w:marRight w:val="0"/>
+          <w:marTop w:val="0"/>
+          <w:marBottom w:val="0"/>
+          <w:divBdr>
+            <w:top w:val="none" w:sz="0" w:space="0" w:color="auto"/>
+            <w:left w:val="none" w:sz="0" w:space="0" w:color="auto"/>
+            <w:bottom w:val="none" w:sz="0" w:space="0" w:color="auto"/>
+            <w:right w:val="none" w:sz="0" w:space="0" w:color="auto"/>
+          </w:divBdr>
+          <w:divsChild>
+            <w:div w:id="83382397">
+              <w:marLeft w:val="0"/>
+              <w:marRight w:val="0"/>
+              <w:marTop w:val="0"/>
+              <w:marBottom w:val="0"/>
+              <w:divBdr>
+                <w:top w:val="none" w:sz="0" w:space="0" w:color="auto"/>
+                <w:left w:val="none" w:sz="0" w:space="0" w:color="auto"/>
+                <w:bottom w:val="none" w:sz="0" w:space="0" w:color="auto"/>
+                <w:right w:val="none" w:sz="0" w:space="0" w:color="auto"/>
+              </w:divBdr>
+            </w:div>
+          </w:divsChild>
+        </w:div>
+      </w:divsChild>
+    </w:div>
+    <w:div w:id="480390717">
+      <w:bodyDiv w:val="1"/>
+      <w:marLeft w:val="0"/>
+      <w:marRight w:val="0"/>
+      <w:marTop w:val="0"/>
+      <w:marBottom w:val="0"/>
+      <w:divBdr>
+        <w:top w:val="none" w:sz="0" w:space="0" w:color="auto"/>
+        <w:left w:val="none" w:sz="0" w:space="0" w:color="auto"/>
+        <w:bottom w:val="none" w:sz="0" w:space="0" w:color="auto"/>
+        <w:right w:val="none" w:sz="0" w:space="0" w:color="auto"/>
+      </w:divBdr>
+      <w:divsChild>
+        <w:div w:id="398478432">
+          <w:marLeft w:val="0"/>
+          <w:marRight w:val="0"/>
+          <w:marTop w:val="0"/>
+          <w:marBottom w:val="0"/>
+          <w:divBdr>
+            <w:top w:val="none" w:sz="0" w:space="0" w:color="auto"/>
+            <w:left w:val="none" w:sz="0" w:space="0" w:color="auto"/>
+            <w:bottom w:val="none" w:sz="0" w:space="0" w:color="auto"/>
+            <w:right w:val="none" w:sz="0" w:space="0" w:color="auto"/>
+          </w:divBdr>
+          <w:divsChild>
+            <w:div w:id="1142043592">
+              <w:marLeft w:val="0"/>
+              <w:marRight w:val="0"/>
+              <w:marTop w:val="0"/>
+              <w:marBottom w:val="0"/>
+              <w:divBdr>
+                <w:top w:val="none" w:sz="0" w:space="0" w:color="auto"/>
+                <w:left w:val="none" w:sz="0" w:space="0" w:color="auto"/>
+                <w:bottom w:val="none" w:sz="0" w:space="0" w:color="auto"/>
+                <w:right w:val="none" w:sz="0" w:space="0" w:color="auto"/>
+              </w:divBdr>
+            </w:div>
+          </w:divsChild>
+        </w:div>
+      </w:divsChild>
+    </w:div>
+    <w:div w:id="612636889">
+      <w:bodyDiv w:val="1"/>
+      <w:marLeft w:val="0"/>
+      <w:marRight w:val="0"/>
+      <w:marTop w:val="0"/>
+      <w:marBottom w:val="0"/>
+      <w:divBdr>
+        <w:top w:val="none" w:sz="0" w:space="0" w:color="auto"/>
+        <w:left w:val="none" w:sz="0" w:space="0" w:color="auto"/>
+        <w:bottom w:val="none" w:sz="0" w:space="0" w:color="auto"/>
+        <w:right w:val="none" w:sz="0" w:space="0" w:color="auto"/>
+      </w:divBdr>
+      <w:divsChild>
+        <w:div w:id="1842232649">
+          <w:marLeft w:val="0"/>
+          <w:marRight w:val="0"/>
+          <w:marTop w:val="0"/>
+          <w:marBottom w:val="0"/>
+          <w:divBdr>
+            <w:top w:val="none" w:sz="0" w:space="0" w:color="auto"/>
+            <w:left w:val="none" w:sz="0" w:space="0" w:color="auto"/>
+            <w:bottom w:val="none" w:sz="0" w:space="0" w:color="auto"/>
+            <w:right w:val="none" w:sz="0" w:space="0" w:color="auto"/>
+          </w:divBdr>
+          <w:divsChild>
+            <w:div w:id="176846896">
+              <w:marLeft w:val="0"/>
+              <w:marRight w:val="0"/>
+              <w:marTop w:val="0"/>
+              <w:marBottom w:val="0"/>
+              <w:divBdr>
+                <w:top w:val="none" w:sz="0" w:space="0" w:color="auto"/>
+                <w:left w:val="none" w:sz="0" w:space="0" w:color="auto"/>
+                <w:bottom w:val="none" w:sz="0" w:space="0" w:color="auto"/>
+                <w:right w:val="none" w:sz="0" w:space="0" w:color="auto"/>
+              </w:divBdr>
+            </w:div>
+          </w:divsChild>
+        </w:div>
+      </w:divsChild>
+    </w:div>
+    <w:div w:id="623586736">
+      <w:bodyDiv w:val="1"/>
+      <w:marLeft w:val="0"/>
+      <w:marRight w:val="0"/>
+      <w:marTop w:val="0"/>
+      <w:marBottom w:val="0"/>
+      <w:divBdr>
+        <w:top w:val="none" w:sz="0" w:space="0" w:color="auto"/>
+        <w:left w:val="none" w:sz="0" w:space="0" w:color="auto"/>
+        <w:bottom w:val="none" w:sz="0" w:space="0" w:color="auto"/>
+        <w:right w:val="none" w:sz="0" w:space="0" w:color="auto"/>
+      </w:divBdr>
+      <w:divsChild>
+        <w:div w:id="1610550110">
+          <w:marLeft w:val="0"/>
+          <w:marRight w:val="0"/>
+          <w:marTop w:val="0"/>
+          <w:marBottom w:val="0"/>
+          <w:divBdr>
+            <w:top w:val="none" w:sz="0" w:space="0" w:color="auto"/>
+            <w:left w:val="none" w:sz="0" w:space="0" w:color="auto"/>
+            <w:bottom w:val="none" w:sz="0" w:space="0" w:color="auto"/>
+            <w:right w:val="none" w:sz="0" w:space="0" w:color="auto"/>
+          </w:divBdr>
+          <w:divsChild>
+            <w:div w:id="2034844689">
+              <w:marLeft w:val="0"/>
+              <w:marRight w:val="0"/>
+              <w:marTop w:val="0"/>
+              <w:marBottom w:val="0"/>
+              <w:divBdr>
+                <w:top w:val="none" w:sz="0" w:space="0" w:color="auto"/>
+                <w:left w:val="none" w:sz="0" w:space="0" w:color="auto"/>
+                <w:bottom w:val="none" w:sz="0" w:space="0" w:color="auto"/>
+                <w:right w:val="none" w:sz="0" w:space="0" w:color="auto"/>
+              </w:divBdr>
+            </w:div>
+          </w:divsChild>
+        </w:div>
+      </w:divsChild>
+    </w:div>
+    <w:div w:id="627441945">
+      <w:bodyDiv w:val="1"/>
+      <w:marLeft w:val="0"/>
+      <w:marRight w:val="0"/>
+      <w:marTop w:val="0"/>
+      <w:marBottom w:val="0"/>
+      <w:divBdr>
+        <w:top w:val="none" w:sz="0" w:space="0" w:color="auto"/>
+        <w:left w:val="none" w:sz="0" w:space="0" w:color="auto"/>
+        <w:bottom w:val="none" w:sz="0" w:space="0" w:color="auto"/>
+        <w:right w:val="none" w:sz="0" w:space="0" w:color="auto"/>
+      </w:divBdr>
+      <w:divsChild>
+        <w:div w:id="1723016893">
+          <w:marLeft w:val="0"/>
+          <w:marRight w:val="0"/>
+          <w:marTop w:val="0"/>
+          <w:marBottom w:val="0"/>
+          <w:divBdr>
+            <w:top w:val="none" w:sz="0" w:space="0" w:color="auto"/>
+            <w:left w:val="none" w:sz="0" w:space="0" w:color="auto"/>
+            <w:bottom w:val="none" w:sz="0" w:space="0" w:color="auto"/>
+            <w:right w:val="none" w:sz="0" w:space="0" w:color="auto"/>
+          </w:divBdr>
+          <w:divsChild>
+            <w:div w:id="1960405335">
+              <w:marLeft w:val="0"/>
+              <w:marRight w:val="0"/>
+              <w:marTop w:val="0"/>
+              <w:marBottom w:val="0"/>
+              <w:divBdr>
+                <w:top w:val="none" w:sz="0" w:space="0" w:color="auto"/>
+                <w:left w:val="none" w:sz="0" w:space="0" w:color="auto"/>
+                <w:bottom w:val="none" w:sz="0" w:space="0" w:color="auto"/>
+                <w:right w:val="none" w:sz="0" w:space="0" w:color="auto"/>
+              </w:divBdr>
+            </w:div>
+          </w:divsChild>
+        </w:div>
+      </w:divsChild>
+    </w:div>
+    <w:div w:id="694695889">
+      <w:bodyDiv w:val="1"/>
+      <w:marLeft w:val="0"/>
+      <w:marRight w:val="0"/>
+      <w:marTop w:val="0"/>
+      <w:marBottom w:val="0"/>
+      <w:divBdr>
+        <w:top w:val="none" w:sz="0" w:space="0" w:color="auto"/>
+        <w:left w:val="none" w:sz="0" w:space="0" w:color="auto"/>
+        <w:bottom w:val="none" w:sz="0" w:space="0" w:color="auto"/>
+        <w:right w:val="none" w:sz="0" w:space="0" w:color="auto"/>
+      </w:divBdr>
+      <w:divsChild>
+        <w:div w:id="1773167257">
+          <w:marLeft w:val="0"/>
+          <w:marRight w:val="0"/>
+          <w:marTop w:val="0"/>
+          <w:marBottom w:val="0"/>
+          <w:divBdr>
+            <w:top w:val="none" w:sz="0" w:space="0" w:color="auto"/>
+            <w:left w:val="none" w:sz="0" w:space="0" w:color="auto"/>
+            <w:bottom w:val="none" w:sz="0" w:space="0" w:color="auto"/>
+            <w:right w:val="none" w:sz="0" w:space="0" w:color="auto"/>
+          </w:divBdr>
+          <w:divsChild>
+            <w:div w:id="184246872">
+              <w:marLeft w:val="0"/>
+              <w:marRight w:val="0"/>
+              <w:marTop w:val="0"/>
+              <w:marBottom w:val="0"/>
+              <w:divBdr>
+                <w:top w:val="none" w:sz="0" w:space="0" w:color="auto"/>
+                <w:left w:val="none" w:sz="0" w:space="0" w:color="auto"/>
+                <w:bottom w:val="none" w:sz="0" w:space="0" w:color="auto"/>
+                <w:right w:val="none" w:sz="0" w:space="0" w:color="auto"/>
+              </w:divBdr>
+            </w:div>
+          </w:divsChild>
+        </w:div>
+      </w:divsChild>
+    </w:div>
+    <w:div w:id="736903098">
+      <w:bodyDiv w:val="1"/>
+      <w:marLeft w:val="0"/>
+      <w:marRight w:val="0"/>
+      <w:marTop w:val="0"/>
+      <w:marBottom w:val="0"/>
+      <w:divBdr>
+        <w:top w:val="none" w:sz="0" w:space="0" w:color="auto"/>
+        <w:left w:val="none" w:sz="0" w:space="0" w:color="auto"/>
+        <w:bottom w:val="none" w:sz="0" w:space="0" w:color="auto"/>
+        <w:right w:val="none" w:sz="0" w:space="0" w:color="auto"/>
+      </w:divBdr>
+      <w:divsChild>
+        <w:div w:id="1475756975">
+          <w:marLeft w:val="0"/>
+          <w:marRight w:val="0"/>
+          <w:marTop w:val="0"/>
+          <w:marBottom w:val="0"/>
+          <w:divBdr>
+            <w:top w:val="none" w:sz="0" w:space="0" w:color="auto"/>
+            <w:left w:val="none" w:sz="0" w:space="0" w:color="auto"/>
+            <w:bottom w:val="none" w:sz="0" w:space="0" w:color="auto"/>
+            <w:right w:val="none" w:sz="0" w:space="0" w:color="auto"/>
+          </w:divBdr>
+          <w:divsChild>
+            <w:div w:id="1014039131">
+              <w:marLeft w:val="0"/>
+              <w:marRight w:val="0"/>
+              <w:marTop w:val="0"/>
+              <w:marBottom w:val="0"/>
+              <w:divBdr>
+                <w:top w:val="none" w:sz="0" w:space="0" w:color="auto"/>
+                <w:left w:val="none" w:sz="0" w:space="0" w:color="auto"/>
+                <w:bottom w:val="none" w:sz="0" w:space="0" w:color="auto"/>
+                <w:right w:val="none" w:sz="0" w:space="0" w:color="auto"/>
+              </w:divBdr>
+            </w:div>
+          </w:divsChild>
+        </w:div>
+      </w:divsChild>
+    </w:div>
+    <w:div w:id="908854291">
+      <w:bodyDiv w:val="1"/>
+      <w:marLeft w:val="0"/>
+      <w:marRight w:val="0"/>
+      <w:marTop w:val="0"/>
+      <w:marBottom w:val="0"/>
+      <w:divBdr>
+        <w:top w:val="none" w:sz="0" w:space="0" w:color="auto"/>
+        <w:left w:val="none" w:sz="0" w:space="0" w:color="auto"/>
+        <w:bottom w:val="none" w:sz="0" w:space="0" w:color="auto"/>
+        <w:right w:val="none" w:sz="0" w:space="0" w:color="auto"/>
+      </w:divBdr>
+      <w:divsChild>
+        <w:div w:id="394397364">
+          <w:marLeft w:val="0"/>
+          <w:marRight w:val="0"/>
+          <w:marTop w:val="0"/>
+          <w:marBottom w:val="0"/>
+          <w:divBdr>
+            <w:top w:val="none" w:sz="0" w:space="0" w:color="auto"/>
+            <w:left w:val="none" w:sz="0" w:space="0" w:color="auto"/>
+            <w:bottom w:val="none" w:sz="0" w:space="0" w:color="auto"/>
+            <w:right w:val="none" w:sz="0" w:space="0" w:color="auto"/>
+          </w:divBdr>
+          <w:divsChild>
+            <w:div w:id="1357000221">
+              <w:marLeft w:val="0"/>
+              <w:marRight w:val="0"/>
+              <w:marTop w:val="0"/>
+              <w:marBottom w:val="0"/>
+              <w:divBdr>
+                <w:top w:val="none" w:sz="0" w:space="0" w:color="auto"/>
+                <w:left w:val="none" w:sz="0" w:space="0" w:color="auto"/>
+                <w:bottom w:val="none" w:sz="0" w:space="0" w:color="auto"/>
+                <w:right w:val="none" w:sz="0" w:space="0" w:color="auto"/>
+              </w:divBdr>
+            </w:div>
+          </w:divsChild>
+        </w:div>
+      </w:divsChild>
+    </w:div>
+    <w:div w:id="1143963621">
+      <w:bodyDiv w:val="1"/>
+      <w:marLeft w:val="0"/>
+      <w:marRight w:val="0"/>
+      <w:marTop w:val="0"/>
+      <w:marBottom w:val="0"/>
+      <w:divBdr>
+        <w:top w:val="none" w:sz="0" w:space="0" w:color="auto"/>
+        <w:left w:val="none" w:sz="0" w:space="0" w:color="auto"/>
+        <w:bottom w:val="none" w:sz="0" w:space="0" w:color="auto"/>
+        <w:right w:val="none" w:sz="0" w:space="0" w:color="auto"/>
+      </w:divBdr>
+      <w:divsChild>
+        <w:div w:id="586963282">
+          <w:marLeft w:val="0"/>
+          <w:marRight w:val="0"/>
+          <w:marTop w:val="0"/>
+          <w:marBottom w:val="0"/>
+          <w:divBdr>
+            <w:top w:val="none" w:sz="0" w:space="0" w:color="auto"/>
+            <w:left w:val="none" w:sz="0" w:space="0" w:color="auto"/>
+            <w:bottom w:val="none" w:sz="0" w:space="0" w:color="auto"/>
+            <w:right w:val="none" w:sz="0" w:space="0" w:color="auto"/>
+          </w:divBdr>
+          <w:divsChild>
+            <w:div w:id="1250772564">
+              <w:marLeft w:val="0"/>
+              <w:marRight w:val="0"/>
+              <w:marTop w:val="0"/>
+              <w:marBottom w:val="0"/>
+              <w:divBdr>
+                <w:top w:val="none" w:sz="0" w:space="0" w:color="auto"/>
+                <w:left w:val="none" w:sz="0" w:space="0" w:color="auto"/>
+                <w:bottom w:val="none" w:sz="0" w:space="0" w:color="auto"/>
+                <w:right w:val="none" w:sz="0" w:space="0" w:color="auto"/>
+              </w:divBdr>
+            </w:div>
+          </w:divsChild>
+        </w:div>
+      </w:divsChild>
+    </w:div>
+    <w:div w:id="1245727137">
+      <w:bodyDiv w:val="1"/>
+      <w:marLeft w:val="0"/>
+      <w:marRight w:val="0"/>
+      <w:marTop w:val="0"/>
+      <w:marBottom w:val="0"/>
+      <w:divBdr>
+        <w:top w:val="none" w:sz="0" w:space="0" w:color="auto"/>
+        <w:left w:val="none" w:sz="0" w:space="0" w:color="auto"/>
+        <w:bottom w:val="none" w:sz="0" w:space="0" w:color="auto"/>
+        <w:right w:val="none" w:sz="0" w:space="0" w:color="auto"/>
+      </w:divBdr>
+      <w:divsChild>
+        <w:div w:id="1099717947">
+          <w:marLeft w:val="0"/>
+          <w:marRight w:val="0"/>
+          <w:marTop w:val="0"/>
+          <w:marBottom w:val="0"/>
+          <w:divBdr>
+            <w:top w:val="none" w:sz="0" w:space="0" w:color="auto"/>
+            <w:left w:val="none" w:sz="0" w:space="0" w:color="auto"/>
+            <w:bottom w:val="none" w:sz="0" w:space="0" w:color="auto"/>
+            <w:right w:val="none" w:sz="0" w:space="0" w:color="auto"/>
+          </w:divBdr>
+          <w:divsChild>
+            <w:div w:id="1577857212">
+              <w:marLeft w:val="0"/>
+              <w:marRight w:val="0"/>
+              <w:marTop w:val="0"/>
+              <w:marBottom w:val="0"/>
+              <w:divBdr>
+                <w:top w:val="none" w:sz="0" w:space="0" w:color="auto"/>
+                <w:left w:val="none" w:sz="0" w:space="0" w:color="auto"/>
+                <w:bottom w:val="none" w:sz="0" w:space="0" w:color="auto"/>
+                <w:right w:val="none" w:sz="0" w:space="0" w:color="auto"/>
+              </w:divBdr>
+            </w:div>
+          </w:divsChild>
+        </w:div>
+      </w:divsChild>
+    </w:div>
+    <w:div w:id="1394425856">
+      <w:bodyDiv w:val="1"/>
+      <w:marLeft w:val="0"/>
+      <w:marRight w:val="0"/>
+      <w:marTop w:val="0"/>
+      <w:marBottom w:val="0"/>
+      <w:divBdr>
+        <w:top w:val="none" w:sz="0" w:space="0" w:color="auto"/>
+        <w:left w:val="none" w:sz="0" w:space="0" w:color="auto"/>
+        <w:bottom w:val="none" w:sz="0" w:space="0" w:color="auto"/>
+        <w:right w:val="none" w:sz="0" w:space="0" w:color="auto"/>
+      </w:divBdr>
+      <w:divsChild>
+        <w:div w:id="1876311567">
+          <w:marLeft w:val="0"/>
+          <w:marRight w:val="0"/>
+          <w:marTop w:val="0"/>
+          <w:marBottom w:val="0"/>
+          <w:divBdr>
+            <w:top w:val="none" w:sz="0" w:space="0" w:color="auto"/>
+            <w:left w:val="none" w:sz="0" w:space="0" w:color="auto"/>
+            <w:bottom w:val="none" w:sz="0" w:space="0" w:color="auto"/>
+            <w:right w:val="none" w:sz="0" w:space="0" w:color="auto"/>
+          </w:divBdr>
+          <w:divsChild>
+            <w:div w:id="1875969274">
+              <w:marLeft w:val="0"/>
+              <w:marRight w:val="0"/>
+              <w:marTop w:val="0"/>
+              <w:marBottom w:val="0"/>
+              <w:divBdr>
+                <w:top w:val="none" w:sz="0" w:space="0" w:color="auto"/>
+                <w:left w:val="none" w:sz="0" w:space="0" w:color="auto"/>
+                <w:bottom w:val="none" w:sz="0" w:space="0" w:color="auto"/>
+                <w:right w:val="none" w:sz="0" w:space="0" w:color="auto"/>
+              </w:divBdr>
+            </w:div>
+          </w:divsChild>
+        </w:div>
+      </w:divsChild>
+    </w:div>
+    <w:div w:id="1434549372">
+      <w:bodyDiv w:val="1"/>
+      <w:marLeft w:val="0"/>
+      <w:marRight w:val="0"/>
+      <w:marTop w:val="0"/>
+      <w:marBottom w:val="0"/>
+      <w:divBdr>
+        <w:top w:val="none" w:sz="0" w:space="0" w:color="auto"/>
+        <w:left w:val="none" w:sz="0" w:space="0" w:color="auto"/>
+        <w:bottom w:val="none" w:sz="0" w:space="0" w:color="auto"/>
+        <w:right w:val="none" w:sz="0" w:space="0" w:color="auto"/>
+      </w:divBdr>
+      <w:divsChild>
+        <w:div w:id="1365402633">
+          <w:marLeft w:val="0"/>
+          <w:marRight w:val="0"/>
+          <w:marTop w:val="0"/>
+          <w:marBottom w:val="0"/>
+          <w:divBdr>
+            <w:top w:val="none" w:sz="0" w:space="0" w:color="auto"/>
+            <w:left w:val="none" w:sz="0" w:space="0" w:color="auto"/>
+            <w:bottom w:val="none" w:sz="0" w:space="0" w:color="auto"/>
+            <w:right w:val="none" w:sz="0" w:space="0" w:color="auto"/>
+          </w:divBdr>
+          <w:divsChild>
+            <w:div w:id="1012992953">
+              <w:marLeft w:val="0"/>
+              <w:marRight w:val="0"/>
+              <w:marTop w:val="0"/>
+              <w:marBottom w:val="0"/>
+              <w:divBdr>
+                <w:top w:val="none" w:sz="0" w:space="0" w:color="auto"/>
+                <w:left w:val="none" w:sz="0" w:space="0" w:color="auto"/>
+                <w:bottom w:val="none" w:sz="0" w:space="0" w:color="auto"/>
+                <w:right w:val="none" w:sz="0" w:space="0" w:color="auto"/>
+              </w:divBdr>
+            </w:div>
+          </w:divsChild>
+        </w:div>
+      </w:divsChild>
+    </w:div>
+    <w:div w:id="1594362773">
+      <w:bodyDiv w:val="1"/>
+      <w:marLeft w:val="0"/>
+      <w:marRight w:val="0"/>
+      <w:marTop w:val="0"/>
+      <w:marBottom w:val="0"/>
+      <w:divBdr>
+        <w:top w:val="none" w:sz="0" w:space="0" w:color="auto"/>
+        <w:left w:val="none" w:sz="0" w:space="0" w:color="auto"/>
+        <w:bottom w:val="none" w:sz="0" w:space="0" w:color="auto"/>
+        <w:right w:val="none" w:sz="0" w:space="0" w:color="auto"/>
+      </w:divBdr>
+      <w:divsChild>
+        <w:div w:id="787043023">
+          <w:marLeft w:val="0"/>
+          <w:marRight w:val="0"/>
+          <w:marTop w:val="0"/>
+          <w:marBottom w:val="0"/>
+          <w:divBdr>
+            <w:top w:val="none" w:sz="0" w:space="0" w:color="auto"/>
+            <w:left w:val="none" w:sz="0" w:space="0" w:color="auto"/>
+            <w:bottom w:val="none" w:sz="0" w:space="0" w:color="auto"/>
+            <w:right w:val="none" w:sz="0" w:space="0" w:color="auto"/>
+          </w:divBdr>
+          <w:divsChild>
+            <w:div w:id="616064322">
+              <w:marLeft w:val="0"/>
+              <w:marRight w:val="0"/>
+              <w:marTop w:val="0"/>
+              <w:marBottom w:val="0"/>
+              <w:divBdr>
+                <w:top w:val="none" w:sz="0" w:space="0" w:color="auto"/>
+                <w:left w:val="none" w:sz="0" w:space="0" w:color="auto"/>
+                <w:bottom w:val="none" w:sz="0" w:space="0" w:color="auto"/>
+                <w:right w:val="none" w:sz="0" w:space="0" w:color="auto"/>
+              </w:divBdr>
+            </w:div>
+          </w:divsChild>
+        </w:div>
+      </w:divsChild>
+    </w:div>
+    <w:div w:id="1731539819">
+      <w:bodyDiv w:val="1"/>
+      <w:marLeft w:val="0"/>
+      <w:marRight w:val="0"/>
+      <w:marTop w:val="0"/>
+      <w:marBottom w:val="0"/>
+      <w:divBdr>
+        <w:top w:val="none" w:sz="0" w:space="0" w:color="auto"/>
+        <w:left w:val="none" w:sz="0" w:space="0" w:color="auto"/>
+        <w:bottom w:val="none" w:sz="0" w:space="0" w:color="auto"/>
+        <w:right w:val="none" w:sz="0" w:space="0" w:color="auto"/>
+      </w:divBdr>
+      <w:divsChild>
+        <w:div w:id="573318436">
+          <w:marLeft w:val="0"/>
+          <w:marRight w:val="0"/>
+          <w:marTop w:val="0"/>
+          <w:marBottom w:val="0"/>
+          <w:divBdr>
+            <w:top w:val="none" w:sz="0" w:space="0" w:color="auto"/>
+            <w:left w:val="none" w:sz="0" w:space="0" w:color="auto"/>
+            <w:bottom w:val="none" w:sz="0" w:space="0" w:color="auto"/>
+            <w:right w:val="none" w:sz="0" w:space="0" w:color="auto"/>
+          </w:divBdr>
+          <w:divsChild>
+            <w:div w:id="1919750897">
+              <w:marLeft w:val="0"/>
+              <w:marRight w:val="0"/>
+              <w:marTop w:val="0"/>
+              <w:marBottom w:val="0"/>
+              <w:divBdr>
+                <w:top w:val="none" w:sz="0" w:space="0" w:color="auto"/>
+                <w:left w:val="none" w:sz="0" w:space="0" w:color="auto"/>
+                <w:bottom w:val="none" w:sz="0" w:space="0" w:color="auto"/>
+                <w:right w:val="none" w:sz="0" w:space="0" w:color="auto"/>
+              </w:divBdr>
+            </w:div>
+          </w:divsChild>
+        </w:div>
+      </w:divsChild>
+    </w:div>
+  </w:divs>
+  <w:optimizeForBrowser/>
+  <w:relyOnVML/>
+  <w:allowPNG/>
+</w:webSettings>
 </file>
</xml_diff>

<commit_message>
fix: reparación quirúrgica de XML para etiquetas de grados escolares
</commit_message>
<xml_diff>
--- a/public/templates/FORMATO HOJA DE VIDA FHISYL.docx
+++ b/public/templates/FORMATO HOJA DE VIDA FHISYL.docx
@@ -1950,7 +1950,7 @@
               <w:rPr>
                 <w:szCs w:val="26"/>
               </w:rPr>
-              <w:t>_grado}</w:t>
+              <w:t/>
             </w:r>
           </w:p>
         </w:tc>
@@ -1982,7 +1982,7 @@
               <w:rPr>
                 <w:szCs w:val="26"/>
               </w:rPr>
-              <w:t>_grado}</w:t>
+              <w:t/>
             </w:r>
           </w:p>
         </w:tc>
@@ -2015,7 +2015,7 @@
               <w:rPr>
                 <w:szCs w:val="26"/>
               </w:rPr>
-              <w:t>_grado}</w:t>
+              <w:t/>
             </w:r>
           </w:p>
         </w:tc>
@@ -2036,7 +2036,7 @@
               <w:rPr>
                 <w:szCs w:val="26"/>
               </w:rPr>
-              <w:t>{_grado}</w:t>
+              <w:t>{</w:t>
             </w:r>
             <w:r>
               <w:rPr>
@@ -2080,7 +2080,7 @@
               <w:rPr>
                 <w:szCs w:val="26"/>
               </w:rPr>
-              <w:t>_grado}</w:t>
+              <w:t/>
             </w:r>
           </w:p>
         </w:tc>
@@ -2111,7 +2111,7 @@
               <w:rPr>
                 <w:szCs w:val="26"/>
               </w:rPr>
-              <w:t>_grado}</w:t>
+              <w:t/>
             </w:r>
           </w:p>
         </w:tc>
@@ -2142,7 +2142,7 @@
               <w:rPr>
                 <w:szCs w:val="26"/>
               </w:rPr>
-              <w:t>_grado}</w:t>
+              <w:t/>
             </w:r>
           </w:p>
         </w:tc>
@@ -2174,7 +2174,7 @@
               <w:rPr>
                 <w:szCs w:val="26"/>
               </w:rPr>
-              <w:t>_grado}</w:t>
+              <w:t/>
             </w:r>
           </w:p>
         </w:tc>
@@ -2205,7 +2205,7 @@
               <w:rPr>
                 <w:szCs w:val="26"/>
               </w:rPr>
-              <w:t>_grado}</w:t>
+              <w:t/>
             </w:r>
           </w:p>
         </w:tc>
@@ -2238,7 +2238,7 @@
               <w:rPr>
                 <w:szCs w:val="26"/>
               </w:rPr>
-              <w:t>_grado}</w:t>
+              <w:t/>
             </w:r>
           </w:p>
         </w:tc>
@@ -2272,7 +2272,7 @@
               <w:rPr>
                 <w:szCs w:val="26"/>
               </w:rPr>
-              <w:t>_grado}</w:t>
+              <w:t/>
             </w:r>
           </w:p>
         </w:tc>
@@ -7853,7 +7853,7 @@
                 <w:szCs w:val="26"/>
                 <w:lang w:val="en-US"/>
               </w:rPr>
-              <w:t>{academia_4}</w:t>
+              <w:t>{academia_{4_grado}</w:t>
             </w:r>
           </w:p>
         </w:tc>
@@ -7879,7 +7879,7 @@
                 <w:szCs w:val="26"/>
                 <w:lang w:val="es-MX"/>
               </w:rPr>
-              <w:t>{titulo_obtenido4}</w:t>
+              <w:t>{titulo_obtenido{4_grado}</w:t>
             </w:r>
           </w:p>
         </w:tc>
@@ -7905,7 +7905,7 @@
                 <w:szCs w:val="26"/>
                 <w:lang w:val="es-MX"/>
               </w:rPr>
-              <w:t>{intensidad_horaria4}</w:t>
+              <w:t>{intensidad_horaria{4_grado}</w:t>
             </w:r>
           </w:p>
         </w:tc>
@@ -7931,7 +7931,7 @@
                 <w:szCs w:val="26"/>
                 <w:lang w:val="es-MX"/>
               </w:rPr>
-              <w:t>{añoTaller4}</w:t>
+              <w:t>{añoTaller{4_grado}</w:t>
             </w:r>
           </w:p>
         </w:tc>

</xml_diff>

<commit_message>
fix: limpieza final de mapeo de tags y unificación con sistema robusto alfanumérico
</commit_message>
<xml_diff>
--- a/public/templates/FORMATO HOJA DE VIDA FHISYL.docx
+++ b/public/templates/FORMATO HOJA DE VIDA FHISYL.docx
@@ -1,64 +1,5 @@
 
-<file path=customXml\item1.xml><?xml version="1.0" encoding="utf-8"?>
-<b:Sources xmlns:b="http://schemas.openxmlformats.org/officeDocument/2006/bibliography" xmlns="http://schemas.openxmlformats.org/officeDocument/2006/bibliography" SelectedStyle="\APASixthEditionOfficeOnline.xsl" StyleName="APA" Version="6"/>
-</file>
-
-<file path=customXml\itemProps1.xml><?xml version="1.0" encoding="utf-8"?>
-<ds:datastoreItem xmlns:ds="http://schemas.openxmlformats.org/officeDocument/2006/customXml" ds:itemID="{8E6929E9-498A-4D52-8CB7-117FBBBB5CE7}">
-  <ds:schemaRefs>
-    <ds:schemaRef ds:uri="http://schemas.openxmlformats.org/officeDocument/2006/bibliography"/>
-  </ds:schemaRefs>
-</ds:datastoreItem>
-</file>
-
-<file path=docProps\app.xml><?xml version="1.0" encoding="utf-8"?>
-<Properties xmlns="http://schemas.openxmlformats.org/officeDocument/2006/extended-properties" xmlns:vt="http://schemas.openxmlformats.org/officeDocument/2006/docPropsVTypes">
-  <Template>Normal.dotm</Template>
-  <TotalTime>69</TotalTime>
-  <Pages>6</Pages>
-  <Words>763</Words>
-  <Characters>4198</Characters>
-  <Application>Microsoft Office Word</Application>
-  <DocSecurity>0</DocSecurity>
-  <Lines>34</Lines>
-  <Paragraphs>9</Paragraphs>
-  <ScaleCrop>false</ScaleCrop>
-  <HeadingPairs>
-    <vt:vector size="2" baseType="variant">
-      <vt:variant>
-        <vt:lpstr>Título</vt:lpstr>
-      </vt:variant>
-      <vt:variant>
-        <vt:i4>1</vt:i4>
-      </vt:variant>
-    </vt:vector>
-  </HeadingPairs>
-  <TitlesOfParts>
-    <vt:vector size="1" baseType="lpstr">
-      <vt:lpstr/>
-    </vt:vector>
-  </TitlesOfParts>
-  <Company/>
-  <LinksUpToDate>false</LinksUpToDate>
-  <CharactersWithSpaces>4952</CharactersWithSpaces>
-  <SharedDoc>false</SharedDoc>
-  <HyperlinksChanged>false</HyperlinksChanged>
-  <AppVersion>16.0000</AppVersion>
-</Properties>
-</file>
-
-<file path=docProps\core.xml><?xml version="1.0" encoding="utf-8"?>
-<cp:coreProperties xmlns:cp="http://schemas.openxmlformats.org/package/2006/metadata/core-properties" xmlns:dc="http://purl.org/dc/elements/1.1/" xmlns:dcterms="http://purl.org/dc/terms/" xmlns:dcmitype="http://purl.org/dc/dcmitype/" xmlns:xsi="http://www.w3.org/2001/XMLSchema-instance">
-  <dc:creator>Tania Varela Pedroza</dc:creator>
-  <cp:lastModifiedBy>Nahuel Jiménez</cp:lastModifiedBy>
-  <cp:revision>18</cp:revision>
-  <cp:lastPrinted>2022-08-04T17:05:00Z</cp:lastPrinted>
-  <dcterms:created xsi:type="dcterms:W3CDTF">2025-04-25T18:31:00Z</dcterms:created>
-  <dcterms:modified xsi:type="dcterms:W3CDTF">2026-03-19T21:57:00Z</dcterms:modified>
-</cp:coreProperties>
-</file>
-
-<file path=word\document.xml><?xml version="1.0" encoding="utf-8"?>
+<file path=word/document.xml><?xml version="1.0" encoding="utf-8"?>
 <w:document xmlns:wpc="http://schemas.microsoft.com/office/word/2010/wordprocessingCanvas" xmlns:cx="http://schemas.microsoft.com/office/drawing/2014/chartex" xmlns:cx1="http://schemas.microsoft.com/office/drawing/2015/9/8/chartex" xmlns:cx2="http://schemas.microsoft.com/office/drawing/2015/10/21/chartex" xmlns:cx3="http://schemas.microsoft.com/office/drawing/2016/5/9/chartex" xmlns:cx4="http://schemas.microsoft.com/office/drawing/2016/5/10/chartex" xmlns:cx5="http://schemas.microsoft.com/office/drawing/2016/5/11/chartex" xmlns:cx6="http://schemas.microsoft.com/office/drawing/2016/5/12/chartex" xmlns:cx7="http://schemas.microsoft.com/office/drawing/2016/5/13/chartex" xmlns:cx8="http://schemas.microsoft.com/office/drawing/2016/5/14/chartex" xmlns:mc="http://schemas.openxmlformats.org/markup-compatibility/2006" xmlns:aink="http://schemas.microsoft.com/office/drawing/2016/ink" xmlns:am3d="http://schemas.microsoft.com/office/drawing/2017/model3d" xmlns:o="urn:schemas-microsoft-com:office:office" xmlns:oel="http://schemas.microsoft.com/office/2019/extlst" xmlns:r="http://schemas.openxmlformats.org/officeDocument/2006/relationships" xmlns:m="http://schemas.openxmlformats.org/officeDocument/2006/math" xmlns:v="urn:schemas-microsoft-com:vml" xmlns:wp14="http://schemas.microsoft.com/office/word/2010/wordprocessingDrawing" xmlns:wp="http://schemas.openxmlformats.org/drawingml/2006/wordprocessingDrawing" xmlns:w10="urn:schemas-microsoft-com:office:word" xmlns:w="http://schemas.openxmlformats.org/wordprocessingml/2006/main" xmlns:w14="http://schemas.microsoft.com/office/word/2010/wordml" xmlns:w15="http://schemas.microsoft.com/office/word/2012/wordml" xmlns:w16cex="http://schemas.microsoft.com/office/word/2018/wordml/cex" xmlns:w16cid="http://schemas.microsoft.com/office/word/2016/wordml/cid" xmlns:w16="http://schemas.microsoft.com/office/word/2018/wordml" xmlns:w16sdtdh="http://schemas.microsoft.com/office/word/2020/wordml/sdtdatahash" xmlns:w16se="http://schemas.microsoft.com/office/word/2015/wordml/symex" xmlns:wpg="http://schemas.microsoft.com/office/word/2010/wordprocessingGroup" xmlns:wpi="http://schemas.microsoft.com/office/word/2010/wordprocessingInk" xmlns:wne="http://schemas.microsoft.com/office/word/2006/wordml" xmlns:wps="http://schemas.microsoft.com/office/word/2010/wordprocessingShape" mc:Ignorable="w14 w15 w16se w16cid w16 w16cex w16sdtdh wp14">
   <w:body>
     <w:p>
@@ -131,7 +72,7 @@
                             </w:r>
                             <w:proofErr w:type="spellStart"/>
                             <w:r>
-                              <w:t>foto_perfil</w:t>
+                              <w:t>fotoUser</w:t>
                             </w:r>
                             <w:proofErr w:type="spellEnd"/>
                             <w:r>
@@ -170,7 +111,7 @@
                       </w:r>
                       <w:proofErr w:type="spellStart"/>
                       <w:r>
-                        <w:t>foto_perfil</w:t>
+                        <w:t>fotoUser</w:t>
                       </w:r>
                       <w:proofErr w:type="spellEnd"/>
                       <w:r>
@@ -255,22 +196,7 @@
                             </w:r>
                             <w:proofErr w:type="spellStart"/>
                             <w:r>
-                              <w:rPr>
-                                <w:lang w:val="es-CO"/>
-                              </w:rPr>
-                              <w:t>descripci</w:t>
-                            </w:r>
-                            <w:r>
-                              <w:rPr>
-                                <w:lang w:val="es-CO"/>
-                              </w:rPr>
-                              <w:t>o</w:t>
-                            </w:r>
-                            <w:r>
-                              <w:rPr>
-                                <w:lang w:val="es-CO"/>
-                              </w:rPr>
-                              <w:t>nMinisterioProfesion</w:t>
+                              <w:t>descripMain</w:t>
                             </w:r>
                             <w:proofErr w:type="spellEnd"/>
                             <w:r>
@@ -317,22 +243,7 @@
                       </w:r>
                       <w:proofErr w:type="spellStart"/>
                       <w:r>
-                        <w:rPr>
-                          <w:lang w:val="es-CO"/>
-                        </w:rPr>
-                        <w:t>descripci</w:t>
-                      </w:r>
-                      <w:r>
-                        <w:rPr>
-                          <w:lang w:val="es-CO"/>
-                        </w:rPr>
-                        <w:t>o</w:t>
-                      </w:r>
-                      <w:r>
-                        <w:rPr>
-                          <w:lang w:val="es-CO"/>
-                        </w:rPr>
-                        <w:t>nMinisterioProfesion</w:t>
+                        <w:t>descripMain</w:t>
                       </w:r>
                       <w:proofErr w:type="spellEnd"/>
                       <w:r>
@@ -1944,13 +1855,13 @@
               <w:rPr>
                 <w:szCs w:val="26"/>
               </w:rPr>
-              <w:t>1</w:t>
-            </w:r>
-            <w:r>
-              <w:rPr>
-                <w:szCs w:val="26"/>
-              </w:rPr>
-              <w:t/>
+              <w:t>grado1</w:t>
+            </w:r>
+            <w:r>
+              <w:rPr>
+                <w:szCs w:val="26"/>
+              </w:rPr>
+              <w:t>}</w:t>
             </w:r>
           </w:p>
         </w:tc>
@@ -1976,13 +1887,13 @@
               <w:rPr>
                 <w:szCs w:val="26"/>
               </w:rPr>
-              <w:t>2</w:t>
-            </w:r>
-            <w:r>
-              <w:rPr>
-                <w:szCs w:val="26"/>
-              </w:rPr>
-              <w:t/>
+              <w:t>grado2</w:t>
+            </w:r>
+            <w:r>
+              <w:rPr>
+                <w:szCs w:val="26"/>
+              </w:rPr>
+              <w:t>}</w:t>
             </w:r>
           </w:p>
         </w:tc>
@@ -2009,13 +1920,25 @@
               <w:rPr>
                 <w:szCs w:val="26"/>
               </w:rPr>
+              <w:t>grad</w:t>
+            </w:r>
+            <w:r>
+              <w:rPr>
+                <w:szCs w:val="26"/>
+              </w:rPr>
+              <w:t>o</w:t>
+            </w:r>
+            <w:r>
+              <w:rPr>
+                <w:szCs w:val="26"/>
+              </w:rPr>
               <w:t>3</w:t>
             </w:r>
             <w:r>
               <w:rPr>
                 <w:szCs w:val="26"/>
               </w:rPr>
-              <w:t/>
+              <w:t>}</w:t>
             </w:r>
           </w:p>
         </w:tc>
@@ -2042,6 +1965,18 @@
               <w:rPr>
                 <w:szCs w:val="26"/>
               </w:rPr>
+              <w:t>grad</w:t>
+            </w:r>
+            <w:r>
+              <w:rPr>
+                <w:szCs w:val="26"/>
+              </w:rPr>
+              <w:t>o</w:t>
+            </w:r>
+            <w:r>
+              <w:rPr>
+                <w:szCs w:val="26"/>
+              </w:rPr>
               <w:t>4</w:t>
             </w:r>
             <w:r>
@@ -2074,13 +2009,25 @@
               <w:rPr>
                 <w:szCs w:val="26"/>
               </w:rPr>
+              <w:t>grad</w:t>
+            </w:r>
+            <w:r>
+              <w:rPr>
+                <w:szCs w:val="26"/>
+              </w:rPr>
+              <w:t>o</w:t>
+            </w:r>
+            <w:r>
+              <w:rPr>
+                <w:szCs w:val="26"/>
+              </w:rPr>
               <w:t>5</w:t>
             </w:r>
             <w:r>
               <w:rPr>
                 <w:szCs w:val="26"/>
               </w:rPr>
-              <w:t/>
+              <w:t>}</w:t>
             </w:r>
           </w:p>
         </w:tc>
@@ -2099,19 +2046,7 @@
               <w:rPr>
                 <w:szCs w:val="26"/>
               </w:rPr>
-              <w:t>{</w:t>
-            </w:r>
-            <w:r>
-              <w:rPr>
-                <w:szCs w:val="26"/>
-              </w:rPr>
-              <w:t>6</w:t>
-            </w:r>
-            <w:r>
-              <w:rPr>
-                <w:szCs w:val="26"/>
-              </w:rPr>
-              <w:t/>
+              <w:t>{grado6}</w:t>
             </w:r>
           </w:p>
         </w:tc>
@@ -2130,19 +2065,7 @@
               <w:rPr>
                 <w:szCs w:val="26"/>
               </w:rPr>
-              <w:t>{</w:t>
-            </w:r>
-            <w:r>
-              <w:rPr>
-                <w:szCs w:val="26"/>
-              </w:rPr>
-              <w:t>7</w:t>
-            </w:r>
-            <w:r>
-              <w:rPr>
-                <w:szCs w:val="26"/>
-              </w:rPr>
-              <w:t/>
+              <w:t>{grado7}</w:t>
             </w:r>
           </w:p>
         </w:tc>
@@ -2162,19 +2085,7 @@
               <w:rPr>
                 <w:szCs w:val="26"/>
               </w:rPr>
-              <w:t>{</w:t>
-            </w:r>
-            <w:r>
-              <w:rPr>
-                <w:szCs w:val="26"/>
-              </w:rPr>
-              <w:t>8</w:t>
-            </w:r>
-            <w:r>
-              <w:rPr>
-                <w:szCs w:val="26"/>
-              </w:rPr>
-              <w:t/>
+              <w:t>{grado8}</w:t>
             </w:r>
           </w:p>
         </w:tc>
@@ -2193,19 +2104,7 @@
               <w:rPr>
                 <w:szCs w:val="26"/>
               </w:rPr>
-              <w:t>{</w:t>
-            </w:r>
-            <w:r>
-              <w:rPr>
-                <w:szCs w:val="26"/>
-              </w:rPr>
-              <w:t>9</w:t>
-            </w:r>
-            <w:r>
-              <w:rPr>
-                <w:szCs w:val="26"/>
-              </w:rPr>
-              <w:t/>
+              <w:t>{grado9}</w:t>
             </w:r>
           </w:p>
         </w:tc>
@@ -2226,19 +2125,7 @@
               <w:rPr>
                 <w:szCs w:val="26"/>
               </w:rPr>
-              <w:t>{</w:t>
-            </w:r>
-            <w:r>
-              <w:rPr>
-                <w:szCs w:val="26"/>
-              </w:rPr>
-              <w:t>10</w:t>
-            </w:r>
-            <w:r>
-              <w:rPr>
-                <w:szCs w:val="26"/>
-              </w:rPr>
-              <w:t/>
+              <w:t>{grado10}</w:t>
             </w:r>
           </w:p>
         </w:tc>
@@ -2260,19 +2147,7 @@
               <w:rPr>
                 <w:szCs w:val="26"/>
               </w:rPr>
-              <w:t>{</w:t>
-            </w:r>
-            <w:r>
-              <w:rPr>
-                <w:szCs w:val="26"/>
-              </w:rPr>
-              <w:t>11</w:t>
-            </w:r>
-            <w:r>
-              <w:rPr>
-                <w:szCs w:val="26"/>
-              </w:rPr>
-              <w:t/>
+              <w:t>{grado11}</w:t>
             </w:r>
           </w:p>
         </w:tc>
@@ -2924,7 +2799,6 @@
                 <w:szCs w:val="28"/>
                 <w:lang w:val="es-CO"/>
               </w:rPr>
-              <w:lastRenderedPageBreak/>
               <w:t>{numero_aprobado_1}</w:t>
             </w:r>
           </w:p>
@@ -3035,6 +2909,7 @@
                 <w:szCs w:val="28"/>
                 <w:lang w:val="es-CO"/>
               </w:rPr>
+              <w:lastRenderedPageBreak/>
               <w:t>{numero_aprobado_</w:t>
             </w:r>
             <w:r>
@@ -4551,6 +4426,7 @@
                 <w:lang w:val="es-CO"/>
               </w:rPr>
             </w:pPr>
+            <w:proofErr w:type="gramStart"/>
             <w:r>
               <w:rPr>
                 <w:rFonts w:asciiTheme="majorHAnsi" w:hAnsiTheme="majorHAnsi" w:cs="Arial"/>
@@ -4570,6 +4446,7 @@
               <w:t>{</w:t>
             </w:r>
             <w:proofErr w:type="spellStart"/>
+            <w:proofErr w:type="gramEnd"/>
             <w:r>
               <w:rPr>
                 <w:rFonts w:asciiTheme="majorHAnsi" w:hAnsiTheme="majorHAnsi" w:cs="Arial"/>
@@ -4718,6 +4595,7 @@
                 <w:lang w:val="es-CO"/>
               </w:rPr>
             </w:pPr>
+            <w:proofErr w:type="gramStart"/>
             <w:r>
               <w:rPr>
                 <w:rFonts w:asciiTheme="majorHAnsi" w:hAnsiTheme="majorHAnsi" w:cs="Arial"/>
@@ -4737,6 +4615,7 @@
               <w:t>{</w:t>
             </w:r>
             <w:proofErr w:type="spellStart"/>
+            <w:proofErr w:type="gramEnd"/>
             <w:r>
               <w:rPr>
                 <w:rFonts w:asciiTheme="majorHAnsi" w:hAnsiTheme="majorHAnsi" w:cs="Arial"/>
@@ -5588,6 +5467,7 @@
                 <w:lang w:val="es-CO"/>
               </w:rPr>
             </w:pPr>
+            <w:proofErr w:type="gramStart"/>
             <w:r>
               <w:rPr>
                 <w:rFonts w:asciiTheme="majorHAnsi" w:hAnsiTheme="majorHAnsi" w:cs="Arial"/>
@@ -5604,7 +5484,17 @@
                 <w:szCs w:val="26"/>
                 <w:lang w:val="es-CO"/>
               </w:rPr>
-              <w:t>{dia_inicio2}</w:t>
+              <w:t>{</w:t>
+            </w:r>
+            <w:proofErr w:type="gramEnd"/>
+            <w:r>
+              <w:rPr>
+                <w:rFonts w:asciiTheme="majorHAnsi" w:hAnsiTheme="majorHAnsi" w:cs="Arial"/>
+                <w:sz w:val="20"/>
+                <w:szCs w:val="26"/>
+                <w:lang w:val="es-CO"/>
+              </w:rPr>
+              <w:t>dia_inicio2}</w:t>
             </w:r>
             <w:r>
               <w:rPr>
@@ -5695,6 +5585,7 @@
                 <w:lang w:val="es-CO"/>
               </w:rPr>
             </w:pPr>
+            <w:proofErr w:type="gramStart"/>
             <w:r>
               <w:rPr>
                 <w:rFonts w:asciiTheme="majorHAnsi" w:hAnsiTheme="majorHAnsi" w:cs="Arial"/>
@@ -5711,7 +5602,17 @@
                 <w:szCs w:val="26"/>
                 <w:lang w:val="es-CO"/>
               </w:rPr>
-              <w:t>{dia_fin2}</w:t>
+              <w:t>{</w:t>
+            </w:r>
+            <w:proofErr w:type="gramEnd"/>
+            <w:r>
+              <w:rPr>
+                <w:rFonts w:asciiTheme="majorHAnsi" w:hAnsiTheme="majorHAnsi" w:cs="Arial"/>
+                <w:sz w:val="20"/>
+                <w:szCs w:val="26"/>
+                <w:lang w:val="es-CO"/>
+              </w:rPr>
+              <w:t>dia_fin2}</w:t>
             </w:r>
             <w:r>
               <w:rPr>
@@ -6473,6 +6374,7 @@
                 <w:lang w:val="es-CO"/>
               </w:rPr>
             </w:pPr>
+            <w:proofErr w:type="gramStart"/>
             <w:r>
               <w:rPr>
                 <w:rFonts w:asciiTheme="majorHAnsi" w:hAnsiTheme="majorHAnsi" w:cs="Arial"/>
@@ -6480,7 +6382,17 @@
                 <w:szCs w:val="20"/>
                 <w:lang w:val="es-CO"/>
               </w:rPr>
-              <w:t>DIA:{dia_inicio3}      MES:{mes_inicio3}       AÑO:{año_inicio3}</w:t>
+              <w:t>DIA:{</w:t>
+            </w:r>
+            <w:proofErr w:type="gramEnd"/>
+            <w:r>
+              <w:rPr>
+                <w:rFonts w:asciiTheme="majorHAnsi" w:hAnsiTheme="majorHAnsi" w:cs="Arial"/>
+                <w:sz w:val="20"/>
+                <w:szCs w:val="20"/>
+                <w:lang w:val="es-CO"/>
+              </w:rPr>
+              <w:t>dia_inicio3}      MES:{mes_inicio3}       AÑO:{año_inicio3}</w:t>
             </w:r>
           </w:p>
         </w:tc>
@@ -6526,6 +6438,7 @@
                 <w:lang w:val="es-CO"/>
               </w:rPr>
             </w:pPr>
+            <w:proofErr w:type="gramStart"/>
             <w:r>
               <w:rPr>
                 <w:rFonts w:asciiTheme="majorHAnsi" w:hAnsiTheme="majorHAnsi" w:cs="Arial"/>
@@ -6533,7 +6446,17 @@
                 <w:szCs w:val="20"/>
                 <w:lang w:val="es-CO"/>
               </w:rPr>
-              <w:t>DIA:{dia_fin3}       MES:{mes_fin3}        AÑO:{año_fin3}</w:t>
+              <w:t>DIA:{</w:t>
+            </w:r>
+            <w:proofErr w:type="gramEnd"/>
+            <w:r>
+              <w:rPr>
+                <w:rFonts w:asciiTheme="majorHAnsi" w:hAnsiTheme="majorHAnsi" w:cs="Arial"/>
+                <w:sz w:val="20"/>
+                <w:szCs w:val="20"/>
+                <w:lang w:val="es-CO"/>
+              </w:rPr>
+              <w:t>dia_fin3}       MES:{mes_fin3}        AÑO:{año_fin3}</w:t>
             </w:r>
           </w:p>
         </w:tc>
@@ -7853,7 +7776,7 @@
                 <w:szCs w:val="26"/>
                 <w:lang w:val="en-US"/>
               </w:rPr>
-              <w:t>{academia_{4_grado}</w:t>
+              <w:t>{academia_4}</w:t>
             </w:r>
           </w:p>
         </w:tc>
@@ -7879,7 +7802,7 @@
                 <w:szCs w:val="26"/>
                 <w:lang w:val="es-MX"/>
               </w:rPr>
-              <w:t>{titulo_obtenido{4_grado}</w:t>
+              <w:t>{titulo_obtenido4}</w:t>
             </w:r>
           </w:p>
         </w:tc>
@@ -7905,7 +7828,7 @@
                 <w:szCs w:val="26"/>
                 <w:lang w:val="es-MX"/>
               </w:rPr>
-              <w:t>{intensidad_horaria{4_grado}</w:t>
+              <w:t>{intensidad_horaria4}</w:t>
             </w:r>
           </w:p>
         </w:tc>
@@ -7931,7 +7854,7 @@
                 <w:szCs w:val="26"/>
                 <w:lang w:val="es-MX"/>
               </w:rPr>
-              <w:t>{añoTaller{4_grado}</w:t>
+              <w:t>{añoTaller4}</w:t>
             </w:r>
           </w:p>
         </w:tc>
@@ -12091,10 +12014,7 @@
                             </w:r>
                             <w:proofErr w:type="spellStart"/>
                             <w:r>
-                              <w:rPr>
-                                <w:lang w:val="es-AR"/>
-                              </w:rPr>
-                              <w:t>firma_digital</w:t>
+                              <w:t>firmaUser</w:t>
                             </w:r>
                             <w:proofErr w:type="spellEnd"/>
                             <w:r>
@@ -12149,10 +12069,7 @@
                       </w:r>
                       <w:proofErr w:type="spellStart"/>
                       <w:r>
-                        <w:rPr>
-                          <w:lang w:val="es-AR"/>
-                        </w:rPr>
-                        <w:t>firma_digital</w:t>
+                        <w:t>firmaUser</w:t>
                       </w:r>
                       <w:proofErr w:type="spellEnd"/>
                       <w:r>
@@ -12220,7 +12137,7 @@
 </w:document>
 </file>
 
-<file path=word\endnotes.xml><?xml version="1.0" encoding="utf-8"?>
+<file path=word/endnotes.xml><?xml version="1.0" encoding="utf-8"?>
 <w:endnotes xmlns:wpc="http://schemas.microsoft.com/office/word/2010/wordprocessingCanvas" xmlns:cx="http://schemas.microsoft.com/office/drawing/2014/chartex" xmlns:cx1="http://schemas.microsoft.com/office/drawing/2015/9/8/chartex" xmlns:cx2="http://schemas.microsoft.com/office/drawing/2015/10/21/chartex" xmlns:cx3="http://schemas.microsoft.com/office/drawing/2016/5/9/chartex" xmlns:cx4="http://schemas.microsoft.com/office/drawing/2016/5/10/chartex" xmlns:cx5="http://schemas.microsoft.com/office/drawing/2016/5/11/chartex" xmlns:cx6="http://schemas.microsoft.com/office/drawing/2016/5/12/chartex" xmlns:cx7="http://schemas.microsoft.com/office/drawing/2016/5/13/chartex" xmlns:cx8="http://schemas.microsoft.com/office/drawing/2016/5/14/chartex" xmlns:mc="http://schemas.openxmlformats.org/markup-compatibility/2006" xmlns:aink="http://schemas.microsoft.com/office/drawing/2016/ink" xmlns:am3d="http://schemas.microsoft.com/office/drawing/2017/model3d" xmlns:o="urn:schemas-microsoft-com:office:office" xmlns:oel="http://schemas.microsoft.com/office/2019/extlst" xmlns:r="http://schemas.openxmlformats.org/officeDocument/2006/relationships" xmlns:m="http://schemas.openxmlformats.org/officeDocument/2006/math" xmlns:v="urn:schemas-microsoft-com:vml" xmlns:wp14="http://schemas.microsoft.com/office/word/2010/wordprocessingDrawing" xmlns:wp="http://schemas.openxmlformats.org/drawingml/2006/wordprocessingDrawing" xmlns:w10="urn:schemas-microsoft-com:office:word" xmlns:w="http://schemas.openxmlformats.org/wordprocessingml/2006/main" xmlns:w14="http://schemas.microsoft.com/office/word/2010/wordml" xmlns:w15="http://schemas.microsoft.com/office/word/2012/wordml" xmlns:w16cex="http://schemas.microsoft.com/office/word/2018/wordml/cex" xmlns:w16cid="http://schemas.microsoft.com/office/word/2016/wordml/cid" xmlns:w16="http://schemas.microsoft.com/office/word/2018/wordml" xmlns:w16sdtdh="http://schemas.microsoft.com/office/word/2020/wordml/sdtdatahash" xmlns:w16se="http://schemas.microsoft.com/office/word/2015/wordml/symex" xmlns:wpg="http://schemas.microsoft.com/office/word/2010/wordprocessingGroup" xmlns:wpi="http://schemas.microsoft.com/office/word/2010/wordprocessingInk" xmlns:wne="http://schemas.microsoft.com/office/word/2006/wordml" xmlns:wps="http://schemas.microsoft.com/office/word/2010/wordprocessingShape" mc:Ignorable="w14 w15 w16se w16cid w16 w16cex w16sdtdh wp14">
   <w:endnote w:type="separator" w:id="-1">
     <w:p>
@@ -12239,135 +12156,7 @@
 </w:endnotes>
 </file>
 
-<file path=word\fontTable.xml><?xml version="1.0" encoding="utf-8"?>
-<w:fonts xmlns:mc="http://schemas.openxmlformats.org/markup-compatibility/2006" xmlns:r="http://schemas.openxmlformats.org/officeDocument/2006/relationships" xmlns:w="http://schemas.openxmlformats.org/wordprocessingml/2006/main" xmlns:w14="http://schemas.microsoft.com/office/word/2010/wordml" xmlns:w15="http://schemas.microsoft.com/office/word/2012/wordml" xmlns:w16cex="http://schemas.microsoft.com/office/word/2018/wordml/cex" xmlns:w16cid="http://schemas.microsoft.com/office/word/2016/wordml/cid" xmlns:w16="http://schemas.microsoft.com/office/word/2018/wordml" xmlns:w16sdtdh="http://schemas.microsoft.com/office/word/2020/wordml/sdtdatahash" xmlns:w16se="http://schemas.microsoft.com/office/word/2015/wordml/symex" mc:Ignorable="w14 w15 w16se w16cid w16 w16cex w16sdtdh">
-  <w:font w:name="Wingdings">
-    <w:panose1 w:val="05000000000000000000"/>
-    <w:charset w:val="02"/>
-    <w:family w:val="auto"/>
-    <w:pitch w:val="variable"/>
-    <w:sig w:usb0="00000000" w:usb1="10000000" w:usb2="00000000" w:usb3="00000000" w:csb0="80000000" w:csb1="00000000"/>
-  </w:font>
-  <w:font w:name="Times New Roman">
-    <w:panose1 w:val="02020603050405020304"/>
-    <w:charset w:val="00"/>
-    <w:family w:val="roman"/>
-    <w:pitch w:val="variable"/>
-    <w:sig w:usb0="E0002EFF" w:usb1="C000785B" w:usb2="00000009" w:usb3="00000000" w:csb0="000001FF" w:csb1="00000000"/>
-  </w:font>
-  <w:font w:name="Courier New">
-    <w:panose1 w:val="02070309020205020404"/>
-    <w:charset w:val="00"/>
-    <w:family w:val="modern"/>
-    <w:pitch w:val="fixed"/>
-    <w:sig w:usb0="E0002EFF" w:usb1="C0007843" w:usb2="00000009" w:usb3="00000000" w:csb0="000001FF" w:csb1="00000000"/>
-  </w:font>
-  <w:font w:name="Symbol">
-    <w:panose1 w:val="05050102010706020507"/>
-    <w:charset w:val="02"/>
-    <w:family w:val="roman"/>
-    <w:pitch w:val="variable"/>
-    <w:sig w:usb0="00000000" w:usb1="10000000" w:usb2="00000000" w:usb3="00000000" w:csb0="80000000" w:csb1="00000000"/>
-  </w:font>
-  <w:font w:name="Calibri">
-    <w:panose1 w:val="020F0502020204030204"/>
-    <w:charset w:val="00"/>
-    <w:family w:val="swiss"/>
-    <w:pitch w:val="variable"/>
-    <w:sig w:usb0="E4002EFF" w:usb1="C200247B" w:usb2="00000009" w:usb3="00000000" w:csb0="000001FF" w:csb1="00000000"/>
-  </w:font>
-  <w:font w:name="Tahoma">
-    <w:panose1 w:val="020B0604030504040204"/>
-    <w:charset w:val="00"/>
-    <w:family w:val="swiss"/>
-    <w:pitch w:val="variable"/>
-    <w:sig w:usb0="E1002EFF" w:usb1="C000605B" w:usb2="00000029" w:usb3="00000000" w:csb0="000101FF" w:csb1="00000000"/>
-  </w:font>
-  <w:font w:name="Cambria">
-    <w:panose1 w:val="02040503050406030204"/>
-    <w:charset w:val="00"/>
-    <w:family w:val="roman"/>
-    <w:pitch w:val="variable"/>
-    <w:sig w:usb0="E00006FF" w:usb1="420024FF" w:usb2="02000000" w:usb3="00000000" w:csb0="0000019F" w:csb1="00000000"/>
-  </w:font>
-  <w:font w:name="Calibri Light">
-    <w:panose1 w:val="020F0302020204030204"/>
-    <w:charset w:val="00"/>
-    <w:family w:val="swiss"/>
-    <w:pitch w:val="variable"/>
-    <w:sig w:usb0="E4002EFF" w:usb1="C200247B" w:usb2="00000009" w:usb3="00000000" w:csb0="000001FF" w:csb1="00000000"/>
-  </w:font>
-  <w:font w:name="Baskerville Old Face">
-    <w:charset w:val="00"/>
-    <w:family w:val="roman"/>
-    <w:pitch w:val="variable"/>
-    <w:sig w:usb0="00000003" w:usb1="00000000" w:usb2="00000000" w:usb3="00000000" w:csb0="00000001" w:csb1="00000000"/>
-  </w:font>
-  <w:font w:name="Batang">
-    <w:altName w:val="바탕"/>
-    <w:panose1 w:val="02030600000101010101"/>
-    <w:charset w:val="81"/>
-    <w:family w:val="roman"/>
-    <w:pitch w:val="variable"/>
-    <w:sig w:usb0="B00002AF" w:usb1="69D77CFB" w:usb2="00000030" w:usb3="00000000" w:csb0="0008009F" w:csb1="00000000"/>
-  </w:font>
-  <w:font w:name="Arabic Typesetting">
-    <w:charset w:val="B2"/>
-    <w:family w:val="script"/>
-    <w:pitch w:val="variable"/>
-    <w:sig w:usb0="80002007" w:usb1="80000000" w:usb2="00000008" w:usb3="00000000" w:csb0="000000D3" w:csb1="00000000"/>
-  </w:font>
-  <w:font w:name="Cooper Black">
-    <w:charset w:val="00"/>
-    <w:family w:val="roman"/>
-    <w:pitch w:val="variable"/>
-    <w:sig w:usb0="00000003" w:usb1="00000000" w:usb2="00000000" w:usb3="00000000" w:csb0="00000001" w:csb1="00000000"/>
-  </w:font>
-  <w:font w:name="Trebuchet MS">
-    <w:panose1 w:val="020B0603020202020204"/>
-    <w:charset w:val="00"/>
-    <w:family w:val="swiss"/>
-    <w:pitch w:val="variable"/>
-    <w:sig w:usb0="00000687" w:usb1="00000000" w:usb2="00000000" w:usb3="00000000" w:csb0="0000009F" w:csb1="00000000"/>
-  </w:font>
-  <w:font w:name="Arial">
-    <w:panose1 w:val="020B0604020202020204"/>
-    <w:charset w:val="00"/>
-    <w:family w:val="swiss"/>
-    <w:pitch w:val="variable"/>
-    <w:sig w:usb0="E0002EFF" w:usb1="C000785B" w:usb2="00000009" w:usb3="00000000" w:csb0="000001FF" w:csb1="00000000"/>
-  </w:font>
-  <w:font w:name="Monotype Corsiva">
-    <w:panose1 w:val="03010101010201010101"/>
-    <w:charset w:val="00"/>
-    <w:family w:val="script"/>
-    <w:pitch w:val="variable"/>
-    <w:sig w:usb0="00000287" w:usb1="00000000" w:usb2="00000000" w:usb3="00000000" w:csb0="0000009F" w:csb1="00000000"/>
-  </w:font>
-  <w:font w:name="Lucida Calligraphy">
-    <w:charset w:val="00"/>
-    <w:family w:val="script"/>
-    <w:pitch w:val="variable"/>
-    <w:sig w:usb0="00000003" w:usb1="00000000" w:usb2="00000000" w:usb3="00000000" w:csb0="00000001" w:csb1="00000000"/>
-  </w:font>
-  <w:font w:name="Segoe UI">
-    <w:panose1 w:val="020B0502040204020203"/>
-    <w:charset w:val="00"/>
-    <w:family w:val="swiss"/>
-    <w:pitch w:val="variable"/>
-    <w:sig w:usb0="E4002EFF" w:usb1="C000E47F" w:usb2="00000009" w:usb3="00000000" w:csb0="000001FF" w:csb1="00000000"/>
-  </w:font>
-  <w:font w:name="Candara">
-    <w:panose1 w:val="020E0502030303020204"/>
-    <w:charset w:val="00"/>
-    <w:family w:val="swiss"/>
-    <w:pitch w:val="variable"/>
-    <w:sig w:usb0="A00002EF" w:usb1="4000A44B" w:usb2="00000000" w:usb3="00000000" w:csb0="0000019F" w:csb1="00000000"/>
-  </w:font>
-</w:fonts>
-</file>
-
-<file path=word\footer1.xml><?xml version="1.0" encoding="utf-8"?>
+<file path=word/footer1.xml><?xml version="1.0" encoding="utf-8"?>
 <w:ftr xmlns:wpc="http://schemas.microsoft.com/office/word/2010/wordprocessingCanvas" xmlns:cx="http://schemas.microsoft.com/office/drawing/2014/chartex" xmlns:cx1="http://schemas.microsoft.com/office/drawing/2015/9/8/chartex" xmlns:cx2="http://schemas.microsoft.com/office/drawing/2015/10/21/chartex" xmlns:cx3="http://schemas.microsoft.com/office/drawing/2016/5/9/chartex" xmlns:cx4="http://schemas.microsoft.com/office/drawing/2016/5/10/chartex" xmlns:cx5="http://schemas.microsoft.com/office/drawing/2016/5/11/chartex" xmlns:cx6="http://schemas.microsoft.com/office/drawing/2016/5/12/chartex" xmlns:cx7="http://schemas.microsoft.com/office/drawing/2016/5/13/chartex" xmlns:cx8="http://schemas.microsoft.com/office/drawing/2016/5/14/chartex" xmlns:mc="http://schemas.openxmlformats.org/markup-compatibility/2006" xmlns:aink="http://schemas.microsoft.com/office/drawing/2016/ink" xmlns:am3d="http://schemas.microsoft.com/office/drawing/2017/model3d" xmlns:o="urn:schemas-microsoft-com:office:office" xmlns:oel="http://schemas.microsoft.com/office/2019/extlst" xmlns:r="http://schemas.openxmlformats.org/officeDocument/2006/relationships" xmlns:m="http://schemas.openxmlformats.org/officeDocument/2006/math" xmlns:v="urn:schemas-microsoft-com:vml" xmlns:wp14="http://schemas.microsoft.com/office/word/2010/wordprocessingDrawing" xmlns:wp="http://schemas.openxmlformats.org/drawingml/2006/wordprocessingDrawing" xmlns:w10="urn:schemas-microsoft-com:office:word" xmlns:w="http://schemas.openxmlformats.org/wordprocessingml/2006/main" xmlns:w14="http://schemas.microsoft.com/office/word/2010/wordml" xmlns:w15="http://schemas.microsoft.com/office/word/2012/wordml" xmlns:w16cex="http://schemas.microsoft.com/office/word/2018/wordml/cex" xmlns:w16cid="http://schemas.microsoft.com/office/word/2016/wordml/cid" xmlns:w16="http://schemas.microsoft.com/office/word/2018/wordml" xmlns:w16sdtdh="http://schemas.microsoft.com/office/word/2020/wordml/sdtdatahash" xmlns:w16se="http://schemas.microsoft.com/office/word/2015/wordml/symex" xmlns:wpg="http://schemas.microsoft.com/office/word/2010/wordprocessingGroup" xmlns:wpi="http://schemas.microsoft.com/office/word/2010/wordprocessingInk" xmlns:wne="http://schemas.microsoft.com/office/word/2006/wordml" xmlns:wps="http://schemas.microsoft.com/office/word/2010/wordprocessingShape" mc:Ignorable="w14 w15 w16se w16cid w16 w16cex w16sdtdh wp14">
   <w:p>
     <w:pPr>
@@ -12442,7 +12231,7 @@
 </w:ftr>
 </file>
 
-<file path=word\footnotes.xml><?xml version="1.0" encoding="utf-8"?>
+<file path=word/footnotes.xml><?xml version="1.0" encoding="utf-8"?>
 <w:footnotes xmlns:wpc="http://schemas.microsoft.com/office/word/2010/wordprocessingCanvas" xmlns:cx="http://schemas.microsoft.com/office/drawing/2014/chartex" xmlns:cx1="http://schemas.microsoft.com/office/drawing/2015/9/8/chartex" xmlns:cx2="http://schemas.microsoft.com/office/drawing/2015/10/21/chartex" xmlns:cx3="http://schemas.microsoft.com/office/drawing/2016/5/9/chartex" xmlns:cx4="http://schemas.microsoft.com/office/drawing/2016/5/10/chartex" xmlns:cx5="http://schemas.microsoft.com/office/drawing/2016/5/11/chartex" xmlns:cx6="http://schemas.microsoft.com/office/drawing/2016/5/12/chartex" xmlns:cx7="http://schemas.microsoft.com/office/drawing/2016/5/13/chartex" xmlns:cx8="http://schemas.microsoft.com/office/drawing/2016/5/14/chartex" xmlns:mc="http://schemas.openxmlformats.org/markup-compatibility/2006" xmlns:aink="http://schemas.microsoft.com/office/drawing/2016/ink" xmlns:am3d="http://schemas.microsoft.com/office/drawing/2017/model3d" xmlns:o="urn:schemas-microsoft-com:office:office" xmlns:oel="http://schemas.microsoft.com/office/2019/extlst" xmlns:r="http://schemas.openxmlformats.org/officeDocument/2006/relationships" xmlns:m="http://schemas.openxmlformats.org/officeDocument/2006/math" xmlns:v="urn:schemas-microsoft-com:vml" xmlns:wp14="http://schemas.microsoft.com/office/word/2010/wordprocessingDrawing" xmlns:wp="http://schemas.openxmlformats.org/drawingml/2006/wordprocessingDrawing" xmlns:w10="urn:schemas-microsoft-com:office:word" xmlns:w="http://schemas.openxmlformats.org/wordprocessingml/2006/main" xmlns:w14="http://schemas.microsoft.com/office/word/2010/wordml" xmlns:w15="http://schemas.microsoft.com/office/word/2012/wordml" xmlns:w16cex="http://schemas.microsoft.com/office/word/2018/wordml/cex" xmlns:w16cid="http://schemas.microsoft.com/office/word/2016/wordml/cid" xmlns:w16="http://schemas.microsoft.com/office/word/2018/wordml" xmlns:w16sdtdh="http://schemas.microsoft.com/office/word/2020/wordml/sdtdatahash" xmlns:w16se="http://schemas.microsoft.com/office/word/2015/wordml/symex" xmlns:wpg="http://schemas.microsoft.com/office/word/2010/wordprocessingGroup" xmlns:wpi="http://schemas.microsoft.com/office/word/2010/wordprocessingInk" xmlns:wne="http://schemas.microsoft.com/office/word/2006/wordml" xmlns:wps="http://schemas.microsoft.com/office/word/2010/wordprocessingShape" mc:Ignorable="w14 w15 w16se w16cid w16 w16cex w16sdtdh wp14">
   <w:footnote w:type="separator" w:id="-1">
     <w:p>
@@ -12461,7 +12250,7 @@
 </w:footnotes>
 </file>
 
-<file path=word\header1.xml><?xml version="1.0" encoding="utf-8"?>
+<file path=word/header1.xml><?xml version="1.0" encoding="utf-8"?>
 <w:hdr xmlns:wpc="http://schemas.microsoft.com/office/word/2010/wordprocessingCanvas" xmlns:cx="http://schemas.microsoft.com/office/drawing/2014/chartex" xmlns:cx1="http://schemas.microsoft.com/office/drawing/2015/9/8/chartex" xmlns:cx2="http://schemas.microsoft.com/office/drawing/2015/10/21/chartex" xmlns:cx3="http://schemas.microsoft.com/office/drawing/2016/5/9/chartex" xmlns:cx4="http://schemas.microsoft.com/office/drawing/2016/5/10/chartex" xmlns:cx5="http://schemas.microsoft.com/office/drawing/2016/5/11/chartex" xmlns:cx6="http://schemas.microsoft.com/office/drawing/2016/5/12/chartex" xmlns:cx7="http://schemas.microsoft.com/office/drawing/2016/5/13/chartex" xmlns:cx8="http://schemas.microsoft.com/office/drawing/2016/5/14/chartex" xmlns:mc="http://schemas.openxmlformats.org/markup-compatibility/2006" xmlns:aink="http://schemas.microsoft.com/office/drawing/2016/ink" xmlns:am3d="http://schemas.microsoft.com/office/drawing/2017/model3d" xmlns:o="urn:schemas-microsoft-com:office:office" xmlns:oel="http://schemas.microsoft.com/office/2019/extlst" xmlns:r="http://schemas.openxmlformats.org/officeDocument/2006/relationships" xmlns:m="http://schemas.openxmlformats.org/officeDocument/2006/math" xmlns:v="urn:schemas-microsoft-com:vml" xmlns:wp14="http://schemas.microsoft.com/office/word/2010/wordprocessingDrawing" xmlns:wp="http://schemas.openxmlformats.org/drawingml/2006/wordprocessingDrawing" xmlns:w10="urn:schemas-microsoft-com:office:word" xmlns:w="http://schemas.openxmlformats.org/wordprocessingml/2006/main" xmlns:w14="http://schemas.microsoft.com/office/word/2010/wordml" xmlns:w15="http://schemas.microsoft.com/office/word/2012/wordml" xmlns:w16cex="http://schemas.microsoft.com/office/word/2018/wordml/cex" xmlns:w16cid="http://schemas.microsoft.com/office/word/2016/wordml/cid" xmlns:w16="http://schemas.microsoft.com/office/word/2018/wordml" xmlns:w16sdtdh="http://schemas.microsoft.com/office/word/2020/wordml/sdtdatahash" xmlns:w16se="http://schemas.microsoft.com/office/word/2015/wordml/symex" xmlns:wpg="http://schemas.microsoft.com/office/word/2010/wordprocessingGroup" xmlns:wpi="http://schemas.microsoft.com/office/word/2010/wordprocessingInk" xmlns:wne="http://schemas.microsoft.com/office/word/2006/wordml" xmlns:wps="http://schemas.microsoft.com/office/word/2010/wordprocessingShape" mc:Ignorable="w14 w15 w16se w16cid w16 w16cex w16sdtdh wp14">
   <w:p>
     <w:pPr>
@@ -12535,7 +12324,6 @@
                           <w:r>
                             <w:rPr>
                               <w:rFonts w:ascii="Lucida Calligraphy" w:hAnsi="Lucida Calligraphy" w:cs="Segoe UI"/>
-                              <w:lang w:val="es-CO"/>
                             </w:rPr>
                             <w:t>{</w:t>
                           </w:r>
@@ -12543,15 +12331,13 @@
                           <w:r>
                             <w:rPr>
                               <w:rFonts w:ascii="Lucida Calligraphy" w:hAnsi="Lucida Calligraphy" w:cs="Segoe UI"/>
-                              <w:lang w:val="es-CO"/>
                             </w:rPr>
-                            <w:t>frase_identificadora</w:t>
+                            <w:t>fraseUser</w:t>
                           </w:r>
                           <w:proofErr w:type="spellEnd"/>
                           <w:r>
                             <w:rPr>
                               <w:rFonts w:ascii="Lucida Calligraphy" w:hAnsi="Lucida Calligraphy" w:cs="Segoe UI"/>
-                              <w:lang w:val="es-CO"/>
                             </w:rPr>
                             <w:t>}</w:t>
                           </w:r>
@@ -12592,7 +12378,6 @@
                     <w:r>
                       <w:rPr>
                         <w:rFonts w:ascii="Lucida Calligraphy" w:hAnsi="Lucida Calligraphy" w:cs="Segoe UI"/>
-                        <w:lang w:val="es-CO"/>
                       </w:rPr>
                       <w:t>{</w:t>
                     </w:r>
@@ -12600,15 +12385,13 @@
                     <w:r>
                       <w:rPr>
                         <w:rFonts w:ascii="Lucida Calligraphy" w:hAnsi="Lucida Calligraphy" w:cs="Segoe UI"/>
-                        <w:lang w:val="es-CO"/>
                       </w:rPr>
-                      <w:t>frase_identificadora</w:t>
+                      <w:t>fraseUser</w:t>
                     </w:r>
                     <w:proofErr w:type="spellEnd"/>
                     <w:r>
                       <w:rPr>
                         <w:rFonts w:ascii="Lucida Calligraphy" w:hAnsi="Lucida Calligraphy" w:cs="Segoe UI"/>
-                        <w:lang w:val="es-CO"/>
                       </w:rPr>
                       <w:t>}</w:t>
                     </w:r>
@@ -13179,7 +12962,7 @@
 </w:hdr>
 </file>
 
-<file path=word\numbering.xml><?xml version="1.0" encoding="utf-8"?>
+<file path=word/numbering.xml><?xml version="1.0" encoding="utf-8"?>
 <w:numbering xmlns:wpc="http://schemas.microsoft.com/office/word/2010/wordprocessingCanvas" xmlns:cx="http://schemas.microsoft.com/office/drawing/2014/chartex" xmlns:cx1="http://schemas.microsoft.com/office/drawing/2015/9/8/chartex" xmlns:cx2="http://schemas.microsoft.com/office/drawing/2015/10/21/chartex" xmlns:cx3="http://schemas.microsoft.com/office/drawing/2016/5/9/chartex" xmlns:cx4="http://schemas.microsoft.com/office/drawing/2016/5/10/chartex" xmlns:cx5="http://schemas.microsoft.com/office/drawing/2016/5/11/chartex" xmlns:cx6="http://schemas.microsoft.com/office/drawing/2016/5/12/chartex" xmlns:cx7="http://schemas.microsoft.com/office/drawing/2016/5/13/chartex" xmlns:cx8="http://schemas.microsoft.com/office/drawing/2016/5/14/chartex" xmlns:mc="http://schemas.openxmlformats.org/markup-compatibility/2006" xmlns:aink="http://schemas.microsoft.com/office/drawing/2016/ink" xmlns:am3d="http://schemas.microsoft.com/office/drawing/2017/model3d" xmlns:o="urn:schemas-microsoft-com:office:office" xmlns:oel="http://schemas.microsoft.com/office/2019/extlst" xmlns:r="http://schemas.openxmlformats.org/officeDocument/2006/relationships" xmlns:m="http://schemas.openxmlformats.org/officeDocument/2006/math" xmlns:v="urn:schemas-microsoft-com:vml" xmlns:wp14="http://schemas.microsoft.com/office/word/2010/wordprocessingDrawing" xmlns:wp="http://schemas.openxmlformats.org/drawingml/2006/wordprocessingDrawing" xmlns:w10="urn:schemas-microsoft-com:office:word" xmlns:w="http://schemas.openxmlformats.org/wordprocessingml/2006/main" xmlns:w14="http://schemas.microsoft.com/office/word/2010/wordml" xmlns:w15="http://schemas.microsoft.com/office/word/2012/wordml" xmlns:w16cex="http://schemas.microsoft.com/office/word/2018/wordml/cex" xmlns:w16cid="http://schemas.microsoft.com/office/word/2016/wordml/cid" xmlns:w16="http://schemas.microsoft.com/office/word/2018/wordml" xmlns:w16sdtdh="http://schemas.microsoft.com/office/word/2020/wordml/sdtdatahash" xmlns:w16se="http://schemas.microsoft.com/office/word/2015/wordml/symex" xmlns:wpg="http://schemas.microsoft.com/office/word/2010/wordprocessingGroup" xmlns:wpi="http://schemas.microsoft.com/office/word/2010/wordprocessingInk" xmlns:wne="http://schemas.microsoft.com/office/word/2006/wordml" xmlns:wps="http://schemas.microsoft.com/office/word/2010/wordprocessingShape" mc:Ignorable="w14 w15 w16se w16cid w16 w16cex w16sdtdh wp14">
   <w:abstractNum w:abstractNumId="0" w15:restartNumberingAfterBreak="0">
     <w:nsid w:val="262B06A7"/>
@@ -13303,349 +13086,7 @@
 </w:numbering>
 </file>
 
-<file path=word\settings.xml><?xml version="1.0" encoding="utf-8"?>
-<w:settings xmlns:mc="http://schemas.openxmlformats.org/markup-compatibility/2006" xmlns:o="urn:schemas-microsoft-com:office:office" xmlns:r="http://schemas.openxmlformats.org/officeDocument/2006/relationships" xmlns:m="http://schemas.openxmlformats.org/officeDocument/2006/math" xmlns:v="urn:schemas-microsoft-com:vml" xmlns:w10="urn:schemas-microsoft-com:office:word" xmlns:w="http://schemas.openxmlformats.org/wordprocessingml/2006/main" xmlns:w14="http://schemas.microsoft.com/office/word/2010/wordml" xmlns:w15="http://schemas.microsoft.com/office/word/2012/wordml" xmlns:w16cex="http://schemas.microsoft.com/office/word/2018/wordml/cex" xmlns:w16cid="http://schemas.microsoft.com/office/word/2016/wordml/cid" xmlns:w16="http://schemas.microsoft.com/office/word/2018/wordml" xmlns:w16sdtdh="http://schemas.microsoft.com/office/word/2020/wordml/sdtdatahash" xmlns:w16se="http://schemas.microsoft.com/office/word/2015/wordml/symex" xmlns:sl="http://schemas.openxmlformats.org/schemaLibrary/2006/main" mc:Ignorable="w14 w15 w16se w16cid w16 w16cex w16sdtdh">
-  <w:zoom w:percent="100"/>
-  <w:proofState w:spelling="clean"/>
-  <w:defaultTabStop w:val="708"/>
-  <w:hyphenationZone w:val="425"/>
-  <w:characterSpacingControl w:val="doNotCompress"/>
-  <w:hdrShapeDefaults>
-    <o:shapedefaults v:ext="edit" spidmax="2050"/>
-  </w:hdrShapeDefaults>
-  <w:footnotePr>
-    <w:footnote w:id="-1"/>
-    <w:footnote w:id="0"/>
-  </w:footnotePr>
-  <w:endnotePr>
-    <w:endnote w:id="-1"/>
-    <w:endnote w:id="0"/>
-  </w:endnotePr>
-  <w:compat>
-    <w:compatSetting w:name="compatibilityMode" w:uri="http://schemas.microsoft.com/office/word" w:val="15"/>
-    <w:compatSetting w:name="overrideTableStyleFontSizeAndJustification" w:uri="http://schemas.microsoft.com/office/word" w:val="1"/>
-    <w:compatSetting w:name="enableOpenTypeFeatures" w:uri="http://schemas.microsoft.com/office/word" w:val="1"/>
-    <w:compatSetting w:name="doNotFlipMirrorIndents" w:uri="http://schemas.microsoft.com/office/word" w:val="1"/>
-    <w:compatSetting w:name="differentiateMultirowTableHeaders" w:uri="http://schemas.microsoft.com/office/word" w:val="1"/>
-    <w:compatSetting w:name="useWord2013TrackBottomHyphenation" w:uri="http://schemas.microsoft.com/office/word" w:val="0"/>
-  </w:compat>
-  <w:rsids>
-    <w:rsidRoot w:val="00CD6784"/>
-    <w:rsid w:val="0000454F"/>
-    <w:rsid w:val="00017905"/>
-    <w:rsid w:val="00030998"/>
-    <w:rsid w:val="00031719"/>
-    <w:rsid w:val="000376D9"/>
-    <w:rsid w:val="000522B5"/>
-    <w:rsid w:val="00066672"/>
-    <w:rsid w:val="00076E78"/>
-    <w:rsid w:val="00080AE4"/>
-    <w:rsid w:val="00091479"/>
-    <w:rsid w:val="00097BE7"/>
-    <w:rsid w:val="000A3794"/>
-    <w:rsid w:val="000A7577"/>
-    <w:rsid w:val="000B7E9F"/>
-    <w:rsid w:val="0010037B"/>
-    <w:rsid w:val="00101277"/>
-    <w:rsid w:val="001107BD"/>
-    <w:rsid w:val="0011086E"/>
-    <w:rsid w:val="001157EB"/>
-    <w:rsid w:val="001324E3"/>
-    <w:rsid w:val="0014421F"/>
-    <w:rsid w:val="001445DB"/>
-    <w:rsid w:val="00171045"/>
-    <w:rsid w:val="00194B80"/>
-    <w:rsid w:val="001C063C"/>
-    <w:rsid w:val="001C0776"/>
-    <w:rsid w:val="001C5A4C"/>
-    <w:rsid w:val="001C5BB8"/>
-    <w:rsid w:val="001F1359"/>
-    <w:rsid w:val="00212F9D"/>
-    <w:rsid w:val="00232750"/>
-    <w:rsid w:val="0023333C"/>
-    <w:rsid w:val="00260C5A"/>
-    <w:rsid w:val="00261AF2"/>
-    <w:rsid w:val="00285D4E"/>
-    <w:rsid w:val="00294A30"/>
-    <w:rsid w:val="00296A88"/>
-    <w:rsid w:val="002A2CC7"/>
-    <w:rsid w:val="002B34EF"/>
-    <w:rsid w:val="002C1A89"/>
-    <w:rsid w:val="002D1D29"/>
-    <w:rsid w:val="002E013B"/>
-    <w:rsid w:val="002E44D9"/>
-    <w:rsid w:val="002F46BC"/>
-    <w:rsid w:val="002F5785"/>
-    <w:rsid w:val="00301E37"/>
-    <w:rsid w:val="003170B5"/>
-    <w:rsid w:val="00321CA5"/>
-    <w:rsid w:val="003374C7"/>
-    <w:rsid w:val="0035380C"/>
-    <w:rsid w:val="003544B7"/>
-    <w:rsid w:val="00355A65"/>
-    <w:rsid w:val="00364088"/>
-    <w:rsid w:val="0036420A"/>
-    <w:rsid w:val="00393D64"/>
-    <w:rsid w:val="0039664E"/>
-    <w:rsid w:val="003977BD"/>
-    <w:rsid w:val="003A31C4"/>
-    <w:rsid w:val="003A62F5"/>
-    <w:rsid w:val="003B16DC"/>
-    <w:rsid w:val="003D0781"/>
-    <w:rsid w:val="003D235D"/>
-    <w:rsid w:val="003D75AA"/>
-    <w:rsid w:val="003E1E3E"/>
-    <w:rsid w:val="003E2BFD"/>
-    <w:rsid w:val="0040431F"/>
-    <w:rsid w:val="00410EB8"/>
-    <w:rsid w:val="00411911"/>
-    <w:rsid w:val="00426FF6"/>
-    <w:rsid w:val="004274ED"/>
-    <w:rsid w:val="00451F78"/>
-    <w:rsid w:val="004528D2"/>
-    <w:rsid w:val="00455279"/>
-    <w:rsid w:val="00457C19"/>
-    <w:rsid w:val="00497804"/>
-    <w:rsid w:val="004A712D"/>
-    <w:rsid w:val="004C5A2B"/>
-    <w:rsid w:val="004C6EBB"/>
-    <w:rsid w:val="004D00E4"/>
-    <w:rsid w:val="004D5191"/>
-    <w:rsid w:val="004D77CB"/>
-    <w:rsid w:val="004F20C9"/>
-    <w:rsid w:val="004F49CB"/>
-    <w:rsid w:val="00503809"/>
-    <w:rsid w:val="00544EB0"/>
-    <w:rsid w:val="00550957"/>
-    <w:rsid w:val="00551878"/>
-    <w:rsid w:val="00551D86"/>
-    <w:rsid w:val="00553BD2"/>
-    <w:rsid w:val="00555A07"/>
-    <w:rsid w:val="00561B80"/>
-    <w:rsid w:val="005620A0"/>
-    <w:rsid w:val="0056683C"/>
-    <w:rsid w:val="00574F16"/>
-    <w:rsid w:val="00583840"/>
-    <w:rsid w:val="005A2B47"/>
-    <w:rsid w:val="005A7475"/>
-    <w:rsid w:val="005B3F0E"/>
-    <w:rsid w:val="005B453D"/>
-    <w:rsid w:val="005B468A"/>
-    <w:rsid w:val="005C0826"/>
-    <w:rsid w:val="005C1A80"/>
-    <w:rsid w:val="005C3CB2"/>
-    <w:rsid w:val="005C5763"/>
-    <w:rsid w:val="005D32C3"/>
-    <w:rsid w:val="005D5D99"/>
-    <w:rsid w:val="005E18FA"/>
-    <w:rsid w:val="005F21D7"/>
-    <w:rsid w:val="005F45B1"/>
-    <w:rsid w:val="00605AB6"/>
-    <w:rsid w:val="00613CE1"/>
-    <w:rsid w:val="0061566D"/>
-    <w:rsid w:val="006372A7"/>
-    <w:rsid w:val="00641A59"/>
-    <w:rsid w:val="0064620B"/>
-    <w:rsid w:val="006519B9"/>
-    <w:rsid w:val="006543C4"/>
-    <w:rsid w:val="00677C1C"/>
-    <w:rsid w:val="00680F0B"/>
-    <w:rsid w:val="0069273B"/>
-    <w:rsid w:val="0069489A"/>
-    <w:rsid w:val="006A6791"/>
-    <w:rsid w:val="006A736E"/>
-    <w:rsid w:val="006B3D53"/>
-    <w:rsid w:val="006C17C4"/>
-    <w:rsid w:val="006C4687"/>
-    <w:rsid w:val="006C7871"/>
-    <w:rsid w:val="006D231D"/>
-    <w:rsid w:val="006D47E2"/>
-    <w:rsid w:val="006D498C"/>
-    <w:rsid w:val="006D7E6D"/>
-    <w:rsid w:val="006D7F81"/>
-    <w:rsid w:val="006E10DB"/>
-    <w:rsid w:val="006E52AD"/>
-    <w:rsid w:val="006F596F"/>
-    <w:rsid w:val="006F728B"/>
-    <w:rsid w:val="00707979"/>
-    <w:rsid w:val="00710E25"/>
-    <w:rsid w:val="0071652A"/>
-    <w:rsid w:val="00717003"/>
-    <w:rsid w:val="007302E4"/>
-    <w:rsid w:val="007421C0"/>
-    <w:rsid w:val="007664F2"/>
-    <w:rsid w:val="00794CFC"/>
-    <w:rsid w:val="007A235E"/>
-    <w:rsid w:val="007C373B"/>
-    <w:rsid w:val="007E47BB"/>
-    <w:rsid w:val="007F38EF"/>
-    <w:rsid w:val="007F5EF7"/>
-    <w:rsid w:val="007F6ABA"/>
-    <w:rsid w:val="0080798D"/>
-    <w:rsid w:val="008304A5"/>
-    <w:rsid w:val="00836A02"/>
-    <w:rsid w:val="0085237B"/>
-    <w:rsid w:val="00866C5E"/>
-    <w:rsid w:val="00887490"/>
-    <w:rsid w:val="0089306E"/>
-    <w:rsid w:val="008A0C29"/>
-    <w:rsid w:val="008A307E"/>
-    <w:rsid w:val="008A6759"/>
-    <w:rsid w:val="008C1260"/>
-    <w:rsid w:val="008C74B2"/>
-    <w:rsid w:val="008D325D"/>
-    <w:rsid w:val="008E0D41"/>
-    <w:rsid w:val="008E45F2"/>
-    <w:rsid w:val="008F15AC"/>
-    <w:rsid w:val="008F2B68"/>
-    <w:rsid w:val="00900A08"/>
-    <w:rsid w:val="00903C3F"/>
-    <w:rsid w:val="00911230"/>
-    <w:rsid w:val="00934775"/>
-    <w:rsid w:val="009366F8"/>
-    <w:rsid w:val="00940035"/>
-    <w:rsid w:val="00943B61"/>
-    <w:rsid w:val="0094630D"/>
-    <w:rsid w:val="00961DC2"/>
-    <w:rsid w:val="00962BFC"/>
-    <w:rsid w:val="00965305"/>
-    <w:rsid w:val="00972941"/>
-    <w:rsid w:val="00980050"/>
-    <w:rsid w:val="009812B7"/>
-    <w:rsid w:val="00983FB5"/>
-    <w:rsid w:val="009A5BEE"/>
-    <w:rsid w:val="009C0C08"/>
-    <w:rsid w:val="009C17FE"/>
-    <w:rsid w:val="009D5A28"/>
-    <w:rsid w:val="009D5C17"/>
-    <w:rsid w:val="009E2005"/>
-    <w:rsid w:val="009E6092"/>
-    <w:rsid w:val="00A12C13"/>
-    <w:rsid w:val="00A21E17"/>
-    <w:rsid w:val="00A22633"/>
-    <w:rsid w:val="00A242C5"/>
-    <w:rsid w:val="00A265E7"/>
-    <w:rsid w:val="00A30BBB"/>
-    <w:rsid w:val="00A520F9"/>
-    <w:rsid w:val="00A727E7"/>
-    <w:rsid w:val="00A7392C"/>
-    <w:rsid w:val="00A73E7C"/>
-    <w:rsid w:val="00A972A0"/>
-    <w:rsid w:val="00AA104E"/>
-    <w:rsid w:val="00AB4333"/>
-    <w:rsid w:val="00AC5AE5"/>
-    <w:rsid w:val="00AD55D6"/>
-    <w:rsid w:val="00AD7DAB"/>
-    <w:rsid w:val="00AE2F88"/>
-    <w:rsid w:val="00B125BB"/>
-    <w:rsid w:val="00B1277A"/>
-    <w:rsid w:val="00B14D93"/>
-    <w:rsid w:val="00B20409"/>
-    <w:rsid w:val="00B2595E"/>
-    <w:rsid w:val="00B47E82"/>
-    <w:rsid w:val="00B632D5"/>
-    <w:rsid w:val="00B64841"/>
-    <w:rsid w:val="00BB643E"/>
-    <w:rsid w:val="00BC40B8"/>
-    <w:rsid w:val="00BC4738"/>
-    <w:rsid w:val="00BC7D47"/>
-    <w:rsid w:val="00BD22F8"/>
-    <w:rsid w:val="00BD6FC2"/>
-    <w:rsid w:val="00C15255"/>
-    <w:rsid w:val="00C37318"/>
-    <w:rsid w:val="00C3798A"/>
-    <w:rsid w:val="00C5006C"/>
-    <w:rsid w:val="00C51CCF"/>
-    <w:rsid w:val="00C57EC8"/>
-    <w:rsid w:val="00C676CA"/>
-    <w:rsid w:val="00C76339"/>
-    <w:rsid w:val="00C850B1"/>
-    <w:rsid w:val="00C8645D"/>
-    <w:rsid w:val="00CA156A"/>
-    <w:rsid w:val="00CA1CD2"/>
-    <w:rsid w:val="00CC73F0"/>
-    <w:rsid w:val="00CD6784"/>
-    <w:rsid w:val="00D27D95"/>
-    <w:rsid w:val="00D433AD"/>
-    <w:rsid w:val="00D44951"/>
-    <w:rsid w:val="00D45211"/>
-    <w:rsid w:val="00D5713D"/>
-    <w:rsid w:val="00D6692D"/>
-    <w:rsid w:val="00D93F70"/>
-    <w:rsid w:val="00DA278E"/>
-    <w:rsid w:val="00DA53CC"/>
-    <w:rsid w:val="00DA5C9E"/>
-    <w:rsid w:val="00DB2B2B"/>
-    <w:rsid w:val="00DC38B8"/>
-    <w:rsid w:val="00DD5367"/>
-    <w:rsid w:val="00DE2181"/>
-    <w:rsid w:val="00DE2A61"/>
-    <w:rsid w:val="00DE5C57"/>
-    <w:rsid w:val="00DF410B"/>
-    <w:rsid w:val="00DF453C"/>
-    <w:rsid w:val="00E0747C"/>
-    <w:rsid w:val="00E16BBF"/>
-    <w:rsid w:val="00E26325"/>
-    <w:rsid w:val="00E35BF5"/>
-    <w:rsid w:val="00E4169C"/>
-    <w:rsid w:val="00E57041"/>
-    <w:rsid w:val="00E62BF5"/>
-    <w:rsid w:val="00E63101"/>
-    <w:rsid w:val="00E648A4"/>
-    <w:rsid w:val="00E66933"/>
-    <w:rsid w:val="00E755A3"/>
-    <w:rsid w:val="00E84256"/>
-    <w:rsid w:val="00E85544"/>
-    <w:rsid w:val="00E91198"/>
-    <w:rsid w:val="00EC3A07"/>
-    <w:rsid w:val="00EC6B3A"/>
-    <w:rsid w:val="00ED143C"/>
-    <w:rsid w:val="00EE4F59"/>
-    <w:rsid w:val="00F05FBC"/>
-    <w:rsid w:val="00F1378F"/>
-    <w:rsid w:val="00F35221"/>
-    <w:rsid w:val="00F56772"/>
-    <w:rsid w:val="00F848EB"/>
-    <w:rsid w:val="00F9307A"/>
-    <w:rsid w:val="00F948B6"/>
-    <w:rsid w:val="00FA011D"/>
-    <w:rsid w:val="00FA282D"/>
-    <w:rsid w:val="00FA777C"/>
-    <w:rsid w:val="00FB6E06"/>
-    <w:rsid w:val="00FB7E43"/>
-    <w:rsid w:val="00FC532B"/>
-    <w:rsid w:val="00FD6D41"/>
-    <w:rsid w:val="00FE4ECD"/>
-  </w:rsids>
-  <m:mathPr>
-    <m:mathFont m:val="Cambria Math"/>
-    <m:brkBin m:val="before"/>
-    <m:brkBinSub m:val="--"/>
-    <m:smallFrac m:val="0"/>
-    <m:dispDef/>
-    <m:lMargin m:val="0"/>
-    <m:rMargin m:val="0"/>
-    <m:defJc m:val="centerGroup"/>
-    <m:wrapIndent m:val="1440"/>
-    <m:intLim m:val="subSup"/>
-    <m:naryLim m:val="undOvr"/>
-  </m:mathPr>
-  <w:themeFontLang w:val="es-CO"/>
-  <w:clrSchemeMapping w:bg1="light1" w:t1="dark1" w:bg2="light2" w:t2="dark2" w:accent1="accent1" w:accent2="accent2" w:accent3="accent3" w:accent4="accent4" w:accent5="accent5" w:accent6="accent6" w:hyperlink="hyperlink" w:followedHyperlink="followedHyperlink"/>
-  <w:shapeDefaults>
-    <o:shapedefaults v:ext="edit" spidmax="2050"/>
-    <o:shapelayout v:ext="edit">
-      <o:idmap v:ext="edit" data="2"/>
-    </o:shapelayout>
-  </w:shapeDefaults>
-  <w:decimalSymbol w:val=","/>
-  <w:listSeparator w:val=";"/>
-  <w14:docId w14:val="213A030B"/>
-  <w15:docId w15:val="{436DF6C1-E372-4189-A413-1E6E3419FCDE}"/>
-</w:settings>
-</file>
-
-<file path=word\styles.xml><?xml version="1.0" encoding="utf-8"?>
+<file path=word/styles.xml><?xml version="1.0" encoding="utf-8"?>
 <w:styles xmlns:mc="http://schemas.openxmlformats.org/markup-compatibility/2006" xmlns:r="http://schemas.openxmlformats.org/officeDocument/2006/relationships" xmlns:w="http://schemas.openxmlformats.org/wordprocessingml/2006/main" xmlns:w14="http://schemas.microsoft.com/office/word/2010/wordml" xmlns:w15="http://schemas.microsoft.com/office/word/2012/wordml" xmlns:w16cex="http://schemas.microsoft.com/office/word/2018/wordml/cex" xmlns:w16cid="http://schemas.microsoft.com/office/word/2016/wordml/cid" xmlns:w16="http://schemas.microsoft.com/office/word/2018/wordml" xmlns:w16sdtdh="http://schemas.microsoft.com/office/word/2020/wordml/sdtdatahash" xmlns:w16se="http://schemas.microsoft.com/office/word/2015/wordml/symex" mc:Ignorable="w14 w15 w16se w16cid w16 w16cex w16sdtdh">
   <w:docDefaults>
     <w:rPrDefault>
@@ -14597,7 +14038,7 @@
 </w:styles>
 </file>
 
-<file path=word\theme\theme1.xml><?xml version="1.0" encoding="utf-8"?>
+<file path=word/theme/theme1.xml><?xml version="1.0" encoding="utf-8"?>
 <a:theme xmlns:a="http://schemas.openxmlformats.org/drawingml/2006/main" name="Tema de Office">
   <a:themeElements>
     <a:clrScheme name="Office">
@@ -14882,832 +14323,14 @@
 </a:theme>
 </file>
 
-<file path=word\webSettings.xml><?xml version="1.0" encoding="utf-8"?>
-<w:webSettings xmlns:mc="http://schemas.openxmlformats.org/markup-compatibility/2006" xmlns:r="http://schemas.openxmlformats.org/officeDocument/2006/relationships" xmlns:w="http://schemas.openxmlformats.org/wordprocessingml/2006/main" xmlns:w14="http://schemas.microsoft.com/office/word/2010/wordml" xmlns:w15="http://schemas.microsoft.com/office/word/2012/wordml" xmlns:w16cex="http://schemas.microsoft.com/office/word/2018/wordml/cex" xmlns:w16cid="http://schemas.microsoft.com/office/word/2016/wordml/cid" xmlns:w16="http://schemas.microsoft.com/office/word/2018/wordml" xmlns:w16sdtdh="http://schemas.microsoft.com/office/word/2020/wordml/sdtdatahash" xmlns:w16se="http://schemas.microsoft.com/office/word/2015/wordml/symex" mc:Ignorable="w14 w15 w16se w16cid w16 w16cex w16sdtdh">
-  <w:divs>
-    <w:div w:id="48967280">
-      <w:bodyDiv w:val="1"/>
-      <w:marLeft w:val="0"/>
-      <w:marRight w:val="0"/>
-      <w:marTop w:val="0"/>
-      <w:marBottom w:val="0"/>
-      <w:divBdr>
-        <w:top w:val="none" w:sz="0" w:space="0" w:color="auto"/>
-        <w:left w:val="none" w:sz="0" w:space="0" w:color="auto"/>
-        <w:bottom w:val="none" w:sz="0" w:space="0" w:color="auto"/>
-        <w:right w:val="none" w:sz="0" w:space="0" w:color="auto"/>
-      </w:divBdr>
-      <w:divsChild>
-        <w:div w:id="778448759">
-          <w:marLeft w:val="0"/>
-          <w:marRight w:val="0"/>
-          <w:marTop w:val="0"/>
-          <w:marBottom w:val="0"/>
-          <w:divBdr>
-            <w:top w:val="none" w:sz="0" w:space="0" w:color="auto"/>
-            <w:left w:val="none" w:sz="0" w:space="0" w:color="auto"/>
-            <w:bottom w:val="none" w:sz="0" w:space="0" w:color="auto"/>
-            <w:right w:val="none" w:sz="0" w:space="0" w:color="auto"/>
-          </w:divBdr>
-          <w:divsChild>
-            <w:div w:id="1679192640">
-              <w:marLeft w:val="0"/>
-              <w:marRight w:val="0"/>
-              <w:marTop w:val="0"/>
-              <w:marBottom w:val="0"/>
-              <w:divBdr>
-                <w:top w:val="none" w:sz="0" w:space="0" w:color="auto"/>
-                <w:left w:val="none" w:sz="0" w:space="0" w:color="auto"/>
-                <w:bottom w:val="none" w:sz="0" w:space="0" w:color="auto"/>
-                <w:right w:val="none" w:sz="0" w:space="0" w:color="auto"/>
-              </w:divBdr>
-            </w:div>
-          </w:divsChild>
-        </w:div>
-      </w:divsChild>
-    </w:div>
-    <w:div w:id="139082750">
-      <w:bodyDiv w:val="1"/>
-      <w:marLeft w:val="0"/>
-      <w:marRight w:val="0"/>
-      <w:marTop w:val="0"/>
-      <w:marBottom w:val="0"/>
-      <w:divBdr>
-        <w:top w:val="none" w:sz="0" w:space="0" w:color="auto"/>
-        <w:left w:val="none" w:sz="0" w:space="0" w:color="auto"/>
-        <w:bottom w:val="none" w:sz="0" w:space="0" w:color="auto"/>
-        <w:right w:val="none" w:sz="0" w:space="0" w:color="auto"/>
-      </w:divBdr>
-      <w:divsChild>
-        <w:div w:id="1127771904">
-          <w:marLeft w:val="0"/>
-          <w:marRight w:val="0"/>
-          <w:marTop w:val="0"/>
-          <w:marBottom w:val="0"/>
-          <w:divBdr>
-            <w:top w:val="none" w:sz="0" w:space="0" w:color="auto"/>
-            <w:left w:val="none" w:sz="0" w:space="0" w:color="auto"/>
-            <w:bottom w:val="none" w:sz="0" w:space="0" w:color="auto"/>
-            <w:right w:val="none" w:sz="0" w:space="0" w:color="auto"/>
-          </w:divBdr>
-          <w:divsChild>
-            <w:div w:id="1044675514">
-              <w:marLeft w:val="0"/>
-              <w:marRight w:val="0"/>
-              <w:marTop w:val="0"/>
-              <w:marBottom w:val="0"/>
-              <w:divBdr>
-                <w:top w:val="none" w:sz="0" w:space="0" w:color="auto"/>
-                <w:left w:val="none" w:sz="0" w:space="0" w:color="auto"/>
-                <w:bottom w:val="none" w:sz="0" w:space="0" w:color="auto"/>
-                <w:right w:val="none" w:sz="0" w:space="0" w:color="auto"/>
-              </w:divBdr>
-            </w:div>
-          </w:divsChild>
-        </w:div>
-      </w:divsChild>
-    </w:div>
-    <w:div w:id="168640116">
-      <w:bodyDiv w:val="1"/>
-      <w:marLeft w:val="0"/>
-      <w:marRight w:val="0"/>
-      <w:marTop w:val="0"/>
-      <w:marBottom w:val="0"/>
-      <w:divBdr>
-        <w:top w:val="none" w:sz="0" w:space="0" w:color="auto"/>
-        <w:left w:val="none" w:sz="0" w:space="0" w:color="auto"/>
-        <w:bottom w:val="none" w:sz="0" w:space="0" w:color="auto"/>
-        <w:right w:val="none" w:sz="0" w:space="0" w:color="auto"/>
-      </w:divBdr>
-      <w:divsChild>
-        <w:div w:id="1725714084">
-          <w:marLeft w:val="0"/>
-          <w:marRight w:val="0"/>
-          <w:marTop w:val="0"/>
-          <w:marBottom w:val="0"/>
-          <w:divBdr>
-            <w:top w:val="none" w:sz="0" w:space="0" w:color="auto"/>
-            <w:left w:val="none" w:sz="0" w:space="0" w:color="auto"/>
-            <w:bottom w:val="none" w:sz="0" w:space="0" w:color="auto"/>
-            <w:right w:val="none" w:sz="0" w:space="0" w:color="auto"/>
-          </w:divBdr>
-          <w:divsChild>
-            <w:div w:id="2043287069">
-              <w:marLeft w:val="0"/>
-              <w:marRight w:val="0"/>
-              <w:marTop w:val="0"/>
-              <w:marBottom w:val="0"/>
-              <w:divBdr>
-                <w:top w:val="none" w:sz="0" w:space="0" w:color="auto"/>
-                <w:left w:val="none" w:sz="0" w:space="0" w:color="auto"/>
-                <w:bottom w:val="none" w:sz="0" w:space="0" w:color="auto"/>
-                <w:right w:val="none" w:sz="0" w:space="0" w:color="auto"/>
-              </w:divBdr>
-            </w:div>
-          </w:divsChild>
-        </w:div>
-      </w:divsChild>
-    </w:div>
-    <w:div w:id="170029016">
-      <w:bodyDiv w:val="1"/>
-      <w:marLeft w:val="0"/>
-      <w:marRight w:val="0"/>
-      <w:marTop w:val="0"/>
-      <w:marBottom w:val="0"/>
-      <w:divBdr>
-        <w:top w:val="none" w:sz="0" w:space="0" w:color="auto"/>
-        <w:left w:val="none" w:sz="0" w:space="0" w:color="auto"/>
-        <w:bottom w:val="none" w:sz="0" w:space="0" w:color="auto"/>
-        <w:right w:val="none" w:sz="0" w:space="0" w:color="auto"/>
-      </w:divBdr>
-      <w:divsChild>
-        <w:div w:id="840437317">
-          <w:marLeft w:val="0"/>
-          <w:marRight w:val="0"/>
-          <w:marTop w:val="0"/>
-          <w:marBottom w:val="0"/>
-          <w:divBdr>
-            <w:top w:val="none" w:sz="0" w:space="0" w:color="auto"/>
-            <w:left w:val="none" w:sz="0" w:space="0" w:color="auto"/>
-            <w:bottom w:val="none" w:sz="0" w:space="0" w:color="auto"/>
-            <w:right w:val="none" w:sz="0" w:space="0" w:color="auto"/>
-          </w:divBdr>
-          <w:divsChild>
-            <w:div w:id="139272189">
-              <w:marLeft w:val="0"/>
-              <w:marRight w:val="0"/>
-              <w:marTop w:val="0"/>
-              <w:marBottom w:val="0"/>
-              <w:divBdr>
-                <w:top w:val="none" w:sz="0" w:space="0" w:color="auto"/>
-                <w:left w:val="none" w:sz="0" w:space="0" w:color="auto"/>
-                <w:bottom w:val="none" w:sz="0" w:space="0" w:color="auto"/>
-                <w:right w:val="none" w:sz="0" w:space="0" w:color="auto"/>
-              </w:divBdr>
-            </w:div>
-          </w:divsChild>
-        </w:div>
-      </w:divsChild>
-    </w:div>
-    <w:div w:id="298531803">
-      <w:bodyDiv w:val="1"/>
-      <w:marLeft w:val="0"/>
-      <w:marRight w:val="0"/>
-      <w:marTop w:val="0"/>
-      <w:marBottom w:val="0"/>
-      <w:divBdr>
-        <w:top w:val="none" w:sz="0" w:space="0" w:color="auto"/>
-        <w:left w:val="none" w:sz="0" w:space="0" w:color="auto"/>
-        <w:bottom w:val="none" w:sz="0" w:space="0" w:color="auto"/>
-        <w:right w:val="none" w:sz="0" w:space="0" w:color="auto"/>
-      </w:divBdr>
-      <w:divsChild>
-        <w:div w:id="1523319588">
-          <w:marLeft w:val="0"/>
-          <w:marRight w:val="0"/>
-          <w:marTop w:val="0"/>
-          <w:marBottom w:val="0"/>
-          <w:divBdr>
-            <w:top w:val="none" w:sz="0" w:space="0" w:color="auto"/>
-            <w:left w:val="none" w:sz="0" w:space="0" w:color="auto"/>
-            <w:bottom w:val="none" w:sz="0" w:space="0" w:color="auto"/>
-            <w:right w:val="none" w:sz="0" w:space="0" w:color="auto"/>
-          </w:divBdr>
-          <w:divsChild>
-            <w:div w:id="1091271554">
-              <w:marLeft w:val="0"/>
-              <w:marRight w:val="0"/>
-              <w:marTop w:val="0"/>
-              <w:marBottom w:val="0"/>
-              <w:divBdr>
-                <w:top w:val="none" w:sz="0" w:space="0" w:color="auto"/>
-                <w:left w:val="none" w:sz="0" w:space="0" w:color="auto"/>
-                <w:bottom w:val="none" w:sz="0" w:space="0" w:color="auto"/>
-                <w:right w:val="none" w:sz="0" w:space="0" w:color="auto"/>
-              </w:divBdr>
-            </w:div>
-          </w:divsChild>
-        </w:div>
-      </w:divsChild>
-    </w:div>
-    <w:div w:id="327095324">
-      <w:bodyDiv w:val="1"/>
-      <w:marLeft w:val="0"/>
-      <w:marRight w:val="0"/>
-      <w:marTop w:val="0"/>
-      <w:marBottom w:val="0"/>
-      <w:divBdr>
-        <w:top w:val="none" w:sz="0" w:space="0" w:color="auto"/>
-        <w:left w:val="none" w:sz="0" w:space="0" w:color="auto"/>
-        <w:bottom w:val="none" w:sz="0" w:space="0" w:color="auto"/>
-        <w:right w:val="none" w:sz="0" w:space="0" w:color="auto"/>
-      </w:divBdr>
-      <w:divsChild>
-        <w:div w:id="929193527">
-          <w:marLeft w:val="0"/>
-          <w:marRight w:val="0"/>
-          <w:marTop w:val="0"/>
-          <w:marBottom w:val="0"/>
-          <w:divBdr>
-            <w:top w:val="none" w:sz="0" w:space="0" w:color="auto"/>
-            <w:left w:val="none" w:sz="0" w:space="0" w:color="auto"/>
-            <w:bottom w:val="none" w:sz="0" w:space="0" w:color="auto"/>
-            <w:right w:val="none" w:sz="0" w:space="0" w:color="auto"/>
-          </w:divBdr>
-          <w:divsChild>
-            <w:div w:id="1957444537">
-              <w:marLeft w:val="0"/>
-              <w:marRight w:val="0"/>
-              <w:marTop w:val="0"/>
-              <w:marBottom w:val="0"/>
-              <w:divBdr>
-                <w:top w:val="none" w:sz="0" w:space="0" w:color="auto"/>
-                <w:left w:val="none" w:sz="0" w:space="0" w:color="auto"/>
-                <w:bottom w:val="none" w:sz="0" w:space="0" w:color="auto"/>
-                <w:right w:val="none" w:sz="0" w:space="0" w:color="auto"/>
-              </w:divBdr>
-            </w:div>
-          </w:divsChild>
-        </w:div>
-      </w:divsChild>
-    </w:div>
-    <w:div w:id="346368549">
-      <w:bodyDiv w:val="1"/>
-      <w:marLeft w:val="0"/>
-      <w:marRight w:val="0"/>
-      <w:marTop w:val="0"/>
-      <w:marBottom w:val="0"/>
-      <w:divBdr>
-        <w:top w:val="none" w:sz="0" w:space="0" w:color="auto"/>
-        <w:left w:val="none" w:sz="0" w:space="0" w:color="auto"/>
-        <w:bottom w:val="none" w:sz="0" w:space="0" w:color="auto"/>
-        <w:right w:val="none" w:sz="0" w:space="0" w:color="auto"/>
-      </w:divBdr>
-      <w:divsChild>
-        <w:div w:id="1705909410">
-          <w:marLeft w:val="0"/>
-          <w:marRight w:val="0"/>
-          <w:marTop w:val="0"/>
-          <w:marBottom w:val="0"/>
-          <w:divBdr>
-            <w:top w:val="none" w:sz="0" w:space="0" w:color="auto"/>
-            <w:left w:val="none" w:sz="0" w:space="0" w:color="auto"/>
-            <w:bottom w:val="none" w:sz="0" w:space="0" w:color="auto"/>
-            <w:right w:val="none" w:sz="0" w:space="0" w:color="auto"/>
-          </w:divBdr>
-          <w:divsChild>
-            <w:div w:id="83382397">
-              <w:marLeft w:val="0"/>
-              <w:marRight w:val="0"/>
-              <w:marTop w:val="0"/>
-              <w:marBottom w:val="0"/>
-              <w:divBdr>
-                <w:top w:val="none" w:sz="0" w:space="0" w:color="auto"/>
-                <w:left w:val="none" w:sz="0" w:space="0" w:color="auto"/>
-                <w:bottom w:val="none" w:sz="0" w:space="0" w:color="auto"/>
-                <w:right w:val="none" w:sz="0" w:space="0" w:color="auto"/>
-              </w:divBdr>
-            </w:div>
-          </w:divsChild>
-        </w:div>
-      </w:divsChild>
-    </w:div>
-    <w:div w:id="480390717">
-      <w:bodyDiv w:val="1"/>
-      <w:marLeft w:val="0"/>
-      <w:marRight w:val="0"/>
-      <w:marTop w:val="0"/>
-      <w:marBottom w:val="0"/>
-      <w:divBdr>
-        <w:top w:val="none" w:sz="0" w:space="0" w:color="auto"/>
-        <w:left w:val="none" w:sz="0" w:space="0" w:color="auto"/>
-        <w:bottom w:val="none" w:sz="0" w:space="0" w:color="auto"/>
-        <w:right w:val="none" w:sz="0" w:space="0" w:color="auto"/>
-      </w:divBdr>
-      <w:divsChild>
-        <w:div w:id="398478432">
-          <w:marLeft w:val="0"/>
-          <w:marRight w:val="0"/>
-          <w:marTop w:val="0"/>
-          <w:marBottom w:val="0"/>
-          <w:divBdr>
-            <w:top w:val="none" w:sz="0" w:space="0" w:color="auto"/>
-            <w:left w:val="none" w:sz="0" w:space="0" w:color="auto"/>
-            <w:bottom w:val="none" w:sz="0" w:space="0" w:color="auto"/>
-            <w:right w:val="none" w:sz="0" w:space="0" w:color="auto"/>
-          </w:divBdr>
-          <w:divsChild>
-            <w:div w:id="1142043592">
-              <w:marLeft w:val="0"/>
-              <w:marRight w:val="0"/>
-              <w:marTop w:val="0"/>
-              <w:marBottom w:val="0"/>
-              <w:divBdr>
-                <w:top w:val="none" w:sz="0" w:space="0" w:color="auto"/>
-                <w:left w:val="none" w:sz="0" w:space="0" w:color="auto"/>
-                <w:bottom w:val="none" w:sz="0" w:space="0" w:color="auto"/>
-                <w:right w:val="none" w:sz="0" w:space="0" w:color="auto"/>
-              </w:divBdr>
-            </w:div>
-          </w:divsChild>
-        </w:div>
-      </w:divsChild>
-    </w:div>
-    <w:div w:id="612636889">
-      <w:bodyDiv w:val="1"/>
-      <w:marLeft w:val="0"/>
-      <w:marRight w:val="0"/>
-      <w:marTop w:val="0"/>
-      <w:marBottom w:val="0"/>
-      <w:divBdr>
-        <w:top w:val="none" w:sz="0" w:space="0" w:color="auto"/>
-        <w:left w:val="none" w:sz="0" w:space="0" w:color="auto"/>
-        <w:bottom w:val="none" w:sz="0" w:space="0" w:color="auto"/>
-        <w:right w:val="none" w:sz="0" w:space="0" w:color="auto"/>
-      </w:divBdr>
-      <w:divsChild>
-        <w:div w:id="1842232649">
-          <w:marLeft w:val="0"/>
-          <w:marRight w:val="0"/>
-          <w:marTop w:val="0"/>
-          <w:marBottom w:val="0"/>
-          <w:divBdr>
-            <w:top w:val="none" w:sz="0" w:space="0" w:color="auto"/>
-            <w:left w:val="none" w:sz="0" w:space="0" w:color="auto"/>
-            <w:bottom w:val="none" w:sz="0" w:space="0" w:color="auto"/>
-            <w:right w:val="none" w:sz="0" w:space="0" w:color="auto"/>
-          </w:divBdr>
-          <w:divsChild>
-            <w:div w:id="176846896">
-              <w:marLeft w:val="0"/>
-              <w:marRight w:val="0"/>
-              <w:marTop w:val="0"/>
-              <w:marBottom w:val="0"/>
-              <w:divBdr>
-                <w:top w:val="none" w:sz="0" w:space="0" w:color="auto"/>
-                <w:left w:val="none" w:sz="0" w:space="0" w:color="auto"/>
-                <w:bottom w:val="none" w:sz="0" w:space="0" w:color="auto"/>
-                <w:right w:val="none" w:sz="0" w:space="0" w:color="auto"/>
-              </w:divBdr>
-            </w:div>
-          </w:divsChild>
-        </w:div>
-      </w:divsChild>
-    </w:div>
-    <w:div w:id="623586736">
-      <w:bodyDiv w:val="1"/>
-      <w:marLeft w:val="0"/>
-      <w:marRight w:val="0"/>
-      <w:marTop w:val="0"/>
-      <w:marBottom w:val="0"/>
-      <w:divBdr>
-        <w:top w:val="none" w:sz="0" w:space="0" w:color="auto"/>
-        <w:left w:val="none" w:sz="0" w:space="0" w:color="auto"/>
-        <w:bottom w:val="none" w:sz="0" w:space="0" w:color="auto"/>
-        <w:right w:val="none" w:sz="0" w:space="0" w:color="auto"/>
-      </w:divBdr>
-      <w:divsChild>
-        <w:div w:id="1610550110">
-          <w:marLeft w:val="0"/>
-          <w:marRight w:val="0"/>
-          <w:marTop w:val="0"/>
-          <w:marBottom w:val="0"/>
-          <w:divBdr>
-            <w:top w:val="none" w:sz="0" w:space="0" w:color="auto"/>
-            <w:left w:val="none" w:sz="0" w:space="0" w:color="auto"/>
-            <w:bottom w:val="none" w:sz="0" w:space="0" w:color="auto"/>
-            <w:right w:val="none" w:sz="0" w:space="0" w:color="auto"/>
-          </w:divBdr>
-          <w:divsChild>
-            <w:div w:id="2034844689">
-              <w:marLeft w:val="0"/>
-              <w:marRight w:val="0"/>
-              <w:marTop w:val="0"/>
-              <w:marBottom w:val="0"/>
-              <w:divBdr>
-                <w:top w:val="none" w:sz="0" w:space="0" w:color="auto"/>
-                <w:left w:val="none" w:sz="0" w:space="0" w:color="auto"/>
-                <w:bottom w:val="none" w:sz="0" w:space="0" w:color="auto"/>
-                <w:right w:val="none" w:sz="0" w:space="0" w:color="auto"/>
-              </w:divBdr>
-            </w:div>
-          </w:divsChild>
-        </w:div>
-      </w:divsChild>
-    </w:div>
-    <w:div w:id="627441945">
-      <w:bodyDiv w:val="1"/>
-      <w:marLeft w:val="0"/>
-      <w:marRight w:val="0"/>
-      <w:marTop w:val="0"/>
-      <w:marBottom w:val="0"/>
-      <w:divBdr>
-        <w:top w:val="none" w:sz="0" w:space="0" w:color="auto"/>
-        <w:left w:val="none" w:sz="0" w:space="0" w:color="auto"/>
-        <w:bottom w:val="none" w:sz="0" w:space="0" w:color="auto"/>
-        <w:right w:val="none" w:sz="0" w:space="0" w:color="auto"/>
-      </w:divBdr>
-      <w:divsChild>
-        <w:div w:id="1723016893">
-          <w:marLeft w:val="0"/>
-          <w:marRight w:val="0"/>
-          <w:marTop w:val="0"/>
-          <w:marBottom w:val="0"/>
-          <w:divBdr>
-            <w:top w:val="none" w:sz="0" w:space="0" w:color="auto"/>
-            <w:left w:val="none" w:sz="0" w:space="0" w:color="auto"/>
-            <w:bottom w:val="none" w:sz="0" w:space="0" w:color="auto"/>
-            <w:right w:val="none" w:sz="0" w:space="0" w:color="auto"/>
-          </w:divBdr>
-          <w:divsChild>
-            <w:div w:id="1960405335">
-              <w:marLeft w:val="0"/>
-              <w:marRight w:val="0"/>
-              <w:marTop w:val="0"/>
-              <w:marBottom w:val="0"/>
-              <w:divBdr>
-                <w:top w:val="none" w:sz="0" w:space="0" w:color="auto"/>
-                <w:left w:val="none" w:sz="0" w:space="0" w:color="auto"/>
-                <w:bottom w:val="none" w:sz="0" w:space="0" w:color="auto"/>
-                <w:right w:val="none" w:sz="0" w:space="0" w:color="auto"/>
-              </w:divBdr>
-            </w:div>
-          </w:divsChild>
-        </w:div>
-      </w:divsChild>
-    </w:div>
-    <w:div w:id="694695889">
-      <w:bodyDiv w:val="1"/>
-      <w:marLeft w:val="0"/>
-      <w:marRight w:val="0"/>
-      <w:marTop w:val="0"/>
-      <w:marBottom w:val="0"/>
-      <w:divBdr>
-        <w:top w:val="none" w:sz="0" w:space="0" w:color="auto"/>
-        <w:left w:val="none" w:sz="0" w:space="0" w:color="auto"/>
-        <w:bottom w:val="none" w:sz="0" w:space="0" w:color="auto"/>
-        <w:right w:val="none" w:sz="0" w:space="0" w:color="auto"/>
-      </w:divBdr>
-      <w:divsChild>
-        <w:div w:id="1773167257">
-          <w:marLeft w:val="0"/>
-          <w:marRight w:val="0"/>
-          <w:marTop w:val="0"/>
-          <w:marBottom w:val="0"/>
-          <w:divBdr>
-            <w:top w:val="none" w:sz="0" w:space="0" w:color="auto"/>
-            <w:left w:val="none" w:sz="0" w:space="0" w:color="auto"/>
-            <w:bottom w:val="none" w:sz="0" w:space="0" w:color="auto"/>
-            <w:right w:val="none" w:sz="0" w:space="0" w:color="auto"/>
-          </w:divBdr>
-          <w:divsChild>
-            <w:div w:id="184246872">
-              <w:marLeft w:val="0"/>
-              <w:marRight w:val="0"/>
-              <w:marTop w:val="0"/>
-              <w:marBottom w:val="0"/>
-              <w:divBdr>
-                <w:top w:val="none" w:sz="0" w:space="0" w:color="auto"/>
-                <w:left w:val="none" w:sz="0" w:space="0" w:color="auto"/>
-                <w:bottom w:val="none" w:sz="0" w:space="0" w:color="auto"/>
-                <w:right w:val="none" w:sz="0" w:space="0" w:color="auto"/>
-              </w:divBdr>
-            </w:div>
-          </w:divsChild>
-        </w:div>
-      </w:divsChild>
-    </w:div>
-    <w:div w:id="736903098">
-      <w:bodyDiv w:val="1"/>
-      <w:marLeft w:val="0"/>
-      <w:marRight w:val="0"/>
-      <w:marTop w:val="0"/>
-      <w:marBottom w:val="0"/>
-      <w:divBdr>
-        <w:top w:val="none" w:sz="0" w:space="0" w:color="auto"/>
-        <w:left w:val="none" w:sz="0" w:space="0" w:color="auto"/>
-        <w:bottom w:val="none" w:sz="0" w:space="0" w:color="auto"/>
-        <w:right w:val="none" w:sz="0" w:space="0" w:color="auto"/>
-      </w:divBdr>
-      <w:divsChild>
-        <w:div w:id="1475756975">
-          <w:marLeft w:val="0"/>
-          <w:marRight w:val="0"/>
-          <w:marTop w:val="0"/>
-          <w:marBottom w:val="0"/>
-          <w:divBdr>
-            <w:top w:val="none" w:sz="0" w:space="0" w:color="auto"/>
-            <w:left w:val="none" w:sz="0" w:space="0" w:color="auto"/>
-            <w:bottom w:val="none" w:sz="0" w:space="0" w:color="auto"/>
-            <w:right w:val="none" w:sz="0" w:space="0" w:color="auto"/>
-          </w:divBdr>
-          <w:divsChild>
-            <w:div w:id="1014039131">
-              <w:marLeft w:val="0"/>
-              <w:marRight w:val="0"/>
-              <w:marTop w:val="0"/>
-              <w:marBottom w:val="0"/>
-              <w:divBdr>
-                <w:top w:val="none" w:sz="0" w:space="0" w:color="auto"/>
-                <w:left w:val="none" w:sz="0" w:space="0" w:color="auto"/>
-                <w:bottom w:val="none" w:sz="0" w:space="0" w:color="auto"/>
-                <w:right w:val="none" w:sz="0" w:space="0" w:color="auto"/>
-              </w:divBdr>
-            </w:div>
-          </w:divsChild>
-        </w:div>
-      </w:divsChild>
-    </w:div>
-    <w:div w:id="908854291">
-      <w:bodyDiv w:val="1"/>
-      <w:marLeft w:val="0"/>
-      <w:marRight w:val="0"/>
-      <w:marTop w:val="0"/>
-      <w:marBottom w:val="0"/>
-      <w:divBdr>
-        <w:top w:val="none" w:sz="0" w:space="0" w:color="auto"/>
-        <w:left w:val="none" w:sz="0" w:space="0" w:color="auto"/>
-        <w:bottom w:val="none" w:sz="0" w:space="0" w:color="auto"/>
-        <w:right w:val="none" w:sz="0" w:space="0" w:color="auto"/>
-      </w:divBdr>
-      <w:divsChild>
-        <w:div w:id="394397364">
-          <w:marLeft w:val="0"/>
-          <w:marRight w:val="0"/>
-          <w:marTop w:val="0"/>
-          <w:marBottom w:val="0"/>
-          <w:divBdr>
-            <w:top w:val="none" w:sz="0" w:space="0" w:color="auto"/>
-            <w:left w:val="none" w:sz="0" w:space="0" w:color="auto"/>
-            <w:bottom w:val="none" w:sz="0" w:space="0" w:color="auto"/>
-            <w:right w:val="none" w:sz="0" w:space="0" w:color="auto"/>
-          </w:divBdr>
-          <w:divsChild>
-            <w:div w:id="1357000221">
-              <w:marLeft w:val="0"/>
-              <w:marRight w:val="0"/>
-              <w:marTop w:val="0"/>
-              <w:marBottom w:val="0"/>
-              <w:divBdr>
-                <w:top w:val="none" w:sz="0" w:space="0" w:color="auto"/>
-                <w:left w:val="none" w:sz="0" w:space="0" w:color="auto"/>
-                <w:bottom w:val="none" w:sz="0" w:space="0" w:color="auto"/>
-                <w:right w:val="none" w:sz="0" w:space="0" w:color="auto"/>
-              </w:divBdr>
-            </w:div>
-          </w:divsChild>
-        </w:div>
-      </w:divsChild>
-    </w:div>
-    <w:div w:id="1143963621">
-      <w:bodyDiv w:val="1"/>
-      <w:marLeft w:val="0"/>
-      <w:marRight w:val="0"/>
-      <w:marTop w:val="0"/>
-      <w:marBottom w:val="0"/>
-      <w:divBdr>
-        <w:top w:val="none" w:sz="0" w:space="0" w:color="auto"/>
-        <w:left w:val="none" w:sz="0" w:space="0" w:color="auto"/>
-        <w:bottom w:val="none" w:sz="0" w:space="0" w:color="auto"/>
-        <w:right w:val="none" w:sz="0" w:space="0" w:color="auto"/>
-      </w:divBdr>
-      <w:divsChild>
-        <w:div w:id="586963282">
-          <w:marLeft w:val="0"/>
-          <w:marRight w:val="0"/>
-          <w:marTop w:val="0"/>
-          <w:marBottom w:val="0"/>
-          <w:divBdr>
-            <w:top w:val="none" w:sz="0" w:space="0" w:color="auto"/>
-            <w:left w:val="none" w:sz="0" w:space="0" w:color="auto"/>
-            <w:bottom w:val="none" w:sz="0" w:space="0" w:color="auto"/>
-            <w:right w:val="none" w:sz="0" w:space="0" w:color="auto"/>
-          </w:divBdr>
-          <w:divsChild>
-            <w:div w:id="1250772564">
-              <w:marLeft w:val="0"/>
-              <w:marRight w:val="0"/>
-              <w:marTop w:val="0"/>
-              <w:marBottom w:val="0"/>
-              <w:divBdr>
-                <w:top w:val="none" w:sz="0" w:space="0" w:color="auto"/>
-                <w:left w:val="none" w:sz="0" w:space="0" w:color="auto"/>
-                <w:bottom w:val="none" w:sz="0" w:space="0" w:color="auto"/>
-                <w:right w:val="none" w:sz="0" w:space="0" w:color="auto"/>
-              </w:divBdr>
-            </w:div>
-          </w:divsChild>
-        </w:div>
-      </w:divsChild>
-    </w:div>
-    <w:div w:id="1245727137">
-      <w:bodyDiv w:val="1"/>
-      <w:marLeft w:val="0"/>
-      <w:marRight w:val="0"/>
-      <w:marTop w:val="0"/>
-      <w:marBottom w:val="0"/>
-      <w:divBdr>
-        <w:top w:val="none" w:sz="0" w:space="0" w:color="auto"/>
-        <w:left w:val="none" w:sz="0" w:space="0" w:color="auto"/>
-        <w:bottom w:val="none" w:sz="0" w:space="0" w:color="auto"/>
-        <w:right w:val="none" w:sz="0" w:space="0" w:color="auto"/>
-      </w:divBdr>
-      <w:divsChild>
-        <w:div w:id="1099717947">
-          <w:marLeft w:val="0"/>
-          <w:marRight w:val="0"/>
-          <w:marTop w:val="0"/>
-          <w:marBottom w:val="0"/>
-          <w:divBdr>
-            <w:top w:val="none" w:sz="0" w:space="0" w:color="auto"/>
-            <w:left w:val="none" w:sz="0" w:space="0" w:color="auto"/>
-            <w:bottom w:val="none" w:sz="0" w:space="0" w:color="auto"/>
-            <w:right w:val="none" w:sz="0" w:space="0" w:color="auto"/>
-          </w:divBdr>
-          <w:divsChild>
-            <w:div w:id="1577857212">
-              <w:marLeft w:val="0"/>
-              <w:marRight w:val="0"/>
-              <w:marTop w:val="0"/>
-              <w:marBottom w:val="0"/>
-              <w:divBdr>
-                <w:top w:val="none" w:sz="0" w:space="0" w:color="auto"/>
-                <w:left w:val="none" w:sz="0" w:space="0" w:color="auto"/>
-                <w:bottom w:val="none" w:sz="0" w:space="0" w:color="auto"/>
-                <w:right w:val="none" w:sz="0" w:space="0" w:color="auto"/>
-              </w:divBdr>
-            </w:div>
-          </w:divsChild>
-        </w:div>
-      </w:divsChild>
-    </w:div>
-    <w:div w:id="1394425856">
-      <w:bodyDiv w:val="1"/>
-      <w:marLeft w:val="0"/>
-      <w:marRight w:val="0"/>
-      <w:marTop w:val="0"/>
-      <w:marBottom w:val="0"/>
-      <w:divBdr>
-        <w:top w:val="none" w:sz="0" w:space="0" w:color="auto"/>
-        <w:left w:val="none" w:sz="0" w:space="0" w:color="auto"/>
-        <w:bottom w:val="none" w:sz="0" w:space="0" w:color="auto"/>
-        <w:right w:val="none" w:sz="0" w:space="0" w:color="auto"/>
-      </w:divBdr>
-      <w:divsChild>
-        <w:div w:id="1876311567">
-          <w:marLeft w:val="0"/>
-          <w:marRight w:val="0"/>
-          <w:marTop w:val="0"/>
-          <w:marBottom w:val="0"/>
-          <w:divBdr>
-            <w:top w:val="none" w:sz="0" w:space="0" w:color="auto"/>
-            <w:left w:val="none" w:sz="0" w:space="0" w:color="auto"/>
-            <w:bottom w:val="none" w:sz="0" w:space="0" w:color="auto"/>
-            <w:right w:val="none" w:sz="0" w:space="0" w:color="auto"/>
-          </w:divBdr>
-          <w:divsChild>
-            <w:div w:id="1875969274">
-              <w:marLeft w:val="0"/>
-              <w:marRight w:val="0"/>
-              <w:marTop w:val="0"/>
-              <w:marBottom w:val="0"/>
-              <w:divBdr>
-                <w:top w:val="none" w:sz="0" w:space="0" w:color="auto"/>
-                <w:left w:val="none" w:sz="0" w:space="0" w:color="auto"/>
-                <w:bottom w:val="none" w:sz="0" w:space="0" w:color="auto"/>
-                <w:right w:val="none" w:sz="0" w:space="0" w:color="auto"/>
-              </w:divBdr>
-            </w:div>
-          </w:divsChild>
-        </w:div>
-      </w:divsChild>
-    </w:div>
-    <w:div w:id="1434549372">
-      <w:bodyDiv w:val="1"/>
-      <w:marLeft w:val="0"/>
-      <w:marRight w:val="0"/>
-      <w:marTop w:val="0"/>
-      <w:marBottom w:val="0"/>
-      <w:divBdr>
-        <w:top w:val="none" w:sz="0" w:space="0" w:color="auto"/>
-        <w:left w:val="none" w:sz="0" w:space="0" w:color="auto"/>
-        <w:bottom w:val="none" w:sz="0" w:space="0" w:color="auto"/>
-        <w:right w:val="none" w:sz="0" w:space="0" w:color="auto"/>
-      </w:divBdr>
-      <w:divsChild>
-        <w:div w:id="1365402633">
-          <w:marLeft w:val="0"/>
-          <w:marRight w:val="0"/>
-          <w:marTop w:val="0"/>
-          <w:marBottom w:val="0"/>
-          <w:divBdr>
-            <w:top w:val="none" w:sz="0" w:space="0" w:color="auto"/>
-            <w:left w:val="none" w:sz="0" w:space="0" w:color="auto"/>
-            <w:bottom w:val="none" w:sz="0" w:space="0" w:color="auto"/>
-            <w:right w:val="none" w:sz="0" w:space="0" w:color="auto"/>
-          </w:divBdr>
-          <w:divsChild>
-            <w:div w:id="1012992953">
-              <w:marLeft w:val="0"/>
-              <w:marRight w:val="0"/>
-              <w:marTop w:val="0"/>
-              <w:marBottom w:val="0"/>
-              <w:divBdr>
-                <w:top w:val="none" w:sz="0" w:space="0" w:color="auto"/>
-                <w:left w:val="none" w:sz="0" w:space="0" w:color="auto"/>
-                <w:bottom w:val="none" w:sz="0" w:space="0" w:color="auto"/>
-                <w:right w:val="none" w:sz="0" w:space="0" w:color="auto"/>
-              </w:divBdr>
-            </w:div>
-          </w:divsChild>
-        </w:div>
-      </w:divsChild>
-    </w:div>
-    <w:div w:id="1594362773">
-      <w:bodyDiv w:val="1"/>
-      <w:marLeft w:val="0"/>
-      <w:marRight w:val="0"/>
-      <w:marTop w:val="0"/>
-      <w:marBottom w:val="0"/>
-      <w:divBdr>
-        <w:top w:val="none" w:sz="0" w:space="0" w:color="auto"/>
-        <w:left w:val="none" w:sz="0" w:space="0" w:color="auto"/>
-        <w:bottom w:val="none" w:sz="0" w:space="0" w:color="auto"/>
-        <w:right w:val="none" w:sz="0" w:space="0" w:color="auto"/>
-      </w:divBdr>
-      <w:divsChild>
-        <w:div w:id="787043023">
-          <w:marLeft w:val="0"/>
-          <w:marRight w:val="0"/>
-          <w:marTop w:val="0"/>
-          <w:marBottom w:val="0"/>
-          <w:divBdr>
-            <w:top w:val="none" w:sz="0" w:space="0" w:color="auto"/>
-            <w:left w:val="none" w:sz="0" w:space="0" w:color="auto"/>
-            <w:bottom w:val="none" w:sz="0" w:space="0" w:color="auto"/>
-            <w:right w:val="none" w:sz="0" w:space="0" w:color="auto"/>
-          </w:divBdr>
-          <w:divsChild>
-            <w:div w:id="616064322">
-              <w:marLeft w:val="0"/>
-              <w:marRight w:val="0"/>
-              <w:marTop w:val="0"/>
-              <w:marBottom w:val="0"/>
-              <w:divBdr>
-                <w:top w:val="none" w:sz="0" w:space="0" w:color="auto"/>
-                <w:left w:val="none" w:sz="0" w:space="0" w:color="auto"/>
-                <w:bottom w:val="none" w:sz="0" w:space="0" w:color="auto"/>
-                <w:right w:val="none" w:sz="0" w:space="0" w:color="auto"/>
-              </w:divBdr>
-            </w:div>
-          </w:divsChild>
-        </w:div>
-      </w:divsChild>
-    </w:div>
-    <w:div w:id="1731539819">
-      <w:bodyDiv w:val="1"/>
-      <w:marLeft w:val="0"/>
-      <w:marRight w:val="0"/>
-      <w:marTop w:val="0"/>
-      <w:marBottom w:val="0"/>
-      <w:divBdr>
-        <w:top w:val="none" w:sz="0" w:space="0" w:color="auto"/>
-        <w:left w:val="none" w:sz="0" w:space="0" w:color="auto"/>
-        <w:bottom w:val="none" w:sz="0" w:space="0" w:color="auto"/>
-        <w:right w:val="none" w:sz="0" w:space="0" w:color="auto"/>
-      </w:divBdr>
-      <w:divsChild>
-        <w:div w:id="573318436">
-          <w:marLeft w:val="0"/>
-          <w:marRight w:val="0"/>
-          <w:marTop w:val="0"/>
-          <w:marBottom w:val="0"/>
-          <w:divBdr>
-            <w:top w:val="none" w:sz="0" w:space="0" w:color="auto"/>
-            <w:left w:val="none" w:sz="0" w:space="0" w:color="auto"/>
-            <w:bottom w:val="none" w:sz="0" w:space="0" w:color="auto"/>
-            <w:right w:val="none" w:sz="0" w:space="0" w:color="auto"/>
-          </w:divBdr>
-          <w:divsChild>
-            <w:div w:id="1919750897">
-              <w:marLeft w:val="0"/>
-              <w:marRight w:val="0"/>
-              <w:marTop w:val="0"/>
-              <w:marBottom w:val="0"/>
-              <w:divBdr>
-                <w:top w:val="none" w:sz="0" w:space="0" w:color="auto"/>
-                <w:left w:val="none" w:sz="0" w:space="0" w:color="auto"/>
-                <w:bottom w:val="none" w:sz="0" w:space="0" w:color="auto"/>
-                <w:right w:val="none" w:sz="0" w:space="0" w:color="auto"/>
-              </w:divBdr>
-            </w:div>
-          </w:divsChild>
-        </w:div>
-      </w:divsChild>
-    </w:div>
-  </w:divs>
-  <w:optimizeForBrowser/>
-  <w:relyOnVML/>
-  <w:allowPNG/>
-</w:webSettings>
+<file path=customXml/item1.xml><?xml version="1.0" encoding="utf-8"?>
+<b:Sources xmlns:b="http://schemas.openxmlformats.org/officeDocument/2006/bibliography" xmlns="http://schemas.openxmlformats.org/officeDocument/2006/bibliography" SelectedStyle="\APASixthEditionOfficeOnline.xsl" StyleName="APA" Version="6"/>
+</file>
+
+<file path=customXml/itemProps1.xml><?xml version="1.0" encoding="utf-8"?>
+<ds:datastoreItem xmlns:ds="http://schemas.openxmlformats.org/officeDocument/2006/customXml" ds:itemID="{8E6929E9-498A-4D52-8CB7-117FBBBB5CE7}">
+  <ds:schemaRefs>
+    <ds:schemaRef ds:uri="http://schemas.openxmlformats.org/officeDocument/2006/bibliography"/>
+  </ds:schemaRefs>
+</ds:datastoreItem>
 </file>
</xml_diff>

<commit_message>
fix: mapeado ultra-robusto con fallbacks y logs de depuración para Datos Generales
</commit_message>
<xml_diff>
--- a/public/templates/FORMATO HOJA DE VIDA FHISYL.docx
+++ b/public/templates/FORMATO HOJA DE VIDA FHISYL.docx
@@ -11960,15 +11960,15 @@
         <mc:AlternateContent>
           <mc:Choice Requires="wps">
             <w:drawing>
-              <wp:anchor distT="0" distB="0" distL="114300" distR="114300" simplePos="0" relativeHeight="251702784" behindDoc="0" locked="0" layoutInCell="1" allowOverlap="1" wp14:anchorId="67888A26" wp14:editId="6607B185">
+              <wp:anchor distT="0" distB="0" distL="114300" distR="114300" simplePos="0" relativeHeight="251702784" behindDoc="0" locked="0" layoutInCell="1" allowOverlap="1" wp14:anchorId="67888A26" wp14:editId="325F8C2F">
                 <wp:simplePos x="0" y="0"/>
                 <wp:positionH relativeFrom="column">
-                  <wp:posOffset>235991</wp:posOffset>
+                  <wp:posOffset>234315</wp:posOffset>
                 </wp:positionH>
                 <wp:positionV relativeFrom="paragraph">
-                  <wp:posOffset>758368</wp:posOffset>
+                  <wp:posOffset>450850</wp:posOffset>
                 </wp:positionV>
-                <wp:extent cx="2275027" cy="409550"/>
+                <wp:extent cx="2275027" cy="713740"/>
                 <wp:effectExtent l="0" t="0" r="0" b="0"/>
                 <wp:wrapNone/>
                 <wp:docPr id="4" name="Cuadro de texto 4"/>
@@ -11980,14 +11980,12 @@
                       <wps:spPr>
                         <a:xfrm>
                           <a:off x="0" y="0"/>
-                          <a:ext cx="2275027" cy="409550"/>
+                          <a:ext cx="2275027" cy="713740"/>
                         </a:xfrm>
                         <a:prstGeom prst="rect">
                           <a:avLst/>
                         </a:prstGeom>
-                        <a:solidFill>
-                          <a:schemeClr val="lt1"/>
-                        </a:solidFill>
+                        <a:noFill/>
                         <a:ln w="6350">
                           <a:noFill/>
                         </a:ln>
@@ -12046,7 +12044,7 @@
           </mc:Choice>
           <mc:Fallback>
             <w:pict>
-              <v:shape w14:anchorId="67888A26" id="Cuadro de texto 4" o:spid="_x0000_s1031" type="#_x0000_t202" style="position:absolute;margin-left:18.6pt;margin-top:59.7pt;width:179.15pt;height:32.25pt;z-index:251702784;visibility:visible;mso-wrap-style:square;mso-width-percent:0;mso-height-percent:0;mso-wrap-distance-left:9pt;mso-wrap-distance-top:0;mso-wrap-distance-right:9pt;mso-wrap-distance-bottom:0;mso-position-horizontal:absolute;mso-position-horizontal-relative:text;mso-position-vertical:absolute;mso-position-vertical-relative:text;mso-width-percent:0;mso-height-percent:0;mso-width-relative:margin;mso-height-relative:margin;v-text-anchor:top" o:gfxdata="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" fillcolor="white [3201]" stroked="f" strokeweight=".5pt">
+              <v:shape w14:anchorId="67888A26" id="Cuadro de texto 4" o:spid="_x0000_s1031" type="#_x0000_t202" style="position:absolute;margin-left:18.45pt;margin-top:35.5pt;width:179.15pt;height:56.2pt;z-index:251702784;visibility:visible;mso-wrap-style:square;mso-width-percent:0;mso-height-percent:0;mso-wrap-distance-left:9pt;mso-wrap-distance-top:0;mso-wrap-distance-right:9pt;mso-wrap-distance-bottom:0;mso-position-horizontal:absolute;mso-position-horizontal-relative:text;mso-position-vertical:absolute;mso-position-vertical-relative:text;mso-width-percent:0;mso-height-percent:0;mso-width-relative:margin;mso-height-relative:margin;v-text-anchor:top" o:gfxdata="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" filled="f" stroked="f" strokeweight=".5pt">
                 <v:textbox>
                   <w:txbxContent>
                     <w:p>
@@ -12778,7 +12776,7 @@
                       <a:effectLst/>
                       <a:extLst>
                         <a:ext uri="{C572A759-6A51-4108-AA02-DFA0A04FC94B}">
-                          <ma14:wrappingTextBoxFlag xmlns:arto="http://schemas.microsoft.com/office/word/2006/arto" xmlns="" xmlns:mo="http://schemas.microsoft.com/office/mac/office/2008/main" xmlns:mv="urn:schemas-microsoft-com:mac:vml" xmlns:o="urn:schemas-microsoft-com:office:office" xmlns:v="urn:schemas-microsoft-com:vml" xmlns:w10="urn:schemas-microsoft-com:office:word" xmlns:w="http://schemas.openxmlformats.org/wordprocessingml/2006/main" xmlns:ma14="http://schemas.microsoft.com/office/mac/drawingml/2011/main"/>
+                          <ma14:wrappingTextBoxFlag xmlns:ma14="http://schemas.microsoft.com/office/mac/drawingml/2011/main" xmlns:w="http://schemas.openxmlformats.org/wordprocessingml/2006/main" xmlns:w10="urn:schemas-microsoft-com:office:word" xmlns:v="urn:schemas-microsoft-com:vml" xmlns:o="urn:schemas-microsoft-com:office:office" xmlns:mv="urn:schemas-microsoft-com:mac:vml" xmlns:mo="http://schemas.microsoft.com/office/mac/office/2008/main" xmlns="" xmlns:arto="http://schemas.microsoft.com/office/word/2006/arto"/>
                         </a:ext>
                       </a:extLst>
                     </wps:spPr>

</xml_diff>